<commit_message>
Update cost figures to ₱27,920 across thesis, presentation, and defense/review docs
</commit_message>
<xml_diff>
--- a/FLAIRE Thesis 2 - 1 (Revised).docx
+++ b/FLAIRE Thesis 2 - 1 (Revised).docx
@@ -26697,9 +26697,11 @@
         </w:trPr>
         <w:tc>
           <w:tcPr>
-            <w:tcW w:w="6030" w:type="dxa"/>
+            <w:tcW w:w="7040" w:type="dxa"/>
+            <w:gridSpan w:val="2"/>
             <w:tcBorders>
               <w:top w:val="single" w:sz="4" w:space="0" w:color="auto"/>
+              <w:bottom w:val="single" w:sz="4" w:space="0" w:color="auto"/>
             </w:tcBorders>
           </w:tcPr>
           <w:p>
@@ -26707,35 +26709,14 @@
               <w:spacing w:after="0" w:line="480" w:lineRule="auto"/>
               <w:ind w:left="0" w:firstLine="0"/>
               <w:rPr>
-                <w:lang w:val="en-PH"/>
-              </w:rPr>
-            </w:pPr>
-            <w:r>
-              <w:t>Adafruit 32u4 RFM9x LoRa development board x3</w:t>
-            </w:r>
-          </w:p>
-        </w:tc>
-        <w:tc>
-          <w:tcPr>
-            <w:tcW w:w="1010" w:type="dxa"/>
-            <w:tcBorders>
-              <w:top w:val="single" w:sz="4" w:space="0" w:color="auto"/>
-            </w:tcBorders>
-          </w:tcPr>
-          <w:p>
-            <w:pPr>
-              <w:spacing w:after="0" w:line="480" w:lineRule="auto"/>
-              <w:ind w:left="0" w:firstLine="0"/>
-              <w:jc w:val="right"/>
-            </w:pPr>
-            <w:r>
-              <w:t xml:space="preserve">₱ </w:t>
-            </w:r>
-            <w:r>
-              <w:t>5,4</w:t>
-            </w:r>
-            <w:r>
-              <w:t>00</w:t>
+                <w:b/>
+              </w:rPr>
+            </w:pPr>
+            <w:r>
+              <w:rPr>
+                <w:b/>
+              </w:rPr>
+              <w:t xml:space="preserve">Node</w:t>
             </w:r>
           </w:p>
         </w:tc>
@@ -26747,7 +26728,6 @@
         <w:tc>
           <w:tcPr>
             <w:tcW w:w="6030" w:type="dxa"/>
-            <w:vAlign w:val="bottom"/>
           </w:tcPr>
           <w:p>
             <w:pPr>
@@ -26755,10 +26735,7 @@
               <w:ind w:left="0" w:firstLine="0"/>
             </w:pPr>
             <w:r>
-              <w:t xml:space="preserve">Raspberry Pi </w:t>
-            </w:r>
-            <w:r>
-              <w:t>5</w:t>
+              <w:t xml:space="preserve">Adafruit RFM95 LoRa</w:t>
             </w:r>
           </w:p>
         </w:tc>
@@ -26773,19 +26750,7 @@
               <w:jc w:val="right"/>
             </w:pPr>
             <w:r>
-              <w:t xml:space="preserve">₱ </w:t>
-            </w:r>
-            <w:r>
-              <w:t>6</w:t>
-            </w:r>
-            <w:r>
-              <w:t>,</w:t>
-            </w:r>
-            <w:r>
-              <w:t>5</w:t>
-            </w:r>
-            <w:r>
-              <w:t>00</w:t>
+              <w:t xml:space="preserve">₱ 2,500</w:t>
             </w:r>
           </w:p>
         </w:tc>
@@ -26797,37 +26762,29 @@
         <w:tc>
           <w:tcPr>
             <w:tcW w:w="6030" w:type="dxa"/>
-            <w:vAlign w:val="bottom"/>
           </w:tcPr>
           <w:p>
             <w:pPr>
               <w:spacing w:after="0" w:line="480" w:lineRule="auto"/>
               <w:ind w:left="0" w:firstLine="0"/>
-              <w:rPr>
-                <w:b/>
-              </w:rPr>
-            </w:pPr>
-            <w:r>
-              <w:t>Ultrasonic Water Level Sensor</w:t>
+            </w:pPr>
+            <w:r>
+              <w:t xml:space="preserve">Mini magnets</w:t>
             </w:r>
           </w:p>
         </w:tc>
         <w:tc>
           <w:tcPr>
             <w:tcW w:w="1010" w:type="dxa"/>
-            <w:vAlign w:val="bottom"/>
           </w:tcPr>
           <w:p>
             <w:pPr>
               <w:spacing w:after="0" w:line="480" w:lineRule="auto"/>
               <w:ind w:left="0" w:firstLine="0"/>
               <w:jc w:val="right"/>
-              <w:rPr>
-                <w:b/>
-              </w:rPr>
-            </w:pPr>
-            <w:r>
-              <w:t xml:space="preserve">₱ 800  </w:t>
+            </w:pPr>
+            <w:r>
+              <w:t xml:space="preserve">₱ 100</w:t>
             </w:r>
           </w:p>
         </w:tc>
@@ -26846,26 +26803,22 @@
               <w:ind w:left="0" w:firstLine="0"/>
             </w:pPr>
             <w:r>
-              <w:t>Enclosure / Weatherproof Housing</w:t>
+              <w:t xml:space="preserve">Meshtastic 915 MHz LoRa antenna</w:t>
             </w:r>
           </w:p>
         </w:tc>
         <w:tc>
           <w:tcPr>
             <w:tcW w:w="1010" w:type="dxa"/>
-            <w:vAlign w:val="center"/>
           </w:tcPr>
           <w:p>
             <w:pPr>
               <w:spacing w:after="0" w:line="480" w:lineRule="auto"/>
               <w:ind w:left="0" w:firstLine="0"/>
               <w:jc w:val="right"/>
-              <w:rPr>
-                <w:b/>
-              </w:rPr>
-            </w:pPr>
-            <w:r>
-              <w:t xml:space="preserve">₱ 2,000  </w:t>
+            </w:pPr>
+            <w:r>
+              <w:t xml:space="preserve">₱ 300</w:t>
             </w:r>
           </w:p>
         </w:tc>
@@ -26882,31 +26835,24 @@
             <w:pPr>
               <w:spacing w:after="0" w:line="480" w:lineRule="auto"/>
               <w:ind w:left="0" w:firstLine="0"/>
-              <w:rPr>
-                <w:b/>
-              </w:rPr>
-            </w:pPr>
-            <w:r>
-              <w:t>Power Supply / Solar Panel Kit</w:t>
+            </w:pPr>
+            <w:r>
+              <w:t xml:space="preserve">Reed switch</w:t>
             </w:r>
           </w:p>
         </w:tc>
         <w:tc>
           <w:tcPr>
             <w:tcW w:w="1010" w:type="dxa"/>
-            <w:vAlign w:val="center"/>
           </w:tcPr>
           <w:p>
             <w:pPr>
               <w:spacing w:after="0" w:line="480" w:lineRule="auto"/>
               <w:ind w:left="0" w:firstLine="0"/>
               <w:jc w:val="right"/>
-              <w:rPr>
-                <w:b/>
-              </w:rPr>
-            </w:pPr>
-            <w:r>
-              <w:t xml:space="preserve">₱ 3,000  </w:t>
+            </w:pPr>
+            <w:r>
+              <w:t xml:space="preserve">₱ 200</w:t>
             </w:r>
           </w:p>
         </w:tc>
@@ -26923,12 +26869,9 @@
             <w:pPr>
               <w:spacing w:after="0" w:line="480" w:lineRule="auto"/>
               <w:ind w:left="0" w:firstLine="0"/>
-              <w:rPr>
-                <w:b/>
-              </w:rPr>
-            </w:pPr>
-            <w:r>
-              <w:t>Miscellaneous Hardware</w:t>
+            </w:pPr>
+            <w:r>
+              <w:t xml:space="preserve">MCP73871 power boost</w:t>
             </w:r>
           </w:p>
         </w:tc>
@@ -26941,12 +26884,9 @@
               <w:spacing w:after="0" w:line="480" w:lineRule="auto"/>
               <w:ind w:left="0" w:firstLine="0"/>
               <w:jc w:val="right"/>
-              <w:rPr>
-                <w:b/>
-              </w:rPr>
-            </w:pPr>
-            <w:r>
-              <w:t xml:space="preserve">₱ 2,000  </w:t>
+            </w:pPr>
+            <w:r>
+              <w:t xml:space="preserve">₱ 300</w:t>
             </w:r>
           </w:p>
         </w:tc>
@@ -26958,34 +26898,29 @@
         <w:tc>
           <w:tcPr>
             <w:tcW w:w="6030" w:type="dxa"/>
-            <w:vAlign w:val="center"/>
           </w:tcPr>
           <w:p>
             <w:pPr>
               <w:spacing w:after="0" w:line="480" w:lineRule="auto"/>
-              <w:ind w:left="0" w:right="171" w:firstLine="0"/>
-            </w:pPr>
-            <w:r>
-              <w:t>GSM modem SIM and SMS load (yearly)</w:t>
+              <w:ind w:left="0" w:firstLine="0"/>
+            </w:pPr>
+            <w:r>
+              <w:t xml:space="preserve">UART 7.5 m waterproof ultrasonic sensor</w:t>
             </w:r>
           </w:p>
         </w:tc>
         <w:tc>
           <w:tcPr>
             <w:tcW w:w="1010" w:type="dxa"/>
-            <w:vAlign w:val="center"/>
           </w:tcPr>
           <w:p>
             <w:pPr>
               <w:spacing w:after="0" w:line="480" w:lineRule="auto"/>
               <w:ind w:left="0" w:firstLine="0"/>
               <w:jc w:val="right"/>
-              <w:rPr>
-                <w:b/>
-              </w:rPr>
-            </w:pPr>
-            <w:r>
-              <w:t xml:space="preserve">₱ 2,000  </w:t>
+            </w:pPr>
+            <w:r>
+              <w:t xml:space="preserve">₱ 1,500</w:t>
             </w:r>
           </w:p>
         </w:tc>
@@ -26997,37 +26932,29 @@
         <w:tc>
           <w:tcPr>
             <w:tcW w:w="6030" w:type="dxa"/>
-            <w:vAlign w:val="center"/>
           </w:tcPr>
           <w:p>
             <w:pPr>
               <w:spacing w:after="0" w:line="480" w:lineRule="auto"/>
               <w:ind w:left="0" w:firstLine="0"/>
-              <w:rPr>
-                <w:b/>
-              </w:rPr>
-            </w:pPr>
-            <w:r>
-              <w:t>Transportation and field deployment</w:t>
+            </w:pPr>
+            <w:r>
+              <w:t xml:space="preserve">3.5 W solar panel</w:t>
             </w:r>
           </w:p>
         </w:tc>
         <w:tc>
           <w:tcPr>
             <w:tcW w:w="1010" w:type="dxa"/>
-            <w:vAlign w:val="center"/>
           </w:tcPr>
           <w:p>
             <w:pPr>
               <w:spacing w:after="0" w:line="480" w:lineRule="auto"/>
               <w:ind w:left="0" w:firstLine="0"/>
               <w:jc w:val="right"/>
-              <w:rPr>
-                <w:b/>
-              </w:rPr>
-            </w:pPr>
-            <w:r>
-              <w:t>₱ 1,000</w:t>
+            </w:pPr>
+            <w:r>
+              <w:t xml:space="preserve">₱ 200</w:t>
             </w:r>
           </w:p>
         </w:tc>
@@ -27039,43 +26966,29 @@
         <w:tc>
           <w:tcPr>
             <w:tcW w:w="6030" w:type="dxa"/>
-            <w:vAlign w:val="center"/>
           </w:tcPr>
           <w:p>
             <w:pPr>
               <w:spacing w:after="0" w:line="480" w:lineRule="auto"/>
               <w:ind w:left="0" w:firstLine="0"/>
-              <w:rPr>
-                <w:b/>
-              </w:rPr>
-            </w:pPr>
-            <w:r>
-              <w:t>Printing, documentation, and miscellaneous</w:t>
-            </w:r>
-            <w:r>
-              <w:tab/>
-            </w:r>
-            <w:r>
-              <w:t xml:space="preserve">  </w:t>
+            </w:pPr>
+            <w:r>
+              <w:t xml:space="preserve">3.7 V 10 Ah battery</w:t>
             </w:r>
           </w:p>
         </w:tc>
         <w:tc>
           <w:tcPr>
             <w:tcW w:w="1010" w:type="dxa"/>
-            <w:vAlign w:val="center"/>
           </w:tcPr>
           <w:p>
             <w:pPr>
               <w:spacing w:after="0" w:line="480" w:lineRule="auto"/>
               <w:ind w:left="0" w:firstLine="0"/>
               <w:jc w:val="right"/>
-              <w:rPr>
-                <w:b/>
-              </w:rPr>
-            </w:pPr>
-            <w:r>
-              <w:t xml:space="preserve">₱ 1,000  </w:t>
+            </w:pPr>
+            <w:r>
+              <w:t xml:space="preserve">₱ 220</w:t>
             </w:r>
           </w:p>
         </w:tc>
@@ -27087,6 +27000,108 @@
         <w:tc>
           <w:tcPr>
             <w:tcW w:w="6030" w:type="dxa"/>
+          </w:tcPr>
+          <w:p>
+            <w:pPr>
+              <w:spacing w:after="0" w:line="480" w:lineRule="auto"/>
+              <w:ind w:left="0" w:firstLine="0"/>
+            </w:pPr>
+            <w:r>
+              <w:t xml:space="preserve">Enclosure box</w:t>
+            </w:r>
+          </w:p>
+        </w:tc>
+        <w:tc>
+          <w:tcPr>
+            <w:tcW w:w="1010" w:type="dxa"/>
+          </w:tcPr>
+          <w:p>
+            <w:pPr>
+              <w:spacing w:after="0" w:line="480" w:lineRule="auto"/>
+              <w:ind w:left="0" w:firstLine="0"/>
+              <w:jc w:val="right"/>
+            </w:pPr>
+            <w:r>
+              <w:t xml:space="preserve">₱ 250</w:t>
+            </w:r>
+          </w:p>
+        </w:tc>
+      </w:tr>
+      <w:tr>
+        <w:trPr>
+          <w:jc w:val="center"/>
+        </w:trPr>
+        <w:tc>
+          <w:tcPr>
+            <w:tcW w:w="6030" w:type="dxa"/>
+          </w:tcPr>
+          <w:p>
+            <w:pPr>
+              <w:spacing w:after="0" w:line="480" w:lineRule="auto"/>
+              <w:ind w:left="0" w:firstLine="0"/>
+            </w:pPr>
+            <w:r>
+              <w:t xml:space="preserve">PVC pipe</w:t>
+            </w:r>
+          </w:p>
+        </w:tc>
+        <w:tc>
+          <w:tcPr>
+            <w:tcW w:w="1010" w:type="dxa"/>
+          </w:tcPr>
+          <w:p>
+            <w:pPr>
+              <w:spacing w:after="0" w:line="480" w:lineRule="auto"/>
+              <w:ind w:left="0" w:firstLine="0"/>
+              <w:jc w:val="right"/>
+            </w:pPr>
+            <w:r>
+              <w:t xml:space="preserve">₱ 1,000</w:t>
+            </w:r>
+          </w:p>
+        </w:tc>
+      </w:tr>
+      <w:tr>
+        <w:trPr>
+          <w:jc w:val="center"/>
+        </w:trPr>
+        <w:tc>
+          <w:tcPr>
+            <w:tcW w:w="6030" w:type="dxa"/>
+          </w:tcPr>
+          <w:p>
+            <w:pPr>
+              <w:spacing w:after="0" w:line="480" w:lineRule="auto"/>
+              <w:ind w:left="0" w:firstLine="0"/>
+            </w:pPr>
+            <w:r>
+              <w:t xml:space="preserve">Housing materials</w:t>
+            </w:r>
+          </w:p>
+        </w:tc>
+        <w:tc>
+          <w:tcPr>
+            <w:tcW w:w="1010" w:type="dxa"/>
+          </w:tcPr>
+          <w:p>
+            <w:pPr>
+              <w:spacing w:after="0" w:line="480" w:lineRule="auto"/>
+              <w:ind w:left="0" w:firstLine="0"/>
+              <w:jc w:val="right"/>
+            </w:pPr>
+            <w:r>
+              <w:t xml:space="preserve">₱ 500</w:t>
+            </w:r>
+          </w:p>
+        </w:tc>
+      </w:tr>
+      <w:tr>
+        <w:trPr>
+          <w:jc w:val="center"/>
+        </w:trPr>
+        <w:tc>
+          <w:tcPr>
+            <w:tcW w:w="6030" w:type="dxa"/>
             <w:tcBorders>
               <w:top w:val="single" w:sz="4" w:space="0" w:color="auto"/>
               <w:bottom w:val="single" w:sz="4" w:space="0" w:color="auto"/>
@@ -27104,7 +27119,7 @@
               <w:rPr>
                 <w:b/>
               </w:rPr>
-              <w:t xml:space="preserve">Total  </w:t>
+              <w:t xml:space="preserve">Subtotal - Node</w:t>
             </w:r>
           </w:p>
         </w:tc>
@@ -27126,7 +27141,10 @@
               </w:rPr>
             </w:pPr>
             <w:r>
-              <w:t>₱23,700</w:t>
+              <w:rPr>
+                <w:b/>
+              </w:rPr>
+              <w:t xml:space="preserve">₱7,070</w:t>
             </w:r>
           </w:p>
         </w:tc>
@@ -27137,6 +27155,376 @@
         </w:trPr>
         <w:tc>
           <w:tcPr>
+            <w:tcW w:w="7040" w:type="dxa"/>
+            <w:gridSpan w:val="2"/>
+            <w:tcBorders>
+              <w:top w:val="single" w:sz="4" w:space="0" w:color="auto"/>
+              <w:bottom w:val="single" w:sz="4" w:space="0" w:color="auto"/>
+            </w:tcBorders>
+          </w:tcPr>
+          <w:p>
+            <w:pPr>
+              <w:spacing w:after="0" w:line="480" w:lineRule="auto"/>
+              <w:ind w:left="0" w:firstLine="0"/>
+              <w:rPr>
+                <w:b/>
+              </w:rPr>
+            </w:pPr>
+            <w:r>
+              <w:rPr>
+                <w:b/>
+              </w:rPr>
+              <w:t xml:space="preserve">Edge</w:t>
+            </w:r>
+          </w:p>
+        </w:tc>
+      </w:tr>
+      <w:tr>
+        <w:trPr>
+          <w:jc w:val="center"/>
+        </w:trPr>
+        <w:tc>
+          <w:tcPr>
+            <w:tcW w:w="6030" w:type="dxa"/>
+          </w:tcPr>
+          <w:p>
+            <w:pPr>
+              <w:spacing w:after="0" w:line="480" w:lineRule="auto"/>
+              <w:ind w:left="0" w:firstLine="0"/>
+            </w:pPr>
+            <w:r>
+              <w:t xml:space="preserve">Meshtastic 915 MHz LoRa antenna</w:t>
+            </w:r>
+          </w:p>
+        </w:tc>
+        <w:tc>
+          <w:tcPr>
+            <w:tcW w:w="1010" w:type="dxa"/>
+          </w:tcPr>
+          <w:p>
+            <w:pPr>
+              <w:spacing w:after="0" w:line="480" w:lineRule="auto"/>
+              <w:ind w:left="0" w:firstLine="0"/>
+              <w:jc w:val="right"/>
+            </w:pPr>
+            <w:r>
+              <w:t xml:space="preserve">₱ 300</w:t>
+            </w:r>
+          </w:p>
+        </w:tc>
+      </w:tr>
+      <w:tr>
+        <w:trPr>
+          <w:jc w:val="center"/>
+        </w:trPr>
+        <w:tc>
+          <w:tcPr>
+            <w:tcW w:w="6030" w:type="dxa"/>
+          </w:tcPr>
+          <w:p>
+            <w:pPr>
+              <w:spacing w:after="0" w:line="480" w:lineRule="auto"/>
+              <w:ind w:left="0" w:firstLine="0"/>
+            </w:pPr>
+            <w:r>
+              <w:t xml:space="preserve">52Pi RPi5 power expansion board</w:t>
+            </w:r>
+          </w:p>
+        </w:tc>
+        <w:tc>
+          <w:tcPr>
+            <w:tcW w:w="1010" w:type="dxa"/>
+          </w:tcPr>
+          <w:p>
+            <w:pPr>
+              <w:spacing w:after="0" w:line="480" w:lineRule="auto"/>
+              <w:ind w:left="0" w:firstLine="0"/>
+              <w:jc w:val="right"/>
+            </w:pPr>
+            <w:r>
+              <w:t xml:space="preserve">₱ 1,600</w:t>
+            </w:r>
+          </w:p>
+        </w:tc>
+      </w:tr>
+      <w:tr>
+        <w:trPr>
+          <w:jc w:val="center"/>
+        </w:trPr>
+        <w:tc>
+          <w:tcPr>
+            <w:tcW w:w="6030" w:type="dxa"/>
+          </w:tcPr>
+          <w:p>
+            <w:pPr>
+              <w:spacing w:after="0" w:line="480" w:lineRule="auto"/>
+              <w:ind w:left="0" w:firstLine="0"/>
+            </w:pPr>
+            <w:r>
+              <w:t xml:space="preserve">Micro SD card</w:t>
+            </w:r>
+          </w:p>
+        </w:tc>
+        <w:tc>
+          <w:tcPr>
+            <w:tcW w:w="1010" w:type="dxa"/>
+          </w:tcPr>
+          <w:p>
+            <w:pPr>
+              <w:spacing w:after="0" w:line="480" w:lineRule="auto"/>
+              <w:ind w:left="0" w:firstLine="0"/>
+              <w:jc w:val="right"/>
+            </w:pPr>
+            <w:r>
+              <w:t xml:space="preserve">₱ 750</w:t>
+            </w:r>
+          </w:p>
+        </w:tc>
+      </w:tr>
+      <w:tr>
+        <w:trPr>
+          <w:jc w:val="center"/>
+        </w:trPr>
+        <w:tc>
+          <w:tcPr>
+            <w:tcW w:w="6030" w:type="dxa"/>
+          </w:tcPr>
+          <w:p>
+            <w:pPr>
+              <w:spacing w:after="0" w:line="480" w:lineRule="auto"/>
+              <w:ind w:left="0" w:firstLine="0"/>
+            </w:pPr>
+            <w:r>
+              <w:t xml:space="preserve">RPi5 active cooler</w:t>
+            </w:r>
+          </w:p>
+        </w:tc>
+        <w:tc>
+          <w:tcPr>
+            <w:tcW w:w="1010" w:type="dxa"/>
+          </w:tcPr>
+          <w:p>
+            <w:pPr>
+              <w:spacing w:after="0" w:line="480" w:lineRule="auto"/>
+              <w:ind w:left="0" w:firstLine="0"/>
+              <w:jc w:val="right"/>
+            </w:pPr>
+            <w:r>
+              <w:t xml:space="preserve">₱ 250</w:t>
+            </w:r>
+          </w:p>
+        </w:tc>
+      </w:tr>
+      <w:tr>
+        <w:trPr>
+          <w:jc w:val="center"/>
+        </w:trPr>
+        <w:tc>
+          <w:tcPr>
+            <w:tcW w:w="6030" w:type="dxa"/>
+          </w:tcPr>
+          <w:p>
+            <w:pPr>
+              <w:spacing w:after="0" w:line="480" w:lineRule="auto"/>
+              <w:ind w:left="0" w:firstLine="0"/>
+            </w:pPr>
+            <w:r>
+              <w:t xml:space="preserve">Raspberry Pi 5 2 GB board</w:t>
+            </w:r>
+          </w:p>
+        </w:tc>
+        <w:tc>
+          <w:tcPr>
+            <w:tcW w:w="1010" w:type="dxa"/>
+          </w:tcPr>
+          <w:p>
+            <w:pPr>
+              <w:spacing w:after="0" w:line="480" w:lineRule="auto"/>
+              <w:ind w:left="0" w:firstLine="0"/>
+              <w:jc w:val="right"/>
+            </w:pPr>
+            <w:r>
+              <w:t xml:space="preserve">₱ 6,500</w:t>
+            </w:r>
+          </w:p>
+        </w:tc>
+      </w:tr>
+      <w:tr>
+        <w:trPr>
+          <w:jc w:val="center"/>
+        </w:trPr>
+        <w:tc>
+          <w:tcPr>
+            <w:tcW w:w="6030" w:type="dxa"/>
+          </w:tcPr>
+          <w:p>
+            <w:pPr>
+              <w:spacing w:after="0" w:line="480" w:lineRule="auto"/>
+              <w:ind w:left="0" w:firstLine="0"/>
+            </w:pPr>
+            <w:r>
+              <w:t xml:space="preserve">12 V 12 Ah LiFePO4 battery pack</w:t>
+            </w:r>
+          </w:p>
+        </w:tc>
+        <w:tc>
+          <w:tcPr>
+            <w:tcW w:w="1010" w:type="dxa"/>
+          </w:tcPr>
+          <w:p>
+            <w:pPr>
+              <w:spacing w:after="0" w:line="480" w:lineRule="auto"/>
+              <w:ind w:left="0" w:firstLine="0"/>
+              <w:jc w:val="right"/>
+            </w:pPr>
+            <w:r>
+              <w:t xml:space="preserve">₱ 2,220</w:t>
+            </w:r>
+          </w:p>
+        </w:tc>
+      </w:tr>
+      <w:tr>
+        <w:trPr>
+          <w:jc w:val="center"/>
+        </w:trPr>
+        <w:tc>
+          <w:tcPr>
+            <w:tcW w:w="6030" w:type="dxa"/>
+          </w:tcPr>
+          <w:p>
+            <w:pPr>
+              <w:spacing w:after="0" w:line="480" w:lineRule="auto"/>
+              <w:ind w:left="0" w:firstLine="0"/>
+            </w:pPr>
+            <w:r>
+              <w:t xml:space="preserve">LoRa RFM95W transceiver board</w:t>
+            </w:r>
+          </w:p>
+        </w:tc>
+        <w:tc>
+          <w:tcPr>
+            <w:tcW w:w="1010" w:type="dxa"/>
+          </w:tcPr>
+          <w:p>
+            <w:pPr>
+              <w:spacing w:after="0" w:line="480" w:lineRule="auto"/>
+              <w:ind w:left="0" w:firstLine="0"/>
+              <w:jc w:val="right"/>
+            </w:pPr>
+            <w:r>
+              <w:t xml:space="preserve">₱ 2,000</w:t>
+            </w:r>
+          </w:p>
+        </w:tc>
+      </w:tr>
+      <w:tr>
+        <w:trPr>
+          <w:jc w:val="center"/>
+        </w:trPr>
+        <w:tc>
+          <w:tcPr>
+            <w:tcW w:w="6030" w:type="dxa"/>
+          </w:tcPr>
+          <w:p>
+            <w:pPr>
+              <w:spacing w:after="0" w:line="480" w:lineRule="auto"/>
+              <w:ind w:left="0" w:firstLine="0"/>
+            </w:pPr>
+            <w:r>
+              <w:t xml:space="preserve">60 W solar panel with controller</w:t>
+            </w:r>
+          </w:p>
+        </w:tc>
+        <w:tc>
+          <w:tcPr>
+            <w:tcW w:w="1010" w:type="dxa"/>
+          </w:tcPr>
+          <w:p>
+            <w:pPr>
+              <w:spacing w:after="0" w:line="480" w:lineRule="auto"/>
+              <w:ind w:left="0" w:firstLine="0"/>
+              <w:jc w:val="right"/>
+            </w:pPr>
+            <w:r>
+              <w:t xml:space="preserve">₱ 1,900</w:t>
+            </w:r>
+          </w:p>
+        </w:tc>
+      </w:tr>
+      <w:tr>
+        <w:trPr>
+          <w:jc w:val="center"/>
+        </w:trPr>
+        <w:tc>
+          <w:tcPr>
+            <w:tcW w:w="6030" w:type="dxa"/>
+          </w:tcPr>
+          <w:p>
+            <w:pPr>
+              <w:spacing w:after="0" w:line="480" w:lineRule="auto"/>
+              <w:ind w:left="0" w:firstLine="0"/>
+            </w:pPr>
+            <w:r>
+              <w:t xml:space="preserve">SIMCOM A7608e-H</w:t>
+            </w:r>
+          </w:p>
+        </w:tc>
+        <w:tc>
+          <w:tcPr>
+            <w:tcW w:w="1010" w:type="dxa"/>
+          </w:tcPr>
+          <w:p>
+            <w:pPr>
+              <w:spacing w:after="0" w:line="480" w:lineRule="auto"/>
+              <w:ind w:left="0" w:firstLine="0"/>
+              <w:jc w:val="right"/>
+            </w:pPr>
+            <w:r>
+              <w:t xml:space="preserve">₱ 1,530</w:t>
+            </w:r>
+          </w:p>
+        </w:tc>
+      </w:tr>
+      <w:tr>
+        <w:trPr>
+          <w:jc w:val="center"/>
+        </w:trPr>
+        <w:tc>
+          <w:tcPr>
+            <w:tcW w:w="6030" w:type="dxa"/>
+          </w:tcPr>
+          <w:p>
+            <w:pPr>
+              <w:spacing w:after="0" w:line="480" w:lineRule="auto"/>
+              <w:ind w:left="0" w:firstLine="0"/>
+            </w:pPr>
+            <w:r>
+              <w:t xml:space="preserve">SMS load (yearly)</w:t>
+            </w:r>
+          </w:p>
+        </w:tc>
+        <w:tc>
+          <w:tcPr>
+            <w:tcW w:w="1010" w:type="dxa"/>
+          </w:tcPr>
+          <w:p>
+            <w:pPr>
+              <w:spacing w:after="0" w:line="480" w:lineRule="auto"/>
+              <w:ind w:left="0" w:firstLine="0"/>
+              <w:jc w:val="right"/>
+            </w:pPr>
+            <w:r>
+              <w:t xml:space="preserve">₱ 2,000</w:t>
+            </w:r>
+          </w:p>
+        </w:tc>
+      </w:tr>
+      <w:tr>
+        <w:trPr>
+          <w:jc w:val="center"/>
+        </w:trPr>
+        <w:tc>
+          <w:tcPr>
             <w:tcW w:w="6030" w:type="dxa"/>
             <w:tcBorders>
               <w:top w:val="single" w:sz="4" w:space="0" w:color="auto"/>
@@ -27151,6 +27539,12 @@
                 <w:b/>
               </w:rPr>
             </w:pPr>
+            <w:r>
+              <w:rPr>
+                <w:b/>
+              </w:rPr>
+              <w:t xml:space="preserve">Subtotal - Edge</w:t>
+            </w:r>
           </w:p>
         </w:tc>
         <w:tc>
@@ -27170,6 +27564,286 @@
                 <w:b/>
               </w:rPr>
             </w:pPr>
+            <w:r>
+              <w:rPr>
+                <w:b/>
+              </w:rPr>
+              <w:t xml:space="preserve">₱19,050</w:t>
+            </w:r>
+          </w:p>
+        </w:tc>
+      </w:tr>
+      <w:tr>
+        <w:trPr>
+          <w:jc w:val="center"/>
+        </w:trPr>
+        <w:tc>
+          <w:tcPr>
+            <w:tcW w:w="7040" w:type="dxa"/>
+            <w:gridSpan w:val="2"/>
+            <w:tcBorders>
+              <w:top w:val="single" w:sz="4" w:space="0" w:color="auto"/>
+              <w:bottom w:val="single" w:sz="4" w:space="0" w:color="auto"/>
+            </w:tcBorders>
+          </w:tcPr>
+          <w:p>
+            <w:pPr>
+              <w:spacing w:after="0" w:line="480" w:lineRule="auto"/>
+              <w:ind w:left="0" w:firstLine="0"/>
+              <w:rPr>
+                <w:b/>
+              </w:rPr>
+            </w:pPr>
+            <w:r>
+              <w:rPr>
+                <w:b/>
+              </w:rPr>
+              <w:t xml:space="preserve">General</w:t>
+            </w:r>
+          </w:p>
+        </w:tc>
+      </w:tr>
+      <w:tr>
+        <w:trPr>
+          <w:jc w:val="center"/>
+        </w:trPr>
+        <w:tc>
+          <w:tcPr>
+            <w:tcW w:w="6030" w:type="dxa"/>
+          </w:tcPr>
+          <w:p>
+            <w:pPr>
+              <w:spacing w:after="0" w:line="480" w:lineRule="auto"/>
+              <w:ind w:left="0" w:firstLine="0"/>
+            </w:pPr>
+            <w:r>
+              <w:t xml:space="preserve">Breadboard (2 × 100)</w:t>
+            </w:r>
+          </w:p>
+        </w:tc>
+        <w:tc>
+          <w:tcPr>
+            <w:tcW w:w="1010" w:type="dxa"/>
+          </w:tcPr>
+          <w:p>
+            <w:pPr>
+              <w:spacing w:after="0" w:line="480" w:lineRule="auto"/>
+              <w:ind w:left="0" w:firstLine="0"/>
+              <w:jc w:val="right"/>
+            </w:pPr>
+            <w:r>
+              <w:t xml:space="preserve">₱ 200</w:t>
+            </w:r>
+          </w:p>
+        </w:tc>
+      </w:tr>
+      <w:tr>
+        <w:trPr>
+          <w:jc w:val="center"/>
+        </w:trPr>
+        <w:tc>
+          <w:tcPr>
+            <w:tcW w:w="6030" w:type="dxa"/>
+          </w:tcPr>
+          <w:p>
+            <w:pPr>
+              <w:spacing w:after="0" w:line="480" w:lineRule="auto"/>
+              <w:ind w:left="0" w:firstLine="0"/>
+            </w:pPr>
+            <w:r>
+              <w:t xml:space="preserve">Wires</w:t>
+            </w:r>
+          </w:p>
+        </w:tc>
+        <w:tc>
+          <w:tcPr>
+            <w:tcW w:w="1010" w:type="dxa"/>
+          </w:tcPr>
+          <w:p>
+            <w:pPr>
+              <w:spacing w:after="0" w:line="480" w:lineRule="auto"/>
+              <w:ind w:left="0" w:firstLine="0"/>
+              <w:jc w:val="right"/>
+            </w:pPr>
+            <w:r>
+              <w:t xml:space="preserve">₱ 200</w:t>
+            </w:r>
+          </w:p>
+        </w:tc>
+      </w:tr>
+      <w:tr>
+        <w:trPr>
+          <w:jc w:val="center"/>
+        </w:trPr>
+        <w:tc>
+          <w:tcPr>
+            <w:tcW w:w="6030" w:type="dxa"/>
+          </w:tcPr>
+          <w:p>
+            <w:pPr>
+              <w:spacing w:after="0" w:line="480" w:lineRule="auto"/>
+              <w:ind w:left="0" w:firstLine="0"/>
+            </w:pPr>
+            <w:r>
+              <w:t xml:space="preserve">Marine plywood</w:t>
+            </w:r>
+          </w:p>
+        </w:tc>
+        <w:tc>
+          <w:tcPr>
+            <w:tcW w:w="1010" w:type="dxa"/>
+          </w:tcPr>
+          <w:p>
+            <w:pPr>
+              <w:spacing w:after="0" w:line="480" w:lineRule="auto"/>
+              <w:ind w:left="0" w:firstLine="0"/>
+              <w:jc w:val="right"/>
+            </w:pPr>
+            <w:r>
+              <w:t xml:space="preserve">₱ 400</w:t>
+            </w:r>
+          </w:p>
+        </w:tc>
+      </w:tr>
+      <w:tr>
+        <w:trPr>
+          <w:jc w:val="center"/>
+        </w:trPr>
+        <w:tc>
+          <w:tcPr>
+            <w:tcW w:w="6030" w:type="dxa"/>
+          </w:tcPr>
+          <w:p>
+            <w:pPr>
+              <w:spacing w:after="0" w:line="480" w:lineRule="auto"/>
+              <w:ind w:left="0" w:firstLine="0"/>
+            </w:pPr>
+            <w:r>
+              <w:t xml:space="preserve">Miscellaneous electrical components</w:t>
+            </w:r>
+          </w:p>
+        </w:tc>
+        <w:tc>
+          <w:tcPr>
+            <w:tcW w:w="1010" w:type="dxa"/>
+          </w:tcPr>
+          <w:p>
+            <w:pPr>
+              <w:spacing w:after="0" w:line="480" w:lineRule="auto"/>
+              <w:ind w:left="0" w:firstLine="0"/>
+              <w:jc w:val="right"/>
+            </w:pPr>
+            <w:r>
+              <w:t xml:space="preserve">₱ 1,000</w:t>
+            </w:r>
+          </w:p>
+        </w:tc>
+      </w:tr>
+      <w:tr>
+        <w:trPr>
+          <w:jc w:val="center"/>
+        </w:trPr>
+        <w:tc>
+          <w:tcPr>
+            <w:tcW w:w="6030" w:type="dxa"/>
+            <w:tcBorders>
+              <w:top w:val="single" w:sz="4" w:space="0" w:color="auto"/>
+              <w:bottom w:val="single" w:sz="4" w:space="0" w:color="auto"/>
+            </w:tcBorders>
+          </w:tcPr>
+          <w:p>
+            <w:pPr>
+              <w:spacing w:after="0" w:line="480" w:lineRule="auto"/>
+              <w:ind w:left="0" w:firstLine="0"/>
+              <w:rPr>
+                <w:b/>
+              </w:rPr>
+            </w:pPr>
+            <w:r>
+              <w:rPr>
+                <w:b/>
+              </w:rPr>
+              <w:t xml:space="preserve">Subtotal - General</w:t>
+            </w:r>
+          </w:p>
+        </w:tc>
+        <w:tc>
+          <w:tcPr>
+            <w:tcW w:w="1010" w:type="dxa"/>
+            <w:tcBorders>
+              <w:top w:val="single" w:sz="4" w:space="0" w:color="auto"/>
+              <w:bottom w:val="single" w:sz="4" w:space="0" w:color="auto"/>
+            </w:tcBorders>
+          </w:tcPr>
+          <w:p>
+            <w:pPr>
+              <w:spacing w:after="0" w:line="480" w:lineRule="auto"/>
+              <w:ind w:left="0" w:firstLine="0"/>
+              <w:jc w:val="right"/>
+              <w:rPr>
+                <w:b/>
+              </w:rPr>
+            </w:pPr>
+            <w:r>
+              <w:rPr>
+                <w:b/>
+              </w:rPr>
+              <w:t xml:space="preserve">₱1,800</w:t>
+            </w:r>
+          </w:p>
+        </w:tc>
+      </w:tr>
+      <w:tr>
+        <w:trPr>
+          <w:jc w:val="center"/>
+        </w:trPr>
+        <w:tc>
+          <w:tcPr>
+            <w:tcW w:w="6030" w:type="dxa"/>
+            <w:tcBorders>
+              <w:top w:val="single" w:sz="4" w:space="0" w:color="auto"/>
+              <w:bottom w:val="single" w:sz="4" w:space="0" w:color="auto"/>
+            </w:tcBorders>
+          </w:tcPr>
+          <w:p>
+            <w:pPr>
+              <w:spacing w:after="0" w:line="480" w:lineRule="auto"/>
+              <w:ind w:left="0" w:firstLine="0"/>
+              <w:rPr>
+                <w:b/>
+              </w:rPr>
+            </w:pPr>
+            <w:r>
+              <w:rPr>
+                <w:b/>
+              </w:rPr>
+              <w:t xml:space="preserve">Total</w:t>
+            </w:r>
+          </w:p>
+        </w:tc>
+        <w:tc>
+          <w:tcPr>
+            <w:tcW w:w="1010" w:type="dxa"/>
+            <w:tcBorders>
+              <w:top w:val="single" w:sz="4" w:space="0" w:color="auto"/>
+              <w:bottom w:val="single" w:sz="4" w:space="0" w:color="auto"/>
+            </w:tcBorders>
+          </w:tcPr>
+          <w:p>
+            <w:pPr>
+              <w:spacing w:after="0" w:line="480" w:lineRule="auto"/>
+              <w:ind w:left="0" w:firstLine="0"/>
+              <w:jc w:val="right"/>
+              <w:rPr>
+                <w:b/>
+              </w:rPr>
+            </w:pPr>
+            <w:r>
+              <w:rPr>
+                <w:b/>
+              </w:rPr>
+              <w:t xml:space="preserve">₱27,920</w:t>
+            </w:r>
           </w:p>
         </w:tc>
       </w:tr>

</xml_diff>

<commit_message>
Reorder presentation: SOP at slide 2, Conclusions/Recommendations as final slides 13-14
</commit_message>
<xml_diff>
--- a/FLAIRE Thesis 2 - 1 (Revised).docx
+++ b/FLAIRE Thesis 2 - 1 (Revised).docx
@@ -4082,6 +4082,7 @@
     </w:p>
     <w:p>
       <w:pPr>
+        <w:spacing w:after="0" w:line="480" w:lineRule="auto"/>
         <w:ind w:left="0" w:firstLine="0"/>
       </w:pPr>
       <w:r>
@@ -4090,6 +4091,7 @@
     </w:p>
     <w:p>
       <w:pPr>
+        <w:spacing w:after="0" w:line="480" w:lineRule="auto"/>
         <w:ind w:left="0" w:firstLine="0"/>
       </w:pPr>
       <w:r>
@@ -4098,6 +4100,7 @@
     </w:p>
     <w:p>
       <w:pPr>
+        <w:spacing w:after="0" w:line="480" w:lineRule="auto"/>
         <w:ind w:left="0" w:firstLine="0"/>
       </w:pPr>
       <w:r>
@@ -4106,6 +4109,7 @@
     </w:p>
     <w:p>
       <w:pPr>
+        <w:spacing w:after="0" w:line="480" w:lineRule="auto"/>
         <w:ind w:left="0" w:firstLine="0"/>
       </w:pPr>
       <w:r>
@@ -4114,6 +4118,7 @@
     </w:p>
     <w:p>
       <w:pPr>
+        <w:spacing w:after="0" w:line="480" w:lineRule="auto"/>
         <w:ind w:left="0" w:firstLine="0"/>
       </w:pPr>
       <w:r>
@@ -4122,6 +4127,7 @@
     </w:p>
     <w:p>
       <w:pPr>
+        <w:spacing w:after="0" w:line="480" w:lineRule="auto"/>
         <w:ind w:left="0" w:firstLine="0"/>
       </w:pPr>
       <w:r>
@@ -6788,14 +6794,12 @@
         </w:rPr>
         <w:t xml:space="preserve">How can </w:t>
       </w:r>
-      <w:proofErr w:type="gramStart"/>
-      <w:r>
-        <w:rPr>
-          <w:szCs w:val="24"/>
-        </w:rPr>
-        <w:t>an</w:t>
-      </w:r>
-      <w:proofErr w:type="gramEnd"/>
+      <w:r>
+        <w:rPr>
+          <w:szCs w:val="24"/>
+        </w:rPr>
+        <w:t>a</w:t>
+      </w:r>
       <w:r>
         <w:rPr>
           <w:szCs w:val="24"/>
@@ -6912,6 +6916,7 @@
         <w:rPr>
           <w:szCs w:val="24"/>
         </w:rPr>
+        <w:lastRenderedPageBreak/>
         <w:t>A hybrid AI pipeline in which a Random Forest model estimates flood propensity using R1, R3, R7, rain_days, TMAX, TMIN, TideMax, and TideMin, while a fuzzy-logic classifier with 20 rules (a 15-rule core plus 5 gap-fill rules) integrates this propensity with the real-time water-level reading, its rate of rise, the cached forecast rainfall, and the tide level to classify flood risk as Receding, Alert, Alarm, or Critical using cached weather and tide forecasts; and</w:t>
       </w:r>
     </w:p>
@@ -9096,13 +9101,14 @@
           <w:szCs w:val="24"/>
         </w:rPr>
         <w:tab/>
-        <w:t xml:space="preserve">Kim et al.  conducted a directly relevant study that utilized deep learning models to classify/forecast flood water levels in the CarayCaray Basin on Biliran Island in Eastern Visayas, Philippines, and applied flood risk classification to evaluate the degree of risk associated with predicted water levels. The study employed deep neural network (DNN) models for water level prediction, achieving an NRMSE of 9.48, with the DNN model demonstrating </w:t>
-      </w:r>
-      <w:r>
-        <w:rPr>
-          <w:szCs w:val="24"/>
-        </w:rPr>
-        <w:t>the best predictive performance. For flood risk classification, the researchers utilized extreme gradient boosting, random forest, and decision tree models, with the extreme gradient boosting model achieving the highest F1-score of 0.92. The study emphasizes that AI-based predictive models are anticipated to reduce flood damage and enhance disaster mitigation systems, and that real-time collection of rainfall and water level data enables continuous model learning. The study's application of AI models within the Philippine flood context, combined with its demonstration that random forest and gradient boosting algorithms can achieve high classification accuracy for flood risk levels, provides strong empirical support for the AI-based classification approach adopted in that study.</w:t>
+        <w:t xml:space="preserve">Kim et al.  conducted a directly relevant study that utilized deep learning models to classify/forecast flood water levels in the CarayCaray Basin on Biliran Island in Eastern Visayas, Philippines, and applied flood risk classification to evaluate the degree of risk associated with predicted water levels. The study employed deep neural network (DNN) models for water level prediction, achieving an NRMSE of 9.48, with the DNN model </w:t>
+      </w:r>
+      <w:r>
+        <w:rPr>
+          <w:szCs w:val="24"/>
+        </w:rPr>
+        <w:lastRenderedPageBreak/>
+        <w:t>demonstrating the best predictive performance. For flood risk classification, the researchers utilized extreme gradient boosting, random forest, and decision tree models, with the extreme gradient boosting model achieving the highest F1-score of 0.92. The study emphasizes that AI-based predictive models are anticipated to reduce flood damage and enhance disaster mitigation systems, and that real-time collection of rainfall and water level data enables continuous model learning. The study's application of AI models within the Philippine flood context, combined with its demonstration that random forest and gradient boosting algorithms can achieve high classification accuracy for flood risk levels, provides strong empirical support for the AI-based classification approach adopted in that study.</w:t>
       </w:r>
       <w:sdt>
         <w:sdtPr>
@@ -9309,6 +9315,7 @@
         <w:rPr>
           <w:szCs w:val="24"/>
         </w:rPr>
+        <w:lastRenderedPageBreak/>
         <w:t>tropical cyclone center has the most influence on accumulated rainfall variability, followed by TC duration, latitude of land grid, and TC track type. The model produced rainfall distributions similar to calibrated satellite rainfall observations and demonstrated particular skill in predicting intense rainfall events compared to other statistical or dynamical weather models, including the WRF model. The study concludes that the RF model's predictive ability, combined with its low computational power requirements, makes it a potential tool for augmenting TC rainfall forecasting in the Philippines. The application of Random Forest to Philippine rainfall and hazard prediction in Mesias and Bagtasa (2025) supports Random Forest as a viable classification algorithm option for that developed flood risk classification system, demonstrating its suitability and effectiveness within the Philippine meteorological context.</w:t>
       </w:r>
       <w:sdt>
@@ -9516,21 +9523,7 @@
           <w:szCs w:val="24"/>
         </w:rPr>
         <w:tab/>
-        <w:t xml:space="preserve">Sehgal, Gurudiwan, and </w:t>
-      </w:r>
-      <w:proofErr w:type="gramStart"/>
-      <w:r>
-        <w:rPr>
-          <w:szCs w:val="24"/>
-        </w:rPr>
-        <w:t>Pant  proposed</w:t>
-      </w:r>
-      <w:proofErr w:type="gramEnd"/>
-      <w:r>
-        <w:rPr>
-          <w:szCs w:val="24"/>
-        </w:rPr>
-        <w:t xml:space="preserve"> a scalable framework for real-time flood prediction that integrates remote sensing data, collected via satellites and drones, with edge </w:t>
+        <w:t xml:space="preserve">Sehgal, Gurudiwan, and Pant  proposed a scalable framework for real-time flood prediction that integrates remote sensing data, collected via satellites and drones, with edge </w:t>
       </w:r>
       <w:r>
         <w:rPr>
@@ -9620,6 +9613,7 @@
         <w:rPr>
           <w:szCs w:val="24"/>
         </w:rPr>
+        <w:lastRenderedPageBreak/>
         <w:t>become more effective at creating precise and cost-effective prediction systems, and that these models have significant potential to minimize flood damage and loss of human life. Refadah's systematic review provides a comprehensive empirical basis for the selection of machine learning as the core classification methodology in that study, and specifically supports the use of ensemble methods, such as Random Forest, which consistently demonstrate strong performance across diverse flood forecasting scenarios in the reviewed literature.</w:t>
       </w:r>
       <w:sdt>
@@ -9678,14 +9672,14 @@
           <w:szCs w:val="24"/>
         </w:rPr>
         <w:tab/>
-        <w:t xml:space="preserve">Bibi et al.  investigated riverine flood-risk classification and early warning for the Kabul River transboundary basin between Pakistan and Afghanistan, a context characterized by complex mountainous terrain, extreme climate variability, and significant challenges in obtaining upstream data, which are common barriers to effective flood forecasting in similar global river basins. The study applied and compared multiple advanced machine learning and deep learning models, including Support Vector Machines (SVM), XGBoost, Artificial Neural Networks (ANN), Long Short-Term Memory (LSTM) networks, and Gated Recurrent Units (GRU), for predicting daily and multi-step river flow using satellite-based climatic data. The LSTM network outperformed all other models, achieving an R² of 0.96 and an RMSE of 140.96 m³/s, with time-series LSTM and GRU models performing well for short-term forecasts of up to five days. However, accuracy declined beyond the fourth day, underscoring the need for longer historical datasets for reliable long-term prediction. The study's findings on the comparative performance of AI models for riverine flood prediction in data-limited transboundary basins are directly applicable to the cited study's system, which similarly addresses flood prediction challenges in a data-scarce Philippine river basin. The study confirms that multi-step AI-based riverine flood risk classification </w:t>
+        <w:t>Bibi et al.  investigated riverine flood-risk classification and early warning for the Kabul River transboundary basin between Pakistan and Afghanistan, a context characterized by complex mountainous terrain, extreme climate variability, and significant challenges in obtaining upstream data, which are common barriers to effective flood forecasting in similar global river basins. The study applied and compared multiple advanced machine learning and deep learning models, including Support Vector Machines (SVM), XGBoost, Artificial Neural Networks (ANN), Long Short-Term Memory (LSTM) networks, and Gated Recurrent Units (GRU), for predicting daily and multi-step river flow using satellite-based climatic data. The LSTM network outperformed all other models, achieving an R² of 0.96 and an RMSE of 140.96 m³/s, with time-series LSTM and GRU models performing well for short-term forecasts of up to five days. However, accuracy declined beyond the fourth day, underscoring the need for longer historical datasets for reliable long-term prediction. The study's findings on the comparative performance of AI models for riverine flood prediction in data-limited transboundary basins are directly applicable to the cited study's system, which similarly addresses flood prediction challenges in a data-scarce Philippine river basin. The study confirms that multi-step AI-</w:t>
       </w:r>
       <w:r>
         <w:rPr>
           <w:szCs w:val="24"/>
         </w:rPr>
         <w:lastRenderedPageBreak/>
-        <w:t>is technically achievable within multi-day windows and supports the selection of ensemble and tree-based methods as strong candidates for operational deployment where computational efficiency is a design priority.</w:t>
+        <w:t>based riverine flood risk classification is technically achievable within multi-day windows and supports the selection of ensemble and tree-based methods as strong candidates for operational deployment where computational efficiency is a design priority.</w:t>
       </w:r>
       <w:sdt>
         <w:sdtPr>
@@ -9871,14 +9865,14 @@
         <w:rPr>
           <w:lang w:val="en-PH"/>
         </w:rPr>
-        <w:t xml:space="preserve">These inputs are processed through a hybrid Fuzzy-AI pipeline deployed on the Raspberry Pi 5 edge device. First, a Random Forest model estimated flood propensity using historical and forecast meteorological and tide-related features: R1, R3, R7, rain_days, </w:t>
+        <w:t xml:space="preserve">These inputs are processed through a hybrid Fuzzy-AI pipeline deployed on the Raspberry Pi 5 edge device. First, a Random Forest model estimated flood propensity using </w:t>
       </w:r>
       <w:r>
         <w:rPr>
           <w:lang w:val="en-PH"/>
         </w:rPr>
         <w:lastRenderedPageBreak/>
-        <w:t>TMAX, TMIN, TideMax, and TideMin. Then, a fuzzy-logic classifier with 20 rules (a 15-rule core plus 5 gap-fill rules) integrated the Random Forest output with the real-time water-level reading, its rate of rise, the cached forecast rainfall, and the tide level. The fuzzy-logic layer applied interpretable decision rules to classify the prevailing condition into one of four flood-risk levels: Receding, Alert, Alarm, or Critical. Together, these processes use the cached seven-day forecast horizon as the available decision window.</w:t>
+        <w:t>historical and forecast meteorological and tide-related features: R1, R3, R7, rain_days, TMAX, TMIN, TideMax, and TideMin. Then, a fuzzy-logic classifier with 20 rules (a 15-rule core plus 5 gap-fill rules) integrated the Random Forest output with the real-time water-level reading, its rate of rise, the cached forecast rainfall, and the tide level. The fuzzy-logic layer applied interpretable decision rules to classify the prevailing condition into one of four flood-risk levels: Receding, Alert, Alarm, or Critical. Together, these processes use the cached seven-day forecast horizon as the available decision window.</w:t>
       </w:r>
     </w:p>
     <w:p>
@@ -9935,7 +9929,11 @@
       </w:pPr>
       <w:r>
         <w:tab/>
-        <w:t>This study followed a developmental and evaluative research paradigm grounded in the post-positivist tradition, employing an Input-Process-Output (IPO) model to guide the design, development, and evaluation of the developed hybrid AI-based flood-risk classification and early-warning system. The paradigm maps the logical flow of variables, processes, and outcomes that constitute the research investigation.</w:t>
+        <w:t xml:space="preserve">This study followed a developmental and evaluative research paradigm grounded in the post-positivist tradition, employing an Input-Process-Output (IPO) model to guide </w:t>
+      </w:r>
+      <w:r>
+        <w:lastRenderedPageBreak/>
+        <w:t>the design, development, and evaluation of the developed hybrid AI-based flood-risk classification and early-warning system. The paradigm maps the logical flow of variables, processes, and outcomes that constitute the research investigation.</w:t>
       </w:r>
     </w:p>
     <w:p>
@@ -10644,7 +10642,11 @@
         <w:t xml:space="preserve">Figure 2.1 </w:t>
       </w:r>
       <w:r>
-        <w:t>establishes a clear directional relationship in which the independent variables (weather forecast and sensor inputs, historical data) are transformed through defined computational and analytical processes into the dependent outcomes (flood risk classification, alert delivery, and system performance measures). This structure ensures that the study's research questions, objectives, and evaluation criteria are systematically aligned, and that the contributions of the system can be rigorously and transparently assessed within a scientific framework.</w:t>
+        <w:t xml:space="preserve">establishes a clear directional relationship in which the independent variables (weather forecast and sensor inputs, historical data) are transformed through defined computational and analytical processes into the dependent outcomes (flood risk classification, alert delivery, and system performance measures). This structure ensures that the study's research questions, objectives, and evaluation criteria are systematically </w:t>
+      </w:r>
+      <w:r>
+        <w:lastRenderedPageBreak/>
+        <w:t>aligned, and that the contributions of the system can be rigorously and transparently assessed within a scientific framework.</w:t>
       </w:r>
     </w:p>
     <w:p>
@@ -16062,6 +16064,9 @@
       <w:pPr>
         <w:spacing w:after="0" w:line="480" w:lineRule="auto"/>
         <w:ind w:left="0" w:firstLine="0"/>
+        <w:rPr>
+          <w:lang w:val="en-PH"/>
+        </w:rPr>
       </w:pPr>
     </w:p>
     <w:p>
@@ -16069,11 +16074,9 @@
         <w:pStyle w:val="ThesisSections"/>
         <w:spacing w:before="0"/>
       </w:pPr>
-      <w:bookmarkStart w:id="21" w:name="_Toc223690214"/>
-      <w:r>
-        <w:t>Flowchart of the Developed System</w:t>
-      </w:r>
-      <w:bookmarkEnd w:id="21"/>
+      <w:r>
+        <w:t>Entity Relationship Diagram</w:t>
+      </w:r>
     </w:p>
     <w:p>
       <w:pPr>
@@ -16084,16 +16087,22 @@
         <w:tab/>
       </w:r>
       <w:r>
-        <w:t xml:space="preserve">The flowchart outlines the step-by-step process involved in the </w:t>
-      </w:r>
-      <w:r>
-        <w:t>device</w:t>
-      </w:r>
-      <w:r>
-        <w:t xml:space="preserve"> operation, ensuring a clear and logical sequence of activities</w:t>
-      </w:r>
-      <w:r>
-        <w:t>.</w:t>
+        <w:t xml:space="preserve">The </w:t>
+      </w:r>
+      <w:r>
+        <w:t>Entity Relationship Diagram</w:t>
+      </w:r>
+      <w:r>
+        <w:t xml:space="preserve"> </w:t>
+      </w:r>
+      <w:r>
+        <w:t>provides a visual map of</w:t>
+      </w:r>
+      <w:r>
+        <w:t xml:space="preserve"> the data structures, entities, and relationships within </w:t>
+      </w:r>
+      <w:r>
+        <w:t>the FLAIRE system.</w:t>
       </w:r>
     </w:p>
     <w:p>
@@ -16171,6 +16180,172 @@
           <w:bCs/>
         </w:rPr>
         <w:lastRenderedPageBreak/>
+        <w:t>Figure 3.3</w:t>
+      </w:r>
+    </w:p>
+    <w:p>
+      <w:pPr>
+        <w:spacing w:after="0" w:line="480" w:lineRule="auto"/>
+        <w:ind w:left="0" w:right="-7" w:firstLine="0"/>
+        <w:rPr>
+          <w:i/>
+          <w:iCs/>
+        </w:rPr>
+      </w:pPr>
+      <w:r>
+        <w:rPr>
+          <w:i/>
+          <w:iCs/>
+        </w:rPr>
+        <w:t>Entity Relationship Diagram of FLAIRE</w:t>
+      </w:r>
+    </w:p>
+    <w:p>
+      <w:pPr>
+        <w:spacing w:after="0" w:line="480" w:lineRule="auto"/>
+        <w:ind w:left="0" w:firstLine="0"/>
+        <w:rPr>
+          <w:lang w:val="en-PH"/>
+        </w:rPr>
+      </w:pPr>
+      <w:r>
+        <w:rPr>
+          <w:lang w:val="en-PH"/>
+        </w:rPr>
+        <w:drawing>
+          <wp:inline distT="0" distB="0" distL="0" distR="0" wp14:anchorId="3F1F567A" wp14:editId="7FC4A89B">
+            <wp:extent cx="5382977" cy="5486400"/>
+            <wp:effectExtent l="0" t="0" r="8255" b="0"/>
+            <wp:docPr id="1011399895" name="Picture 1"/>
+            <wp:cNvGraphicFramePr>
+              <a:graphicFrameLocks xmlns:a="http://schemas.openxmlformats.org/drawingml/2006/main" noChangeAspect="1"/>
+            </wp:cNvGraphicFramePr>
+            <a:graphic xmlns:a="http://schemas.openxmlformats.org/drawingml/2006/main">
+              <a:graphicData uri="http://schemas.openxmlformats.org/drawingml/2006/picture">
+                <pic:pic xmlns:pic="http://schemas.openxmlformats.org/drawingml/2006/picture">
+                  <pic:nvPicPr>
+                    <pic:cNvPr id="1011399895" name=""/>
+                    <pic:cNvPicPr/>
+                  </pic:nvPicPr>
+                  <pic:blipFill>
+                    <a:blip r:embed="rId17">
+                      <a:extLst>
+                        <a:ext uri="{BEBA8EAE-BF5A-486C-A8C5-ECC9F3942E4B}">
+                          <a14:imgProps xmlns:a14="http://schemas.microsoft.com/office/drawing/2010/main">
+                            <a14:imgLayer r:embed="rId18">
+                              <a14:imgEffect>
+                                <a14:saturation sat="0"/>
+                              </a14:imgEffect>
+                            </a14:imgLayer>
+                          </a14:imgProps>
+                        </a:ext>
+                      </a:extLst>
+                    </a:blip>
+                    <a:stretch>
+                      <a:fillRect/>
+                    </a:stretch>
+                  </pic:blipFill>
+                  <pic:spPr>
+                    <a:xfrm>
+                      <a:off x="0" y="0"/>
+                      <a:ext cx="5382977" cy="5486400"/>
+                    </a:xfrm>
+                    <a:prstGeom prst="rect">
+                      <a:avLst/>
+                    </a:prstGeom>
+                  </pic:spPr>
+                </pic:pic>
+              </a:graphicData>
+            </a:graphic>
+          </wp:inline>
+        </w:drawing>
+      </w:r>
+    </w:p>
+    <w:p>
+      <w:pPr>
+        <w:spacing w:after="0" w:line="480" w:lineRule="auto"/>
+        <w:ind w:left="0" w:firstLine="720"/>
+      </w:pPr>
+      <w:r>
+        <w:t>The ERD models the data layer of the River Monitor system, a SQLite database on a Raspberry Pi 5. It contains 11 entities grouped into six functional domains</w:t>
+      </w:r>
+      <w:r>
+        <w:t>,</w:t>
+      </w:r>
+      <w:r>
+        <w:t xml:space="preserve"> sensor ingestion, weather/tide, AI prediction output, alerting, authentication/audit, and operations. Each entity is identified by a surrogate integer primary key (`id`), and natural keys such as `username`, `</w:t>
+      </w:r>
+      <w:proofErr w:type="spellStart"/>
+      <w:r>
+        <w:t>phone_number</w:t>
+      </w:r>
+      <w:proofErr w:type="spellEnd"/>
+      <w:r>
+        <w:t xml:space="preserve">`, and `date` are enforced as `UNIQUE`. There are no declared </w:t>
+      </w:r>
+      <w:r>
+        <w:lastRenderedPageBreak/>
+        <w:t>foreign keys; integrity is maintained in application code, which keeps the schema simple and migration-friendly on SQLite.</w:t>
+      </w:r>
+    </w:p>
+    <w:p>
+      <w:pPr>
+        <w:spacing w:after="0" w:line="480" w:lineRule="auto"/>
+        <w:ind w:left="0" w:firstLine="720"/>
+      </w:pPr>
+    </w:p>
+    <w:p>
+      <w:pPr>
+        <w:pStyle w:val="ThesisSections"/>
+        <w:spacing w:before="0"/>
+      </w:pPr>
+      <w:bookmarkStart w:id="21" w:name="_Toc223690214"/>
+      <w:r>
+        <w:t>Flowchart of the Developed System</w:t>
+      </w:r>
+      <w:bookmarkEnd w:id="21"/>
+    </w:p>
+    <w:p>
+      <w:pPr>
+        <w:spacing w:after="0" w:line="480" w:lineRule="auto"/>
+        <w:ind w:left="0" w:firstLine="0"/>
+      </w:pPr>
+      <w:r>
+        <w:tab/>
+      </w:r>
+      <w:r>
+        <w:t xml:space="preserve">The flowchart outlines the step-by-step process involved in the </w:t>
+      </w:r>
+      <w:r>
+        <w:t>device</w:t>
+      </w:r>
+      <w:r>
+        <w:t xml:space="preserve"> operation, ensuring a clear and logical sequence of activities</w:t>
+      </w:r>
+      <w:r>
+        <w:t>.</w:t>
+      </w:r>
+    </w:p>
+    <w:p>
+      <w:pPr>
+        <w:spacing w:after="0" w:line="480" w:lineRule="auto"/>
+        <w:ind w:left="0" w:firstLine="0"/>
+      </w:pPr>
+    </w:p>
+    <w:p>
+      <w:pPr>
+        <w:spacing w:after="0" w:line="360" w:lineRule="auto"/>
+        <w:ind w:left="0" w:firstLine="0"/>
+        <w:rPr>
+          <w:b/>
+          <w:bCs/>
+        </w:rPr>
+      </w:pPr>
+      <w:r>
+        <w:rPr>
+          <w:b/>
+          <w:bCs/>
+        </w:rPr>
         <w:t>Figure 3.3.1</w:t>
       </w:r>
     </w:p>
@@ -16208,9 +16383,9 @@
         <mc:AlternateContent>
           <mc:Choice Requires="wpc">
             <w:drawing>
-              <wp:inline distT="0" distB="0" distL="0" distR="0" wp14:anchorId="3534AF80" wp14:editId="324A76F8">
-                <wp:extent cx="5486400" cy="6238875"/>
-                <wp:effectExtent l="0" t="0" r="0" b="9525"/>
+              <wp:inline distT="0" distB="0" distL="0" distR="0" wp14:anchorId="3534AF80" wp14:editId="512981ED">
+                <wp:extent cx="5486400" cy="5029201"/>
+                <wp:effectExtent l="0" t="0" r="0" b="0"/>
                 <wp:docPr id="2045537962" name="Canvas 7"/>
                 <wp:cNvGraphicFramePr>
                   <a:graphicFrameLocks xmlns:a="http://schemas.openxmlformats.org/drawingml/2006/main" noChangeAspect="1"/>
@@ -16349,7 +16524,7 @@
                         <wps:cNvSpPr/>
                         <wps:spPr>
                           <a:xfrm>
-                            <a:off x="1847850" y="2295526"/>
+                            <a:off x="1847850" y="1806795"/>
                             <a:ext cx="1809750" cy="1168880"/>
                           </a:xfrm>
                           <a:prstGeom prst="flowChartProcess">
@@ -16417,7 +16592,7 @@
                         <wps:cNvSpPr/>
                         <wps:spPr>
                           <a:xfrm>
-                            <a:off x="2361301" y="5362576"/>
+                            <a:off x="2361301" y="4353583"/>
                             <a:ext cx="800099" cy="438149"/>
                           </a:xfrm>
                           <a:prstGeom prst="flowChartTerminator">
@@ -16507,7 +16682,7 @@
                         <wps:spPr>
                           <a:xfrm>
                             <a:off x="2752725" y="1552575"/>
-                            <a:ext cx="0" cy="742951"/>
+                            <a:ext cx="0" cy="254220"/>
                           </a:xfrm>
                           <a:prstGeom prst="line">
                             <a:avLst/>
@@ -16537,8 +16712,8 @@
                         </wps:cNvCnPr>
                         <wps:spPr>
                           <a:xfrm rot="16200000" flipH="1">
-                            <a:off x="2467084" y="3750046"/>
-                            <a:ext cx="575556" cy="4275"/>
+                            <a:off x="2608974" y="3119425"/>
+                            <a:ext cx="291777" cy="4275"/>
                           </a:xfrm>
                           <a:prstGeom prst="bentConnector3">
                             <a:avLst>
@@ -16567,7 +16742,7 @@
                         <wps:cNvSpPr/>
                         <wps:spPr>
                           <a:xfrm>
-                            <a:off x="1528596" y="4039962"/>
+                            <a:off x="1528596" y="3267452"/>
                             <a:ext cx="2456808" cy="635555"/>
                           </a:xfrm>
                           <a:prstGeom prst="flowChartDecision">
@@ -16634,11 +16809,11 @@
                         <wps:spPr>
                           <a:xfrm flipH="1" flipV="1">
                             <a:off x="3419475" y="1147763"/>
-                            <a:ext cx="565929" cy="3209977"/>
+                            <a:ext cx="565929" cy="2437467"/>
                           </a:xfrm>
                           <a:prstGeom prst="bentConnector3">
                             <a:avLst>
-                              <a:gd name="adj1" fmla="val -241601"/>
+                              <a:gd name="adj1" fmla="val -40394"/>
                             </a:avLst>
                           </a:prstGeom>
                           <a:ln>
@@ -16672,8 +16847,8 @@
                         </wps:cNvCnPr>
                         <wps:spPr>
                           <a:xfrm>
-                            <a:off x="2757000" y="4675517"/>
-                            <a:ext cx="4351" cy="687059"/>
+                            <a:off x="2757000" y="3903007"/>
+                            <a:ext cx="4351" cy="450576"/>
                           </a:xfrm>
                           <a:prstGeom prst="line">
                             <a:avLst/>
@@ -16700,7 +16875,7 @@
                         <wps:cNvSpPr txBox="1"/>
                         <wps:spPr>
                           <a:xfrm>
-                            <a:off x="2761351" y="5011753"/>
+                            <a:off x="2761351" y="4002760"/>
                             <a:ext cx="411480" cy="315265"/>
                           </a:xfrm>
                           <a:prstGeom prst="rect">
@@ -16744,7 +16919,7 @@
                         <wps:cNvSpPr txBox="1"/>
                         <wps:spPr>
                           <a:xfrm>
-                            <a:off x="4059268" y="4096755"/>
+                            <a:off x="3822785" y="3182355"/>
                             <a:ext cx="375920" cy="260985"/>
                           </a:xfrm>
                           <a:prstGeom prst="rect">
@@ -16787,7 +16962,7 @@
           </mc:Choice>
           <mc:Fallback>
             <w:pict>
-              <v:group w14:anchorId="3534AF80" id="Canvas 7" o:spid="_x0000_s1052" editas="canvas" style="width:6in;height:491.25pt;mso-position-horizontal-relative:char;mso-position-vertical-relative:line" coordsize="54864,62388" o:gfxdata="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">
+              <v:group w14:anchorId="3534AF80" id="Canvas 7" o:spid="_x0000_s1052" editas="canvas" style="width:6in;height:396pt;mso-position-horizontal-relative:char;mso-position-vertical-relative:line" coordsize="54864,50292" o:gfxdata="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">
                 <v:shapetype id="_x0000_t75" coordsize="21600,21600" o:spt="75" o:preferrelative="t" path="m@4@5l@4@11@9@11@9@5xe" filled="f" stroked="f">
                   <v:stroke joinstyle="miter"/>
                   <v:formulas>
@@ -16807,7 +16982,7 @@
                   <v:path o:extrusionok="f" gradientshapeok="t" o:connecttype="rect"/>
                   <o:lock v:ext="edit" aspectratio="t"/>
                 </v:shapetype>
-                <v:shape id="_x0000_s1053" type="#_x0000_t75" style="position:absolute;width:54864;height:62388;visibility:visible;mso-wrap-style:square" filled="t">
+                <v:shape id="_x0000_s1053" type="#_x0000_t75" style="position:absolute;width:54864;height:50292;visibility:visible;mso-wrap-style:square" filled="t">
                   <v:fill o:detectmouseclick="t"/>
                   <v:path o:connecttype="none"/>
                 </v:shape>
@@ -16861,7 +17036,7 @@
                     </w:txbxContent>
                   </v:textbox>
                 </v:shape>
-                <v:shape id="Flowchart: Process 2029799233" o:spid="_x0000_s1056" type="#_x0000_t109" style="position:absolute;left:18478;top:22955;width:18098;height:11689;visibility:visible;mso-wrap-style:square;v-text-anchor:middle" o:gfxdata="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" filled="f" strokecolor="black [3213]" strokeweight="1pt">
+                <v:shape id="Flowchart: Process 2029799233" o:spid="_x0000_s1056" type="#_x0000_t109" style="position:absolute;left:18478;top:18067;width:18098;height:11689;visibility:visible;mso-wrap-style:square;v-text-anchor:middle" o:gfxdata="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" filled="f" strokecolor="black [3213]" strokeweight="1pt">
                   <v:textbox>
                     <w:txbxContent>
                       <w:p>
@@ -16890,7 +17065,7 @@
                     </w:txbxContent>
                   </v:textbox>
                 </v:shape>
-                <v:shape id="Flowchart: Terminator 1089017092" o:spid="_x0000_s1057" type="#_x0000_t116" style="position:absolute;left:23613;top:53625;width:8001;height:4382;visibility:visible;mso-wrap-style:square;v-text-anchor:middle" o:gfxdata="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" filled="f" strokecolor="black [3213]" strokeweight="1pt">
+                <v:shape id="Flowchart: Terminator 1089017092" o:spid="_x0000_s1057" type="#_x0000_t116" style="position:absolute;left:23613;top:43535;width:8001;height:4382;visibility:visible;mso-wrap-style:square;v-text-anchor:middle" o:gfxdata="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" filled="f" strokecolor="black [3213]" strokeweight="1pt">
                   <v:textbox>
                     <w:txbxContent>
                       <w:p>
@@ -16909,7 +17084,7 @@
                 <v:line id="Straight Connector 910192447" o:spid="_x0000_s1058" style="position:absolute;visibility:visible;mso-wrap-style:square" from="27527,5810" to="27527,7429" o:connectortype="straight" o:gfxdata="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" strokecolor="black [3200]" strokeweight=".5pt">
                   <v:stroke joinstyle="miter"/>
                 </v:line>
-                <v:line id="Straight Connector 324317965" o:spid="_x0000_s1059" style="position:absolute;visibility:visible;mso-wrap-style:square" from="27527,15525" to="27527,22955" o:connectortype="straight" o:gfxdata="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" strokecolor="black [3200]" strokeweight=".5pt">
+                <v:line id="Straight Connector 324317965" o:spid="_x0000_s1059" style="position:absolute;visibility:visible;mso-wrap-style:square" from="27527,15525" to="27527,18067" o:connectortype="straight" o:gfxdata="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" strokecolor="black [3200]" strokeweight=".5pt">
                   <v:stroke joinstyle="miter"/>
                 </v:line>
                 <v:shapetype id="_x0000_t34" coordsize="21600,21600" o:spt="34" o:oned="t" adj="10800" path="m,l@0,0@0,21600,21600,21600e" filled="f">
@@ -16923,12 +17098,12 @@
                   </v:handles>
                   <o:lock v:ext="edit" shapetype="t"/>
                 </v:shapetype>
-                <v:shape id="Connector: Elbow 589803083" o:spid="_x0000_s1060" type="#_x0000_t34" style="position:absolute;left:24670;top:37501;width:5755;height:42;rotation:90;flip:x;visibility:visible;mso-wrap-style:square" o:connectortype="elbow" o:gfxdata="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" strokecolor="black [3200]" strokeweight=".5pt"/>
+                <v:shape id="Connector: Elbow 589803083" o:spid="_x0000_s1060" type="#_x0000_t34" style="position:absolute;left:26090;top:31193;width:2918;height:43;rotation:90;flip:x;visibility:visible;mso-wrap-style:square" o:connectortype="elbow" o:gfxdata="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" strokecolor="black [3200]" strokeweight=".5pt"/>
                 <v:shapetype id="_x0000_t110" coordsize="21600,21600" o:spt="110" path="m10800,l,10800,10800,21600,21600,10800xe">
                   <v:stroke joinstyle="miter"/>
                   <v:path gradientshapeok="t" o:connecttype="rect" textboxrect="5400,5400,16200,16200"/>
                 </v:shapetype>
-                <v:shape id="Flowchart: Decision 2117165112" o:spid="_x0000_s1061" type="#_x0000_t110" style="position:absolute;left:15285;top:40399;width:24569;height:6356;visibility:visible;mso-wrap-style:square;v-text-anchor:middle" o:gfxdata="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" filled="f" strokecolor="black [3213]" strokeweight="1pt">
+                <v:shape id="Flowchart: Decision 2117165112" o:spid="_x0000_s1061" type="#_x0000_t110" style="position:absolute;left:15285;top:32674;width:24569;height:6356;visibility:visible;mso-wrap-style:square;v-text-anchor:middle" o:gfxdata="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" filled="f" strokecolor="black [3213]" strokeweight="1pt">
                   <v:textbox>
                     <w:txbxContent>
                       <w:p>
@@ -16952,13 +17127,13 @@
                     </w:txbxContent>
                   </v:textbox>
                 </v:shape>
-                <v:shape id="Connector: Elbow 93043286" o:spid="_x0000_s1062" type="#_x0000_t34" style="position:absolute;left:34194;top:11477;width:5660;height:32100;flip:x y;visibility:visible;mso-wrap-style:square" o:connectortype="elbow" o:gfxdata="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" adj="-52186" strokecolor="black [3213]" strokeweight=".5pt">
+                <v:shape id="Connector: Elbow 93043286" o:spid="_x0000_s1062" type="#_x0000_t34" style="position:absolute;left:34194;top:11477;width:5660;height:24375;flip:x y;visibility:visible;mso-wrap-style:square" o:connectortype="elbow" o:gfxdata="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" adj="-8725" strokecolor="black [3213]" strokeweight=".5pt">
                   <v:stroke endarrow="block"/>
                 </v:shape>
-                <v:line id="Straight Connector 367647539" o:spid="_x0000_s1063" style="position:absolute;visibility:visible;mso-wrap-style:square" from="27570,46755" to="27613,53625" o:connectortype="straight" o:gfxdata="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" strokecolor="black [3200]" strokeweight=".5pt">
+                <v:line id="Straight Connector 367647539" o:spid="_x0000_s1063" style="position:absolute;visibility:visible;mso-wrap-style:square" from="27570,39030" to="27613,43535" o:connectortype="straight" o:gfxdata="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" strokecolor="black [3200]" strokeweight=".5pt">
                   <v:stroke joinstyle="miter"/>
                 </v:line>
-                <v:shape id="Text Box 1" o:spid="_x0000_s1064" type="#_x0000_t202" style="position:absolute;left:27613;top:50117;width:4115;height:3153;visibility:visible;mso-wrap-style:none;v-text-anchor:top" o:gfxdata="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" filled="f" stroked="f" strokeweight=".5pt">
+                <v:shape id="Text Box 1" o:spid="_x0000_s1064" type="#_x0000_t202" style="position:absolute;left:27613;top:40027;width:4115;height:3153;visibility:visible;mso-wrap-style:none;v-text-anchor:top" o:gfxdata="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" filled="f" stroked="f" strokeweight=".5pt">
                   <v:textbox>
                     <w:txbxContent>
                       <w:p>
@@ -16981,7 +17156,7 @@
                     </w:txbxContent>
                   </v:textbox>
                 </v:shape>
-                <v:shape id="Text Box 1" o:spid="_x0000_s1065" type="#_x0000_t202" style="position:absolute;left:40592;top:40967;width:3759;height:2610;visibility:visible;mso-wrap-style:none;v-text-anchor:top" o:gfxdata="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" filled="f" stroked="f" strokeweight=".5pt">
+                <v:shape id="Text Box 1" o:spid="_x0000_s1065" type="#_x0000_t202" style="position:absolute;left:38227;top:31823;width:3760;height:2610;visibility:visible;mso-wrap-style:none;v-text-anchor:top" o:gfxdata="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" filled="f" stroked="f" strokeweight=".5pt">
                   <v:textbox>
                     <w:txbxContent>
                       <w:p>
@@ -17013,6 +17188,7 @@
         <w:ind w:left="0" w:right="-7" w:firstLine="0"/>
       </w:pPr>
       <w:r>
+        <w:lastRenderedPageBreak/>
         <w:tab/>
         <w:t xml:space="preserve">Figure 3.3.1 </w:t>
       </w:r>
@@ -17070,7 +17246,6 @@
           <w:b/>
           <w:bCs/>
         </w:rPr>
-        <w:lastRenderedPageBreak/>
         <w:t>Figure 3.3.2</w:t>
       </w:r>
     </w:p>
@@ -18228,7 +18403,7 @@
         <mc:AlternateContent>
           <mc:Choice Requires="wpc">
             <w:drawing>
-              <wp:inline distT="0" distB="0" distL="0" distR="0" wp14:anchorId="4A3A4B9D" wp14:editId="37ACB126">
+              <wp:inline distT="0" distB="0" distL="0" distR="0" wp14:anchorId="4A3A4B9D" wp14:editId="46B22E2B">
                 <wp:extent cx="5486400" cy="6019800"/>
                 <wp:effectExtent l="0" t="0" r="0" b="0"/>
                 <wp:docPr id="1726858256" name="Canvas 7"/>
@@ -18397,7 +18572,7 @@
                                 <w:jc w:val="center"/>
                               </w:pPr>
                               <w:r>
-                                <w:t>Finalize Flood</w:t>
+                                <w:t>Fuzzy Logic</w:t>
                               </w:r>
                             </w:p>
                             <w:p>
@@ -18480,66 +18655,11 @@
                         </wps:bodyPr>
                       </wps:wsp>
                       <wps:wsp>
-                        <wps:cNvPr id="1862350157" name="Flowchart: Process 1862350157"/>
-                        <wps:cNvSpPr/>
-                        <wps:spPr>
-                          <a:xfrm>
-                            <a:off x="566626" y="1029799"/>
-                            <a:ext cx="1657350" cy="809625"/>
-                          </a:xfrm>
-                          <a:prstGeom prst="flowChartProcess">
-                            <a:avLst/>
-                          </a:prstGeom>
-                          <a:noFill/>
-                          <a:ln>
-                            <a:solidFill>
-                              <a:schemeClr val="tx1"/>
-                            </a:solidFill>
-                          </a:ln>
-                        </wps:spPr>
-                        <wps:style>
-                          <a:lnRef idx="2">
-                            <a:schemeClr val="accent1">
-                              <a:shade val="15000"/>
-                            </a:schemeClr>
-                          </a:lnRef>
-                          <a:fillRef idx="1">
-                            <a:schemeClr val="accent1"/>
-                          </a:fillRef>
-                          <a:effectRef idx="0">
-                            <a:schemeClr val="accent1"/>
-                          </a:effectRef>
-                          <a:fontRef idx="minor">
-                            <a:schemeClr val="lt1"/>
-                          </a:fontRef>
-                        </wps:style>
-                        <wps:txbx>
-                          <w:txbxContent>
-                            <w:p>
-                              <w:pPr>
-                                <w:spacing w:after="0" w:line="480" w:lineRule="auto"/>
-                                <w:ind w:left="0"/>
-                                <w:jc w:val="center"/>
-                              </w:pPr>
-                              <w:r>
-                                <w:t>Fuzzy Logic</w:t>
-                              </w:r>
-                            </w:p>
-                          </w:txbxContent>
-                        </wps:txbx>
-                        <wps:bodyPr rot="0" spcFirstLastPara="0" vertOverflow="overflow" horzOverflow="overflow" vert="horz" wrap="square" lIns="91440" tIns="45720" rIns="91440" bIns="45720" numCol="1" spcCol="0" rtlCol="0" fromWordArt="0" anchor="ctr" anchorCtr="0" forceAA="0" compatLnSpc="1">
-                          <a:prstTxWarp prst="textNoShape">
-                            <a:avLst/>
-                          </a:prstTxWarp>
-                          <a:noAutofit/>
-                        </wps:bodyPr>
-                      </wps:wsp>
-                      <wps:wsp>
                         <wps:cNvPr id="1953539724" name="Flowchart: Process 1953539724"/>
                         <wps:cNvSpPr/>
                         <wps:spPr>
                           <a:xfrm>
-                            <a:off x="3292105" y="1029804"/>
+                            <a:off x="1900766" y="1029804"/>
                             <a:ext cx="1657350" cy="809625"/>
                           </a:xfrm>
                           <a:prstGeom prst="flowChartProcess">
@@ -18594,142 +18714,6 @@
                           </a:prstTxWarp>
                           <a:noAutofit/>
                         </wps:bodyPr>
-                      </wps:wsp>
-                      <wps:wsp>
-                        <wps:cNvPr id="824070427" name="Connector: Elbow 824070427"/>
-                        <wps:cNvCnPr>
-                          <a:stCxn id="143234660" idx="2"/>
-                          <a:endCxn id="1862350157" idx="0"/>
-                        </wps:cNvCnPr>
-                        <wps:spPr>
-                          <a:xfrm rot="5400000">
-                            <a:off x="1956501" y="253289"/>
-                            <a:ext cx="215311" cy="1337709"/>
-                          </a:xfrm>
-                          <a:prstGeom prst="bentConnector3">
-                            <a:avLst/>
-                          </a:prstGeom>
-                          <a:ln>
-                            <a:tailEnd type="triangle"/>
-                          </a:ln>
-                        </wps:spPr>
-                        <wps:style>
-                          <a:lnRef idx="1">
-                            <a:schemeClr val="dk1"/>
-                          </a:lnRef>
-                          <a:fillRef idx="0">
-                            <a:schemeClr val="dk1"/>
-                          </a:fillRef>
-                          <a:effectRef idx="0">
-                            <a:schemeClr val="dk1"/>
-                          </a:effectRef>
-                          <a:fontRef idx="minor">
-                            <a:schemeClr val="tx1"/>
-                          </a:fontRef>
-                        </wps:style>
-                        <wps:bodyPr/>
-                      </wps:wsp>
-                      <wps:wsp>
-                        <wps:cNvPr id="961735263" name="Connector: Elbow 961735263"/>
-                        <wps:cNvCnPr>
-                          <a:stCxn id="143234660" idx="2"/>
-                          <a:endCxn id="1953539724" idx="0"/>
-                        </wps:cNvCnPr>
-                        <wps:spPr>
-                          <a:xfrm rot="16200000" flipH="1">
-                            <a:off x="3319237" y="228261"/>
-                            <a:ext cx="215316" cy="1387770"/>
-                          </a:xfrm>
-                          <a:prstGeom prst="bentConnector3">
-                            <a:avLst/>
-                          </a:prstGeom>
-                          <a:ln>
-                            <a:tailEnd type="triangle"/>
-                          </a:ln>
-                        </wps:spPr>
-                        <wps:style>
-                          <a:lnRef idx="1">
-                            <a:schemeClr val="dk1"/>
-                          </a:lnRef>
-                          <a:fillRef idx="0">
-                            <a:schemeClr val="dk1"/>
-                          </a:fillRef>
-                          <a:effectRef idx="0">
-                            <a:schemeClr val="dk1"/>
-                          </a:effectRef>
-                          <a:fontRef idx="minor">
-                            <a:schemeClr val="tx1"/>
-                          </a:fontRef>
-                        </wps:style>
-                        <wps:bodyPr/>
-                      </wps:wsp>
-                      <wps:wsp>
-                        <wps:cNvPr id="564478958" name="Connector: Elbow 564478958"/>
-                        <wps:cNvCnPr>
-                          <a:stCxn id="1862350157" idx="2"/>
-                          <a:endCxn id="759500529" idx="0"/>
-                        </wps:cNvCnPr>
-                        <wps:spPr>
-                          <a:xfrm rot="16200000" flipH="1">
-                            <a:off x="1924983" y="1309741"/>
-                            <a:ext cx="278345" cy="1337709"/>
-                          </a:xfrm>
-                          <a:prstGeom prst="bentConnector3">
-                            <a:avLst/>
-                          </a:prstGeom>
-                          <a:ln>
-                            <a:tailEnd type="triangle"/>
-                          </a:ln>
-                        </wps:spPr>
-                        <wps:style>
-                          <a:lnRef idx="1">
-                            <a:schemeClr val="dk1"/>
-                          </a:lnRef>
-                          <a:fillRef idx="0">
-                            <a:schemeClr val="dk1"/>
-                          </a:fillRef>
-                          <a:effectRef idx="0">
-                            <a:schemeClr val="dk1"/>
-                          </a:effectRef>
-                          <a:fontRef idx="minor">
-                            <a:schemeClr val="tx1"/>
-                          </a:fontRef>
-                        </wps:style>
-                        <wps:bodyPr/>
-                      </wps:wsp>
-                      <wps:wsp>
-                        <wps:cNvPr id="10884428" name="Connector: Elbow 10884428"/>
-                        <wps:cNvCnPr>
-                          <a:stCxn id="1953539724" idx="2"/>
-                          <a:endCxn id="759500529" idx="0"/>
-                        </wps:cNvCnPr>
-                        <wps:spPr>
-                          <a:xfrm rot="5400000">
-                            <a:off x="3287725" y="1284714"/>
-                            <a:ext cx="278340" cy="1387770"/>
-                          </a:xfrm>
-                          <a:prstGeom prst="bentConnector3">
-                            <a:avLst/>
-                          </a:prstGeom>
-                          <a:ln>
-                            <a:tailEnd type="triangle"/>
-                          </a:ln>
-                        </wps:spPr>
-                        <wps:style>
-                          <a:lnRef idx="1">
-                            <a:schemeClr val="dk1"/>
-                          </a:lnRef>
-                          <a:fillRef idx="0">
-                            <a:schemeClr val="dk1"/>
-                          </a:fillRef>
-                          <a:effectRef idx="0">
-                            <a:schemeClr val="dk1"/>
-                          </a:effectRef>
-                          <a:fontRef idx="minor">
-                            <a:schemeClr val="tx1"/>
-                          </a:fontRef>
-                        </wps:style>
-                        <wps:bodyPr/>
                       </wps:wsp>
                       <wps:wsp>
                         <wps:cNvPr id="1320032657" name="Straight Connector 1320032657"/>
@@ -19240,6 +19224,80 @@
                         </wps:style>
                         <wps:bodyPr/>
                       </wps:wsp>
+                      <wps:wsp>
+                        <wps:cNvPr id="1905496244" name="Straight Arrow Connector 1905496244"/>
+                        <wps:cNvCnPr>
+                          <a:stCxn id="143234660" idx="2"/>
+                          <a:endCxn id="1953539724" idx="0"/>
+                        </wps:cNvCnPr>
+                        <wps:spPr>
+                          <a:xfrm flipH="1">
+                            <a:off x="2729441" y="814488"/>
+                            <a:ext cx="3569" cy="215316"/>
+                          </a:xfrm>
+                          <a:prstGeom prst="straightConnector1">
+                            <a:avLst/>
+                          </a:prstGeom>
+                          <a:ln>
+                            <a:solidFill>
+                              <a:schemeClr val="tx1"/>
+                            </a:solidFill>
+                            <a:tailEnd type="triangle"/>
+                          </a:ln>
+                        </wps:spPr>
+                        <wps:style>
+                          <a:lnRef idx="1">
+                            <a:schemeClr val="accent1"/>
+                          </a:lnRef>
+                          <a:fillRef idx="0">
+                            <a:schemeClr val="accent1"/>
+                          </a:fillRef>
+                          <a:effectRef idx="0">
+                            <a:schemeClr val="accent1"/>
+                          </a:effectRef>
+                          <a:fontRef idx="minor">
+                            <a:schemeClr val="tx1"/>
+                          </a:fontRef>
+                        </wps:style>
+                        <wps:bodyPr/>
+                      </wps:wsp>
+                      <wps:wsp>
+                        <wps:cNvPr id="526336336" name="Straight Arrow Connector 526336336"/>
+                        <wps:cNvCnPr>
+                          <a:stCxn id="1953539724" idx="2"/>
+                          <a:endCxn id="759500529" idx="0"/>
+                        </wps:cNvCnPr>
+                        <wps:spPr>
+                          <a:xfrm>
+                            <a:off x="2729441" y="1839429"/>
+                            <a:ext cx="3569" cy="278340"/>
+                          </a:xfrm>
+                          <a:prstGeom prst="straightConnector1">
+                            <a:avLst/>
+                          </a:prstGeom>
+                          <a:ln>
+                            <a:solidFill>
+                              <a:schemeClr val="tx1"/>
+                            </a:solidFill>
+                            <a:tailEnd type="triangle"/>
+                          </a:ln>
+                        </wps:spPr>
+                        <wps:style>
+                          <a:lnRef idx="1">
+                            <a:schemeClr val="accent1"/>
+                          </a:lnRef>
+                          <a:fillRef idx="0">
+                            <a:schemeClr val="accent1"/>
+                          </a:fillRef>
+                          <a:effectRef idx="0">
+                            <a:schemeClr val="accent1"/>
+                          </a:effectRef>
+                          <a:fontRef idx="minor">
+                            <a:schemeClr val="tx1"/>
+                          </a:fontRef>
+                        </wps:style>
+                        <wps:bodyPr/>
+                      </wps:wsp>
                     </wpc:wpc>
                   </a:graphicData>
                 </a:graphic>
@@ -19248,7 +19306,7 @@
           </mc:Choice>
           <mc:Fallback>
             <w:pict>
-              <v:group w14:anchorId="4A3A4B9D" id="_x0000_s1086" editas="canvas" style="width:6in;height:474pt;mso-position-horizontal-relative:char;mso-position-vertical-relative:line" coordsize="54864,60198" o:gfxdata="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">
+              <v:group w14:anchorId="4A3A4B9D" id="_x0000_s1086" editas="canvas" style="width:6in;height:474pt;mso-position-horizontal-relative:char;mso-position-vertical-relative:line" coordsize="54864,60198" o:gfxdata="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">
                 <v:shape id="_x0000_s1087" type="#_x0000_t75" style="position:absolute;width:54864;height:60198;visibility:visible;mso-wrap-style:square" filled="t">
                   <v:fill o:detectmouseclick="t"/>
                   <v:path o:connecttype="none"/>
@@ -19295,7 +19353,7 @@
                           <w:jc w:val="center"/>
                         </w:pPr>
                         <w:r>
-                          <w:t>Finalize Flood</w:t>
+                          <w:t>Fuzzy Logic</w:t>
                         </w:r>
                       </w:p>
                       <w:p>
@@ -19333,23 +19391,7 @@
                     </w:txbxContent>
                   </v:textbox>
                 </v:shape>
-                <v:shape id="Flowchart: Process 1862350157" o:spid="_x0000_s1092" type="#_x0000_t109" style="position:absolute;left:5666;top:10297;width:16573;height:8097;visibility:visible;mso-wrap-style:square;v-text-anchor:middle" o:gfxdata="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" filled="f" strokecolor="black [3213]" strokeweight="1pt">
-                  <v:textbox>
-                    <w:txbxContent>
-                      <w:p>
-                        <w:pPr>
-                          <w:spacing w:after="0" w:line="480" w:lineRule="auto"/>
-                          <w:ind w:left="0"/>
-                          <w:jc w:val="center"/>
-                        </w:pPr>
-                        <w:r>
-                          <w:t>Fuzzy Logic</w:t>
-                        </w:r>
-                      </w:p>
-                    </w:txbxContent>
-                  </v:textbox>
-                </v:shape>
-                <v:shape id="Flowchart: Process 1953539724" o:spid="_x0000_s1093" type="#_x0000_t109" style="position:absolute;left:32921;top:10298;width:16573;height:8096;visibility:visible;mso-wrap-style:square;v-text-anchor:middle" o:gfxdata="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" filled="f" strokecolor="black [3213]" strokeweight="1pt">
+                <v:shape id="Flowchart: Process 1953539724" o:spid="_x0000_s1092" type="#_x0000_t109" style="position:absolute;left:19007;top:10298;width:16574;height:8096;visibility:visible;mso-wrap-style:square;v-text-anchor:middle" o:gfxdata="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" filled="f" strokecolor="black [3213]" strokeweight="1pt">
                   <v:textbox>
                     <w:txbxContent>
                       <w:p>
@@ -19371,22 +19413,10 @@
                     </w:txbxContent>
                   </v:textbox>
                 </v:shape>
-                <v:shape id="Connector: Elbow 824070427" o:spid="_x0000_s1094" type="#_x0000_t34" style="position:absolute;left:19565;top:2532;width:2153;height:13377;rotation:90;visibility:visible;mso-wrap-style:square" o:connectortype="elbow" o:gfxdata="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" strokecolor="black [3200]" strokeweight=".5pt">
-                  <v:stroke endarrow="block"/>
-                </v:shape>
-                <v:shape id="Connector: Elbow 961735263" o:spid="_x0000_s1095" type="#_x0000_t34" style="position:absolute;left:33192;top:2282;width:2154;height:13877;rotation:90;flip:x;visibility:visible;mso-wrap-style:square" o:connectortype="elbow" o:gfxdata="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" strokecolor="black [3200]" strokeweight=".5pt">
-                  <v:stroke endarrow="block"/>
-                </v:shape>
-                <v:shape id="Connector: Elbow 564478958" o:spid="_x0000_s1096" type="#_x0000_t34" style="position:absolute;left:19250;top:13097;width:2783;height:13377;rotation:90;flip:x;visibility:visible;mso-wrap-style:square" o:connectortype="elbow" o:gfxdata="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" strokecolor="black [3200]" strokeweight=".5pt">
-                  <v:stroke endarrow="block"/>
-                </v:shape>
-                <v:shape id="Connector: Elbow 10884428" o:spid="_x0000_s1097" type="#_x0000_t34" style="position:absolute;left:32877;top:12847;width:2783;height:13877;rotation:90;visibility:visible;mso-wrap-style:square" o:connectortype="elbow" o:gfxdata="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" strokecolor="black [3200]" strokeweight=".5pt">
-                  <v:stroke endarrow="block"/>
-                </v:shape>
-                <v:line id="Straight Connector 1320032657" o:spid="_x0000_s1098" style="position:absolute;visibility:visible;mso-wrap-style:square" from="27330,28797" to="27359,31620" o:connectortype="straight" o:gfxdata="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" strokecolor="black [3200]" strokeweight=".5pt">
+                <v:line id="Straight Connector 1320032657" o:spid="_x0000_s1093" style="position:absolute;visibility:visible;mso-wrap-style:square" from="27330,28797" to="27359,31620" o:connectortype="straight" o:gfxdata="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" strokecolor="black [3200]" strokeweight=".5pt">
                   <v:stroke joinstyle="miter"/>
                 </v:line>
-                <v:shape id="Flowchart: Process 1308487819" o:spid="_x0000_s1099" type="#_x0000_t109" style="position:absolute;left:22066;top:37081;width:10586;height:2934;visibility:visible;mso-wrap-style:square;v-text-anchor:middle" o:gfxdata="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" filled="f" strokecolor="black [3213]" strokeweight="1pt">
+                <v:shape id="Flowchart: Process 1308487819" o:spid="_x0000_s1094" type="#_x0000_t109" style="position:absolute;left:22066;top:37081;width:10586;height:2934;visibility:visible;mso-wrap-style:square;v-text-anchor:middle" o:gfxdata="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" filled="f" strokecolor="black [3213]" strokeweight="1pt">
                   <v:textbox>
                     <w:txbxContent>
                       <w:p>
@@ -19402,10 +19432,10 @@
                     </w:txbxContent>
                   </v:textbox>
                 </v:shape>
-                <v:line id="Straight Connector 1834764270" o:spid="_x0000_s1100" style="position:absolute;visibility:visible;mso-wrap-style:square" from="27359,34555" to="27359,37081" o:connectortype="straight" o:gfxdata="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" strokecolor="black [3200]" strokeweight=".5pt">
+                <v:line id="Straight Connector 1834764270" o:spid="_x0000_s1095" style="position:absolute;visibility:visible;mso-wrap-style:square" from="27359,34555" to="27359,37081" o:connectortype="straight" o:gfxdata="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" strokecolor="black [3200]" strokeweight=".5pt">
                   <v:stroke joinstyle="miter"/>
                 </v:line>
-                <v:shape id="Flowchart: Decision 73363995" o:spid="_x0000_s1101" type="#_x0000_t110" style="position:absolute;left:15049;top:43080;width:24562;height:6350;visibility:visible;mso-wrap-style:square;v-text-anchor:middle" o:gfxdata="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" filled="f" strokecolor="black [3213]" strokeweight="1pt">
+                <v:shape id="Flowchart: Decision 73363995" o:spid="_x0000_s1096" type="#_x0000_t110" style="position:absolute;left:15049;top:43080;width:24562;height:6350;visibility:visible;mso-wrap-style:square;v-text-anchor:middle" o:gfxdata="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" filled="f" strokecolor="black [3213]" strokeweight="1pt">
                   <v:textbox>
                     <w:txbxContent>
                       <w:p>
@@ -19443,10 +19473,10 @@
                     </w:txbxContent>
                   </v:textbox>
                 </v:shape>
-                <v:line id="Straight Connector 1492689773" o:spid="_x0000_s1102" style="position:absolute;flip:x;visibility:visible;mso-wrap-style:square" from="27315,49430" to="27330,52885" o:connectortype="straight" o:gfxdata="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" strokecolor="black [3200]" strokeweight=".5pt">
+                <v:line id="Straight Connector 1492689773" o:spid="_x0000_s1097" style="position:absolute;flip:x;visibility:visible;mso-wrap-style:square" from="27315,49430" to="27330,52885" o:connectortype="straight" o:gfxdata="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" strokecolor="black [3200]" strokeweight=".5pt">
                   <v:stroke joinstyle="miter"/>
                 </v:line>
-                <v:shape id="Flowchart: Connector 81507161" o:spid="_x0000_s1103" type="#_x0000_t120" style="position:absolute;left:40417;top:51433;width:3905;height:3905;visibility:visible;mso-wrap-style:square;v-text-anchor:middle" o:gfxdata="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" filled="f" strokecolor="black [3213]" strokeweight="1pt">
+                <v:shape id="Flowchart: Connector 81507161" o:spid="_x0000_s1098" type="#_x0000_t120" style="position:absolute;left:40417;top:51433;width:3905;height:3905;visibility:visible;mso-wrap-style:square;v-text-anchor:middle" o:gfxdata="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" filled="f" strokecolor="black [3213]" strokeweight="1pt">
                   <v:stroke joinstyle="miter"/>
                   <v:textbox>
                     <w:txbxContent>
@@ -19462,8 +19492,8 @@
                     </w:txbxContent>
                   </v:textbox>
                 </v:shape>
-                <v:shape id="Connector: Elbow 1739413585" o:spid="_x0000_s1104" type="#_x0000_t33" style="position:absolute;left:38402;top:47464;width:5178;height:2759;rotation:90;flip:y;visibility:visible;mso-wrap-style:square" o:connectortype="elbow" o:gfxdata="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" strokecolor="black [3200]" strokeweight=".5pt"/>
-                <v:shape id="Text Box 1379124419" o:spid="_x0000_s1105" type="#_x0000_t202" style="position:absolute;left:28019;top:49581;width:4114;height:3944;visibility:visible;mso-wrap-style:none;v-text-anchor:top" o:gfxdata="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" filled="f" stroked="f" strokeweight=".5pt">
+                <v:shape id="Connector: Elbow 1739413585" o:spid="_x0000_s1099" type="#_x0000_t33" style="position:absolute;left:38402;top:47464;width:5178;height:2759;rotation:90;flip:y;visibility:visible;mso-wrap-style:square" o:connectortype="elbow" o:gfxdata="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" strokecolor="black [3200]" strokeweight=".5pt"/>
+                <v:shape id="Text Box 1379124419" o:spid="_x0000_s1100" type="#_x0000_t202" style="position:absolute;left:28019;top:49581;width:4114;height:3944;visibility:visible;mso-wrap-style:none;v-text-anchor:top" o:gfxdata="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" filled="f" stroked="f" strokeweight=".5pt">
                   <v:textbox>
                     <w:txbxContent>
                       <w:p>
@@ -19477,7 +19507,7 @@
                     </w:txbxContent>
                   </v:textbox>
                 </v:shape>
-                <v:shape id="Text Box 61098443" o:spid="_x0000_s1106" type="#_x0000_t202" style="position:absolute;left:42370;top:47558;width:3759;height:3327;visibility:visible;mso-wrap-style:none;v-text-anchor:top" o:gfxdata="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" filled="f" stroked="f" strokeweight=".5pt">
+                <v:shape id="Text Box 61098443" o:spid="_x0000_s1101" type="#_x0000_t202" style="position:absolute;left:42370;top:47558;width:3759;height:3327;visibility:visible;mso-wrap-style:none;v-text-anchor:top" o:gfxdata="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" filled="f" stroked="f" strokeweight=".5pt">
                   <v:textbox>
                     <w:txbxContent>
                       <w:p>
@@ -19491,10 +19521,10 @@
                     </w:txbxContent>
                   </v:textbox>
                 </v:shape>
-                <v:line id="Straight Connector 990678131" o:spid="_x0000_s1107" style="position:absolute;flip:x;visibility:visible;mso-wrap-style:square" from="27330,40015" to="27359,43080" o:connectortype="straight" o:gfxdata="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" strokecolor="black [3200]" strokeweight=".5pt">
+                <v:line id="Straight Connector 990678131" o:spid="_x0000_s1102" style="position:absolute;flip:x;visibility:visible;mso-wrap-style:square" from="27330,40015" to="27359,43080" o:connectortype="straight" o:gfxdata="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" strokecolor="black [3200]" strokeweight=".5pt">
                   <v:stroke joinstyle="miter"/>
                 </v:line>
-                <v:shape id="Flowchart: Process 400609831" o:spid="_x0000_s1108" type="#_x0000_t109" style="position:absolute;left:19138;top:31620;width:16443;height:2935;visibility:visible;mso-wrap-style:square;v-text-anchor:middle" o:gfxdata="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" filled="f" strokecolor="black [3213]" strokeweight="1pt">
+                <v:shape id="Flowchart: Process 400609831" o:spid="_x0000_s1103" type="#_x0000_t109" style="position:absolute;left:19138;top:31620;width:16443;height:2935;visibility:visible;mso-wrap-style:square;v-text-anchor:middle" o:gfxdata="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" filled="f" strokecolor="black [3213]" strokeweight="1pt">
                   <v:textbox>
                     <w:txbxContent>
                       <w:p>
@@ -19516,7 +19546,13 @@
                     </w:txbxContent>
                   </v:textbox>
                 </v:shape>
-                <v:shape id="Straight Arrow Connector 734710537" o:spid="_x0000_s1109" type="#_x0000_t32" style="position:absolute;left:12689;top:4082;width:6354;height:14;visibility:visible;mso-wrap-style:square" o:connectortype="straight" o:gfxdata="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" strokecolor="black [3213]" strokeweight=".5pt">
+                <v:shape id="Straight Arrow Connector 734710537" o:spid="_x0000_s1104" type="#_x0000_t32" style="position:absolute;left:12689;top:4082;width:6354;height:14;visibility:visible;mso-wrap-style:square" o:connectortype="straight" o:gfxdata="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" strokecolor="black [3213]" strokeweight=".5pt">
+                  <v:stroke endarrow="block" joinstyle="miter"/>
+                </v:shape>
+                <v:shape id="Straight Arrow Connector 1905496244" o:spid="_x0000_s1105" type="#_x0000_t32" style="position:absolute;left:27294;top:8144;width:36;height:2154;flip:x;visibility:visible;mso-wrap-style:square" o:connectortype="straight" o:gfxdata="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" strokecolor="black [3213]" strokeweight=".5pt">
+                  <v:stroke endarrow="block" joinstyle="miter"/>
+                </v:shape>
+                <v:shape id="Straight Arrow Connector 526336336" o:spid="_x0000_s1106" type="#_x0000_t32" style="position:absolute;left:27294;top:18394;width:36;height:2783;visibility:visible;mso-wrap-style:square" o:connectortype="straight" o:gfxdata="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" strokecolor="black [3213]" strokeweight=".5pt">
                   <v:stroke endarrow="block" joinstyle="miter"/>
                 </v:shape>
                 <w10:anchorlock/>
@@ -20208,7 +20244,31 @@
                                 <w:rPr>
                                   <w:lang w:val="en-PH"/>
                                 </w:rPr>
-                                <w:t>(192.168.x.x)</w:t>
+                                <w:t>(192.168.</w:t>
+                              </w:r>
+                              <w:r>
+                                <w:rPr>
+                                  <w:lang w:val="en-PH"/>
+                                </w:rPr>
+                                <w:t>5</w:t>
+                              </w:r>
+                              <w:r>
+                                <w:rPr>
+                                  <w:lang w:val="en-PH"/>
+                                </w:rPr>
+                                <w:t>.</w:t>
+                              </w:r>
+                              <w:r>
+                                <w:rPr>
+                                  <w:lang w:val="en-PH"/>
+                                </w:rPr>
+                                <w:t>50</w:t>
+                              </w:r>
+                              <w:r>
+                                <w:rPr>
+                                  <w:lang w:val="en-PH"/>
+                                </w:rPr>
+                                <w:t>)</w:t>
                               </w:r>
                             </w:p>
                           </w:txbxContent>
@@ -21205,12 +21265,12 @@
           </mc:Choice>
           <mc:Fallback>
             <w:pict>
-              <v:group w14:anchorId="07B20D88" id="_x0000_s1110" editas="canvas" style="width:6in;height:460.5pt;mso-position-horizontal-relative:char;mso-position-vertical-relative:line" coordsize="54864,58483" o:gfxdata="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">
-                <v:shape id="_x0000_s1111" type="#_x0000_t75" style="position:absolute;width:54864;height:58483;visibility:visible;mso-wrap-style:square" filled="t">
+              <v:group w14:anchorId="07B20D88" id="_x0000_s1107" editas="canvas" style="width:6in;height:460.5pt;mso-position-horizontal-relative:char;mso-position-vertical-relative:line" coordsize="54864,58483" o:gfxdata="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">
+                <v:shape id="_x0000_s1108" type="#_x0000_t75" style="position:absolute;width:54864;height:58483;visibility:visible;mso-wrap-style:square" filled="t">
                   <v:fill o:detectmouseclick="t"/>
                   <v:path o:connecttype="none"/>
                 </v:shape>
-                <v:shape id="Flowchart: Terminator 762051271" o:spid="_x0000_s1112" type="#_x0000_t116" style="position:absolute;left:1281;top:3243;width:8001;height:4382;visibility:visible;mso-wrap-style:square;v-text-anchor:middle" o:gfxdata="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" filled="f" strokecolor="black [3213]" strokeweight="1pt">
+                <v:shape id="Flowchart: Terminator 762051271" o:spid="_x0000_s1109" type="#_x0000_t116" style="position:absolute;left:1281;top:3243;width:8001;height:4382;visibility:visible;mso-wrap-style:square;v-text-anchor:middle" o:gfxdata="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" filled="f" strokecolor="black [3213]" strokeweight="1pt">
                   <v:textbox>
                     <w:txbxContent>
                       <w:p>
@@ -21226,7 +21286,7 @@
                     </w:txbxContent>
                   </v:textbox>
                 </v:shape>
-                <v:shape id="Flowchart: Process 1006783068" o:spid="_x0000_s1113" type="#_x0000_t109" style="position:absolute;left:18834;top:11621;width:13335;height:3177;visibility:visible;mso-wrap-style:square;v-text-anchor:middle" o:gfxdata="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" filled="f" strokecolor="black [3213]" strokeweight="1pt">
+                <v:shape id="Flowchart: Process 1006783068" o:spid="_x0000_s1110" type="#_x0000_t109" style="position:absolute;left:18834;top:11621;width:13335;height:3177;visibility:visible;mso-wrap-style:square;v-text-anchor:middle" o:gfxdata="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" filled="f" strokecolor="black [3213]" strokeweight="1pt">
                   <v:textbox>
                     <w:txbxContent>
                       <w:p>
@@ -21248,7 +21308,7 @@
                     </w:txbxContent>
                   </v:textbox>
                 </v:shape>
-                <v:shape id="Flowchart: Terminator 255287510" o:spid="_x0000_s1114" type="#_x0000_t116" style="position:absolute;left:18167;top:52732;width:8001;height:4381;visibility:visible;mso-wrap-style:square;v-text-anchor:middle" o:gfxdata="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" filled="f" strokecolor="black [3213]" strokeweight="1pt">
+                <v:shape id="Flowchart: Terminator 255287510" o:spid="_x0000_s1111" type="#_x0000_t116" style="position:absolute;left:18167;top:52732;width:8001;height:4381;visibility:visible;mso-wrap-style:square;v-text-anchor:middle" o:gfxdata="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" filled="f" strokecolor="black [3213]" strokeweight="1pt">
                   <v:textbox>
                     <w:txbxContent>
                       <w:p>
@@ -21264,8 +21324,8 @@
                     </w:txbxContent>
                   </v:textbox>
                 </v:shape>
-                <v:shape id="Connector: Elbow 894042335" o:spid="_x0000_s1115" type="#_x0000_t33" style="position:absolute;left:13309;top:11050;width:3365;height:7684;rotation:90;flip:x y;visibility:visible;mso-wrap-style:square" o:connectortype="elbow" o:gfxdata="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" strokecolor="black [3200]" strokeweight=".5pt"/>
-                <v:shape id="Flowchart: Decision 1857723641" o:spid="_x0000_s1116" type="#_x0000_t110" style="position:absolute;left:9913;top:42431;width:24568;height:6356;visibility:visible;mso-wrap-style:square;v-text-anchor:middle" o:gfxdata="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" filled="f" strokecolor="black [3213]" strokeweight="1pt">
+                <v:shape id="Connector: Elbow 894042335" o:spid="_x0000_s1112" type="#_x0000_t33" style="position:absolute;left:13309;top:11050;width:3365;height:7684;rotation:90;flip:x y;visibility:visible;mso-wrap-style:square" o:connectortype="elbow" o:gfxdata="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" strokecolor="black [3200]" strokeweight=".5pt"/>
+                <v:shape id="Flowchart: Decision 1857723641" o:spid="_x0000_s1113" type="#_x0000_t110" style="position:absolute;left:9913;top:42431;width:24568;height:6356;visibility:visible;mso-wrap-style:square;v-text-anchor:middle" o:gfxdata="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" filled="f" strokecolor="black [3213]" strokeweight="1pt">
                   <v:textbox>
                     <w:txbxContent>
                       <w:p>
@@ -21289,10 +21349,10 @@
                     </w:txbxContent>
                   </v:textbox>
                 </v:shape>
-                <v:line id="Straight Connector 1132188606" o:spid="_x0000_s1117" style="position:absolute;flip:x;visibility:visible;mso-wrap-style:square" from="22168,48787" to="22197,52732" o:connectortype="straight" o:gfxdata="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" strokecolor="black [3200]" strokeweight=".5pt">
+                <v:line id="Straight Connector 1132188606" o:spid="_x0000_s1114" style="position:absolute;flip:x;visibility:visible;mso-wrap-style:square" from="22168,48787" to="22197,52732" o:connectortype="straight" o:gfxdata="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" strokecolor="black [3200]" strokeweight=".5pt">
                   <v:stroke joinstyle="miter"/>
                 </v:line>
-                <v:shape id="Text Box 1" o:spid="_x0000_s1118" type="#_x0000_t202" style="position:absolute;left:21656;top:49436;width:4114;height:3153;visibility:visible;mso-wrap-style:none;v-text-anchor:top" o:gfxdata="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" filled="f" stroked="f" strokeweight=".5pt">
+                <v:shape id="Text Box 1" o:spid="_x0000_s1115" type="#_x0000_t202" style="position:absolute;left:21656;top:49436;width:4114;height:3153;visibility:visible;mso-wrap-style:none;v-text-anchor:top" o:gfxdata="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" filled="f" stroked="f" strokeweight=".5pt">
                   <v:textbox>
                     <w:txbxContent>
                       <w:p>
@@ -21315,7 +21375,7 @@
                     </w:txbxContent>
                   </v:textbox>
                 </v:shape>
-                <v:shape id="Text Box 1" o:spid="_x0000_s1119" type="#_x0000_t202" style="position:absolute;left:34694;top:42143;width:3759;height:2610;visibility:visible;mso-wrap-style:none;v-text-anchor:top" o:gfxdata="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" filled="f" stroked="f" strokeweight=".5pt">
+                <v:shape id="Text Box 1" o:spid="_x0000_s1116" type="#_x0000_t202" style="position:absolute;left:34694;top:42143;width:3759;height:2610;visibility:visible;mso-wrap-style:none;v-text-anchor:top" o:gfxdata="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" filled="f" stroked="f" strokeweight=".5pt">
                   <v:textbox>
                     <w:txbxContent>
                       <w:p>
@@ -21334,14 +21394,14 @@
                     </w:txbxContent>
                   </v:textbox>
                 </v:shape>
-                <v:line id="Straight Connector 168799678" o:spid="_x0000_s1120" style="position:absolute;visibility:visible;mso-wrap-style:square" from="9282,5434" to="12477,5457" o:connectortype="straight" o:gfxdata="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" strokecolor="black [3200]" strokeweight=".5pt">
+                <v:line id="Straight Connector 168799678" o:spid="_x0000_s1117" style="position:absolute;visibility:visible;mso-wrap-style:square" from="9282,5434" to="12477,5457" o:connectortype="straight" o:gfxdata="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" strokecolor="black [3200]" strokeweight=".5pt">
                   <v:stroke joinstyle="miter"/>
                 </v:line>
                 <v:shapetype id="_x0000_t134" coordsize="21600,21600" o:spt="134" path="m17955,v862,282,1877,1410,2477,3045c21035,5357,21372,7895,21597,10827v-225,2763,-562,5300,-1165,7613c19832,20132,18817,21260,17955,21597r-14388,l,10827,3567,xe">
                   <v:stroke joinstyle="miter"/>
                   <v:path o:connecttype="rect" textboxrect="3567,0,17955,21600"/>
                 </v:shapetype>
-                <v:shape id="Flowchart: Display 704891922" o:spid="_x0000_s1121" type="#_x0000_t134" style="position:absolute;left:36327;top:11429;width:18537;height:3505;visibility:visible;mso-wrap-style:square;v-text-anchor:middle" o:gfxdata="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" filled="f" strokecolor="black [3213]" strokeweight="1pt">
+                <v:shape id="Flowchart: Display 704891922" o:spid="_x0000_s1118" type="#_x0000_t134" style="position:absolute;left:36327;top:11429;width:18537;height:3505;visibility:visible;mso-wrap-style:square;v-text-anchor:middle" o:gfxdata="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" filled="f" strokecolor="black [3213]" strokeweight="1pt">
                   <v:textbox>
                     <w:txbxContent>
                       <w:p>
@@ -21364,7 +21424,7 @@
                     </w:txbxContent>
                   </v:textbox>
                 </v:shape>
-                <v:shape id="Flowchart: Process 1985376585" o:spid="_x0000_s1122" type="#_x0000_t109" style="position:absolute;left:12477;top:1961;width:29580;height:6992;visibility:visible;mso-wrap-style:square;v-text-anchor:middle" o:gfxdata="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" filled="f" strokecolor="black [3213]" strokeweight="1pt">
+                <v:shape id="Flowchart: Process 1985376585" o:spid="_x0000_s1119" type="#_x0000_t109" style="position:absolute;left:12477;top:1961;width:29580;height:6992;visibility:visible;mso-wrap-style:square;v-text-anchor:middle" o:gfxdata="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" filled="f" strokecolor="black [3213]" strokeweight="1pt">
                   <v:textbox>
                     <w:txbxContent>
                       <w:p>
@@ -21408,13 +21468,37 @@
                           <w:rPr>
                             <w:lang w:val="en-PH"/>
                           </w:rPr>
-                          <w:t>(192.168.x.x)</w:t>
+                          <w:t>(192.168.</w:t>
+                        </w:r>
+                        <w:r>
+                          <w:rPr>
+                            <w:lang w:val="en-PH"/>
+                          </w:rPr>
+                          <w:t>5</w:t>
+                        </w:r>
+                        <w:r>
+                          <w:rPr>
+                            <w:lang w:val="en-PH"/>
+                          </w:rPr>
+                          <w:t>.</w:t>
+                        </w:r>
+                        <w:r>
+                          <w:rPr>
+                            <w:lang w:val="en-PH"/>
+                          </w:rPr>
+                          <w:t>50</w:t>
+                        </w:r>
+                        <w:r>
+                          <w:rPr>
+                            <w:lang w:val="en-PH"/>
+                          </w:rPr>
+                          <w:t>)</w:t>
                         </w:r>
                       </w:p>
                     </w:txbxContent>
                   </v:textbox>
                 </v:shape>
-                <v:shape id="Flowchart: Display 1116864356" o:spid="_x0000_s1123" type="#_x0000_t134" style="position:absolute;top:16574;width:22301;height:3495;visibility:visible;mso-wrap-style:square;v-text-anchor:middle" o:gfxdata="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" filled="f" strokecolor="black [3213]" strokeweight="1pt">
+                <v:shape id="Flowchart: Display 1116864356" o:spid="_x0000_s1120" type="#_x0000_t134" style="position:absolute;top:16574;width:22301;height:3495;visibility:visible;mso-wrap-style:square;v-text-anchor:middle" o:gfxdata="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" filled="f" strokecolor="black [3213]" strokeweight="1pt">
                   <v:textbox>
                     <w:txbxContent>
                       <w:p>
@@ -21456,7 +21540,7 @@
                     </w:txbxContent>
                   </v:textbox>
                 </v:shape>
-                <v:shape id="Flowchart: Display 409860694" o:spid="_x0000_s1124" type="#_x0000_t134" style="position:absolute;left:3918;top:26076;width:14821;height:3506;visibility:visible;mso-wrap-style:square;v-text-anchor:middle" o:gfxdata="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" filled="f" strokecolor="black [3213]" strokeweight="1pt">
+                <v:shape id="Flowchart: Display 409860694" o:spid="_x0000_s1121" type="#_x0000_t134" style="position:absolute;left:3918;top:26076;width:14821;height:3506;visibility:visible;mso-wrap-style:square;v-text-anchor:middle" o:gfxdata="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" filled="f" strokecolor="black [3213]" strokeweight="1pt">
                   <v:textbox>
                     <w:txbxContent>
                       <w:p>
@@ -21479,16 +21563,16 @@
                     </w:txbxContent>
                   </v:textbox>
                 </v:shape>
-                <v:shape id="Connector: Elbow 2083986125" o:spid="_x0000_s1125" type="#_x0000_t33" style="position:absolute;left:40840;top:6674;width:5972;height:3538;rotation:90;flip:y;visibility:visible;mso-wrap-style:square" o:connectortype="elbow" o:gfxdata="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" strokecolor="black [3200]" strokeweight=".5pt"/>
-                <v:line id="Straight Connector 398664409" o:spid="_x0000_s1126" style="position:absolute;visibility:visible;mso-wrap-style:square" from="45980,20323" to="45980,25499" o:connectortype="straight" o:gfxdata="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" strokecolor="black [3200]" strokeweight=".5pt">
+                <v:shape id="Connector: Elbow 2083986125" o:spid="_x0000_s1122" type="#_x0000_t33" style="position:absolute;left:40840;top:6674;width:5972;height:3538;rotation:90;flip:y;visibility:visible;mso-wrap-style:square" o:connectortype="elbow" o:gfxdata="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" strokecolor="black [3200]" strokeweight=".5pt"/>
+                <v:line id="Straight Connector 398664409" o:spid="_x0000_s1123" style="position:absolute;visibility:visible;mso-wrap-style:square" from="45980,20323" to="45980,25499" o:connectortype="straight" o:gfxdata="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" strokecolor="black [3200]" strokeweight=".5pt">
                   <v:stroke joinstyle="miter"/>
                 </v:line>
-                <v:shape id="Connector: Elbow 769591163" o:spid="_x0000_s1127" type="#_x0000_t33" style="position:absolute;left:13362;top:20603;width:3437;height:7506;rotation:90;flip:x y;visibility:visible;mso-wrap-style:square" o:connectortype="elbow" o:gfxdata="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" strokecolor="black [3200]" strokeweight=".5pt"/>
-                <v:shape id="Connector: Elbow 343723305" o:spid="_x0000_s1128" type="#_x0000_t34" style="position:absolute;left:32169;top:13180;width:4158;height:9457;flip:y;visibility:visible;mso-wrap-style:square" o:connectortype="elbow" o:gfxdata="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" strokecolor="black [3200]" strokeweight=".5pt"/>
-                <v:line id="Straight Connector 1487122689" o:spid="_x0000_s1129" style="position:absolute;flip:y;visibility:visible;mso-wrap-style:square" from="32169,13181" to="36327,13209" o:connectortype="straight" o:gfxdata="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" strokecolor="black [3200]" strokeweight=".5pt">
+                <v:shape id="Connector: Elbow 769591163" o:spid="_x0000_s1124" type="#_x0000_t33" style="position:absolute;left:13362;top:20603;width:3437;height:7506;rotation:90;flip:x y;visibility:visible;mso-wrap-style:square" o:connectortype="elbow" o:gfxdata="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" strokecolor="black [3200]" strokeweight=".5pt"/>
+                <v:shape id="Connector: Elbow 343723305" o:spid="_x0000_s1125" type="#_x0000_t34" style="position:absolute;left:32169;top:13180;width:4158;height:9457;flip:y;visibility:visible;mso-wrap-style:square" o:connectortype="elbow" o:gfxdata="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" strokecolor="black [3200]" strokeweight=".5pt"/>
+                <v:line id="Straight Connector 1487122689" o:spid="_x0000_s1126" style="position:absolute;flip:y;visibility:visible;mso-wrap-style:square" from="32169,13181" to="36327,13209" o:connectortype="straight" o:gfxdata="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" strokecolor="black [3200]" strokeweight=".5pt">
                   <v:stroke joinstyle="miter"/>
                 </v:line>
-                <v:shape id="Flowchart: Process 733643495" o:spid="_x0000_s1130" type="#_x0000_t109" style="position:absolute;left:18834;top:21050;width:13335;height:3178;visibility:visible;mso-wrap-style:square;v-text-anchor:middle" o:gfxdata="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" filled="f" strokecolor="black [3213]" strokeweight="1pt">
+                <v:shape id="Flowchart: Process 733643495" o:spid="_x0000_s1127" type="#_x0000_t109" style="position:absolute;left:18834;top:21050;width:13335;height:3178;visibility:visible;mso-wrap-style:square;v-text-anchor:middle" o:gfxdata="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" filled="f" strokecolor="black [3213]" strokeweight="1pt">
                   <v:textbox>
                     <w:txbxContent>
                       <w:p>
@@ -21510,7 +21594,7 @@
                     </w:txbxContent>
                   </v:textbox>
                 </v:shape>
-                <v:shape id="Flowchart: Process 748922605" o:spid="_x0000_s1131" type="#_x0000_t109" style="position:absolute;left:18834;top:30587;width:13335;height:3178;visibility:visible;mso-wrap-style:square;v-text-anchor:middle" o:gfxdata="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" filled="f" strokecolor="black [3213]" strokeweight="1pt">
+                <v:shape id="Flowchart: Process 748922605" o:spid="_x0000_s1128" type="#_x0000_t109" style="position:absolute;left:18834;top:30587;width:13335;height:3178;visibility:visible;mso-wrap-style:square;v-text-anchor:middle" o:gfxdata="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" filled="f" strokecolor="black [3213]" strokeweight="1pt">
                   <v:textbox>
                     <w:txbxContent>
                       <w:p>
@@ -21532,8 +21616,8 @@
                     </w:txbxContent>
                   </v:textbox>
                 </v:shape>
-                <v:shape id="Connector: Elbow 862710476" o:spid="_x0000_s1132" type="#_x0000_t34" style="position:absolute;left:32169;top:13180;width:4158;height:18993;flip:y;visibility:visible;mso-wrap-style:square" o:connectortype="elbow" o:gfxdata="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" strokecolor="black [3200]" strokeweight=".5pt"/>
-                <v:shape id="Flowchart: Display 1119537900" o:spid="_x0000_s1133" type="#_x0000_t134" style="position:absolute;left:3226;top:34128;width:16205;height:3505;visibility:visible;mso-wrap-style:square;v-text-anchor:middle" o:gfxdata="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" filled="f" strokecolor="black [3213]" strokeweight="1pt">
+                <v:shape id="Connector: Elbow 862710476" o:spid="_x0000_s1129" type="#_x0000_t34" style="position:absolute;left:32169;top:13180;width:4158;height:18993;flip:y;visibility:visible;mso-wrap-style:square" o:connectortype="elbow" o:gfxdata="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" strokecolor="black [3200]" strokeweight=".5pt"/>
+                <v:shape id="Flowchart: Display 1119537900" o:spid="_x0000_s1130" type="#_x0000_t134" style="position:absolute;left:3226;top:34128;width:16205;height:3505;visibility:visible;mso-wrap-style:square;v-text-anchor:middle" o:gfxdata="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" filled="f" strokecolor="black [3213]" strokeweight="1pt">
                   <v:textbox>
                     <w:txbxContent>
                       <w:p>
@@ -21556,8 +21640,8 @@
                     </w:txbxContent>
                   </v:textbox>
                 </v:shape>
-                <v:shape id="Connector: Elbow 250575255" o:spid="_x0000_s1134" type="#_x0000_t33" style="position:absolute;left:14105;top:29396;width:1952;height:7506;rotation:90;flip:x y;visibility:visible;mso-wrap-style:square" o:connectortype="elbow" o:gfxdata="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" strokecolor="black [3200]" strokeweight=".5pt"/>
-                <v:shape id="Flowchart: Process 1125297172" o:spid="_x0000_s1135" type="#_x0000_t109" style="position:absolute;left:39313;top:17145;width:13335;height:3178;visibility:visible;mso-wrap-style:square;v-text-anchor:middle" o:gfxdata="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" filled="f" strokecolor="black [3213]" strokeweight="1pt">
+                <v:shape id="Connector: Elbow 250575255" o:spid="_x0000_s1131" type="#_x0000_t33" style="position:absolute;left:14105;top:29396;width:1952;height:7506;rotation:90;flip:x y;visibility:visible;mso-wrap-style:square" o:connectortype="elbow" o:gfxdata="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" strokecolor="black [3200]" strokeweight=".5pt"/>
+                <v:shape id="Flowchart: Process 1125297172" o:spid="_x0000_s1132" type="#_x0000_t109" style="position:absolute;left:39313;top:17145;width:13335;height:3178;visibility:visible;mso-wrap-style:square;v-text-anchor:middle" o:gfxdata="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" filled="f" strokecolor="black [3213]" strokeweight="1pt">
                   <v:textbox>
                     <w:txbxContent>
                       <w:p>
@@ -21579,8 +21663,8 @@
                     </w:txbxContent>
                   </v:textbox>
                 </v:shape>
-                <v:shape id="Connector: Elbow 882766774" o:spid="_x0000_s1136" type="#_x0000_t34" style="position:absolute;left:36327;top:13181;width:2986;height:5553;rotation:180;visibility:visible;mso-wrap-style:square" o:connectortype="elbow" o:gfxdata="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" adj="36072" strokecolor="black [3200]" strokeweight=".5pt"/>
-                <v:shape id="Flowchart: Process 584233019" o:spid="_x0000_s1137" type="#_x0000_t109" style="position:absolute;left:39313;top:25499;width:13335;height:3177;visibility:visible;mso-wrap-style:square;v-text-anchor:middle" o:gfxdata="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" filled="f" strokecolor="black [3213]" strokeweight="1pt">
+                <v:shape id="Connector: Elbow 882766774" o:spid="_x0000_s1133" type="#_x0000_t34" style="position:absolute;left:36327;top:13181;width:2986;height:5553;rotation:180;visibility:visible;mso-wrap-style:square" o:connectortype="elbow" o:gfxdata="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" adj="36072" strokecolor="black [3200]" strokeweight=".5pt"/>
+                <v:shape id="Flowchart: Process 584233019" o:spid="_x0000_s1134" type="#_x0000_t109" style="position:absolute;left:39313;top:25499;width:13335;height:3177;visibility:visible;mso-wrap-style:square;v-text-anchor:middle" o:gfxdata="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" filled="f" strokecolor="black [3213]" strokeweight="1pt">
                   <v:textbox>
                     <w:txbxContent>
                       <w:p>
@@ -21602,8 +21686,8 @@
                     </w:txbxContent>
                   </v:textbox>
                 </v:shape>
-                <v:shape id="Connector: Elbow 290614937" o:spid="_x0000_s1138" type="#_x0000_t34" style="position:absolute;left:3918;top:27829;width:5995;height:17780;rotation:180;visibility:visible;mso-wrap-style:square" o:connectortype="elbow" o:gfxdata="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" adj="29835" strokecolor="black [3200]" strokeweight=".5pt"/>
-                <v:shape id="Connector: Elbow 1326381183" o:spid="_x0000_s1139" type="#_x0000_t34" style="position:absolute;left:3226;top:35881;width:6687;height:9728;rotation:180;visibility:visible;mso-wrap-style:square" o:connectortype="elbow" o:gfxdata="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" adj="26830" strokecolor="black [3200]" strokeweight=".5pt"/>
+                <v:shape id="Connector: Elbow 290614937" o:spid="_x0000_s1135" type="#_x0000_t34" style="position:absolute;left:3918;top:27829;width:5995;height:17780;rotation:180;visibility:visible;mso-wrap-style:square" o:connectortype="elbow" o:gfxdata="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" adj="29835" strokecolor="black [3200]" strokeweight=".5pt"/>
+                <v:shape id="Connector: Elbow 1326381183" o:spid="_x0000_s1136" type="#_x0000_t34" style="position:absolute;left:3226;top:35881;width:6687;height:9728;rotation:180;visibility:visible;mso-wrap-style:square" o:connectortype="elbow" o:gfxdata="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" adj="26830" strokecolor="black [3200]" strokeweight=".5pt"/>
                 <v:shapetype id="_x0000_t35" coordsize="21600,21600" o:spt="35" o:oned="t" adj="10800,10800" path="m,l@0,0@0@1,21600@1,21600,21600e" filled="f">
                   <v:stroke joinstyle="miter"/>
                   <v:formulas>
@@ -21619,13 +21703,13 @@
                   </v:handles>
                   <o:lock v:ext="edit" shapetype="t"/>
                 </v:shapetype>
-                <v:shape id="Connector: Elbow 248718269" o:spid="_x0000_s1140" type="#_x0000_t35" style="position:absolute;left:-2238;top:32218;width:25539;height:1237;rotation:90;visibility:visible;mso-wrap-style:square" o:connectortype="elbow" o:gfxdata="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" adj="1158,166285" strokecolor="black [3213]" strokeweight=".5pt">
+                <v:shape id="Connector: Elbow 248718269" o:spid="_x0000_s1137" type="#_x0000_t35" style="position:absolute;left:-2238;top:32218;width:25539;height:1237;rotation:90;visibility:visible;mso-wrap-style:square" o:connectortype="elbow" o:gfxdata="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" adj="1158,166285" strokecolor="black [3213]" strokeweight=".5pt">
                   <v:stroke endarrow="block"/>
                 </v:shape>
-                <v:shape id="Connector: Elbow 2868127" o:spid="_x0000_s1141" type="#_x0000_t33" style="position:absolute;left:22197;top:36348;width:18139;height:6083;rotation:180;flip:y;visibility:visible;mso-wrap-style:square" o:connectortype="elbow" o:gfxdata="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" strokecolor="black [3213]" strokeweight=".5pt">
+                <v:shape id="Connector: Elbow 2868127" o:spid="_x0000_s1138" type="#_x0000_t33" style="position:absolute;left:22197;top:36348;width:18139;height:6083;rotation:180;flip:y;visibility:visible;mso-wrap-style:square" o:connectortype="elbow" o:gfxdata="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" strokecolor="black [3213]" strokeweight=".5pt">
                   <v:stroke endarrow="block"/>
                 </v:shape>
-                <v:shape id="Flowchart: Process 237691898" o:spid="_x0000_s1142" type="#_x0000_t109" style="position:absolute;left:40336;top:34759;width:11360;height:3178;visibility:visible;mso-wrap-style:square;v-text-anchor:middle" o:gfxdata="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" filled="f" strokecolor="black [3213]" strokeweight="1pt">
+                <v:shape id="Flowchart: Process 237691898" o:spid="_x0000_s1139" type="#_x0000_t109" style="position:absolute;left:40336;top:34759;width:11360;height:3178;visibility:visible;mso-wrap-style:square;v-text-anchor:middle" o:gfxdata="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" filled="f" strokecolor="black [3213]" strokeweight="1pt">
                   <v:textbox>
                     <w:txbxContent>
                       <w:p>
@@ -21647,10 +21731,10 @@
                     </w:txbxContent>
                   </v:textbox>
                 </v:shape>
-                <v:line id="Straight Connector 500177959" o:spid="_x0000_s1143" style="position:absolute;visibility:visible;mso-wrap-style:square" from="45980,28676" to="46016,34759" o:connectortype="straight" o:gfxdata="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" strokecolor="black [3200]" strokeweight=".5pt">
+                <v:line id="Straight Connector 500177959" o:spid="_x0000_s1140" style="position:absolute;visibility:visible;mso-wrap-style:square" from="45980,28676" to="46016,34759" o:connectortype="straight" o:gfxdata="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" strokecolor="black [3200]" strokeweight=".5pt">
                   <v:stroke joinstyle="miter"/>
                 </v:line>
-                <v:shape id="Connector: Elbow 646056073" o:spid="_x0000_s1144" type="#_x0000_t34" style="position:absolute;left:34481;top:13181;width:20383;height:32428;flip:y;visibility:visible;mso-wrap-style:square" o:connectortype="elbow" o:gfxdata="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" adj="24023" strokecolor="black [3213]" strokeweight=".5pt">
+                <v:shape id="Connector: Elbow 646056073" o:spid="_x0000_s1141" type="#_x0000_t34" style="position:absolute;left:34481;top:13181;width:20383;height:32428;flip:y;visibility:visible;mso-wrap-style:square" o:connectortype="elbow" o:gfxdata="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" adj="24023" strokecolor="black [3213]" strokeweight=".5pt">
                   <v:stroke endarrow="block"/>
                 </v:shape>
                 <w10:anchorlock/>
@@ -22588,35 +22672,6 @@
         <w:rPr>
           <w:lang w:val="en-PH"/>
         </w:rPr>
-        <w:t xml:space="preserve">Because Brgy. Elvita had no operational colored-post or automated threshold-based warning system during the </w:t>
-      </w:r>
-      <w:proofErr w:type="gramStart"/>
-      <w:r>
-        <w:rPr>
-          <w:lang w:val="en-PH"/>
-        </w:rPr>
-        <w:t>study,</w:t>
-      </w:r>
-      <w:proofErr w:type="gramEnd"/>
-      <w:r>
-        <w:rPr>
-          <w:lang w:val="en-PH"/>
-        </w:rPr>
-        <w:t xml:space="preserve"> the field observation form and manual water-level readings were used to establish the observed flood-risk condition. These records served as the reference data for evaluating whether the FLAIRE classification matched the actual hydrological condition observed during the test.</w:t>
-      </w:r>
-    </w:p>
-    <w:p>
-      <w:pPr>
-        <w:spacing w:after="0" w:line="480" w:lineRule="auto"/>
-        <w:ind w:left="0" w:firstLine="720"/>
-        <w:rPr>
-          <w:lang w:val="en-PH"/>
-        </w:rPr>
-      </w:pPr>
-      <w:r>
-        <w:rPr>
-          <w:lang w:val="en-PH"/>
-        </w:rPr>
         <w:t>User acceptability was assessed using a structured survey questionnaire based on the Technology Acceptance Model (TAM). The instrument measured the respondents’ perceptions of FLAIRE in terms of:</w:t>
       </w:r>
     </w:p>
@@ -22752,14 +22807,7 @@
         <w:rPr>
           <w:lang w:val="en-PH"/>
         </w:rPr>
-        <w:t xml:space="preserve">The survey instrument was reviewed and validated by subject-matter experts to ensure that the items were clear, relevant, and aligned with the study objectives. It was also </w:t>
-      </w:r>
-      <w:r>
-        <w:rPr>
-          <w:lang w:val="en-PH"/>
-        </w:rPr>
-        <w:lastRenderedPageBreak/>
-        <w:t>pilot-tested before formal administration to identify unclear wording, technical terms, or response-format issues.</w:t>
+        <w:t>The survey instrument was reviewed and validated by subject-matter experts to ensure that the items were clear, relevant, and aligned with the study objectives. It was also pilot-tested before formal administration to identify unclear wording, technical terms, or response-format issues.</w:t>
       </w:r>
     </w:p>
     <w:p>
@@ -22775,6 +22823,7 @@
       </w:pPr>
       <w:bookmarkStart w:id="24" w:name="_Toc223690217"/>
       <w:r>
+        <w:lastRenderedPageBreak/>
         <w:t>Gantt Chart</w:t>
       </w:r>
       <w:bookmarkEnd w:id="24"/>
@@ -22832,12 +22881,12 @@
       <w:tblPr>
         <w:tblStyle w:val="TableGrid"/>
         <w:tblpPr w:leftFromText="180" w:rightFromText="180" w:vertAnchor="text" w:horzAnchor="margin" w:tblpXSpec="center" w:tblpYSpec="bottom"/>
-        <w:tblW w:w="8152" w:type="dxa"/>
+        <w:tblW w:w="8724" w:type="dxa"/>
         <w:tblLayout w:type="fixed"/>
         <w:tblLook w:val="04A0" w:firstRow="1" w:lastRow="0" w:firstColumn="1" w:lastColumn="0" w:noHBand="0" w:noVBand="1"/>
       </w:tblPr>
       <w:tblGrid>
-        <w:gridCol w:w="2552"/>
+        <w:gridCol w:w="1564"/>
         <w:gridCol w:w="709"/>
         <w:gridCol w:w="709"/>
         <w:gridCol w:w="708"/>
@@ -22846,6 +22895,8 @@
         <w:gridCol w:w="709"/>
         <w:gridCol w:w="567"/>
         <w:gridCol w:w="780"/>
+        <w:gridCol w:w="780"/>
+        <w:gridCol w:w="780"/>
       </w:tblGrid>
       <w:tr>
         <w:trPr>
@@ -22853,7 +22904,7 @@
         </w:trPr>
         <w:tc>
           <w:tcPr>
-            <w:tcW w:w="2552" w:type="dxa"/>
+            <w:tcW w:w="1564" w:type="dxa"/>
           </w:tcPr>
           <w:p>
             <w:pPr>
@@ -23062,6 +23113,54 @@
                 <w:szCs w:val="24"/>
               </w:rPr>
               <w:t>Aug</w:t>
+            </w:r>
+          </w:p>
+        </w:tc>
+        <w:tc>
+          <w:tcPr>
+            <w:tcW w:w="780" w:type="dxa"/>
+          </w:tcPr>
+          <w:p>
+            <w:pPr>
+              <w:spacing w:after="0" w:line="480" w:lineRule="auto"/>
+              <w:ind w:left="0" w:firstLine="0"/>
+              <w:rPr>
+                <w:b/>
+                <w:bCs/>
+                <w:szCs w:val="24"/>
+              </w:rPr>
+            </w:pPr>
+            <w:r>
+              <w:rPr>
+                <w:b/>
+                <w:bCs/>
+                <w:szCs w:val="24"/>
+              </w:rPr>
+              <w:t>Sep</w:t>
+            </w:r>
+          </w:p>
+        </w:tc>
+        <w:tc>
+          <w:tcPr>
+            <w:tcW w:w="780" w:type="dxa"/>
+          </w:tcPr>
+          <w:p>
+            <w:pPr>
+              <w:spacing w:after="0" w:line="480" w:lineRule="auto"/>
+              <w:ind w:left="0" w:firstLine="0"/>
+              <w:rPr>
+                <w:b/>
+                <w:bCs/>
+                <w:szCs w:val="24"/>
+              </w:rPr>
+            </w:pPr>
+            <w:r>
+              <w:rPr>
+                <w:b/>
+                <w:bCs/>
+                <w:szCs w:val="24"/>
+              </w:rPr>
+              <w:t>Oct</w:t>
             </w:r>
           </w:p>
         </w:tc>
@@ -23072,7 +23171,7 @@
         </w:trPr>
         <w:tc>
           <w:tcPr>
-            <w:tcW w:w="2552" w:type="dxa"/>
+            <w:tcW w:w="1564" w:type="dxa"/>
             <w:vAlign w:val="center"/>
           </w:tcPr>
           <w:p>
@@ -23115,7 +23214,7 @@
                 <w:lang w:val="en-PH" w:eastAsia="en-PH"/>
               </w:rPr>
               <w:drawing>
-                <wp:anchor distT="0" distB="0" distL="114300" distR="114300" simplePos="0" relativeHeight="251693056" behindDoc="0" locked="0" layoutInCell="1" allowOverlap="1" wp14:anchorId="573063D6" wp14:editId="5FA4D7C0">
+                <wp:anchor distT="0" distB="0" distL="114300" distR="114300" simplePos="0" relativeHeight="251806720" behindDoc="0" locked="0" layoutInCell="1" allowOverlap="1" wp14:anchorId="573063D6" wp14:editId="5FA4D7C0">
                   <wp:simplePos x="0" y="0"/>
                   <wp:positionH relativeFrom="column">
                     <wp:posOffset>6159</wp:posOffset>
@@ -23136,7 +23235,7 @@
                           <pic:cNvPicPr/>
                         </pic:nvPicPr>
                         <pic:blipFill>
-                          <a:blip r:embed="rId17"/>
+                          <a:blip r:embed="rId19"/>
                           <a:stretch>
                             <a:fillRect/>
                           </a:stretch>
@@ -23210,16 +23309,16 @@
               <mc:AlternateContent>
                 <mc:Choice Requires="wps">
                   <w:drawing>
-                    <wp:anchor distT="0" distB="0" distL="114300" distR="114300" simplePos="0" relativeHeight="251694080" behindDoc="0" locked="0" layoutInCell="1" allowOverlap="1" wp14:anchorId="305440D6" wp14:editId="205FC748">
+                    <wp:anchor distT="0" distB="0" distL="114300" distR="114300" simplePos="0" relativeHeight="251807744" behindDoc="0" locked="0" layoutInCell="1" allowOverlap="1" wp14:anchorId="305440D6" wp14:editId="668A8F6E">
                       <wp:simplePos x="0" y="0"/>
                       <wp:positionH relativeFrom="column">
-                        <wp:posOffset>-1224971</wp:posOffset>
+                        <wp:posOffset>-1225602</wp:posOffset>
                       </wp:positionH>
                       <wp:positionV relativeFrom="paragraph">
-                        <wp:posOffset>111484</wp:posOffset>
+                        <wp:posOffset>109982</wp:posOffset>
                       </wp:positionV>
-                      <wp:extent cx="2970751" cy="207034"/>
-                      <wp:effectExtent l="0" t="0" r="20320" b="21590"/>
+                      <wp:extent cx="4016045" cy="207034"/>
+                      <wp:effectExtent l="0" t="0" r="22860" b="21590"/>
                       <wp:wrapNone/>
                       <wp:docPr id="143881179" name="Rectangle 12"/>
                       <wp:cNvGraphicFramePr/>
@@ -23230,7 +23329,7 @@
                             <wps:spPr>
                               <a:xfrm>
                                 <a:off x="0" y="0"/>
-                                <a:ext cx="2970751" cy="207034"/>
+                                <a:ext cx="4016045" cy="207034"/>
                               </a:xfrm>
                               <a:prstGeom prst="rect">
                                 <a:avLst/>
@@ -23826,7 +23925,7 @@
                 </mc:Choice>
                 <mc:Fallback>
                   <w:pict>
-                    <v:rect w14:anchorId="305440D6" id="Rectangle 12" o:spid="_x0000_s1145" style="position:absolute;left:0;text-align:left;margin-left:-96.45pt;margin-top:8.8pt;width:233.9pt;height:16.3pt;z-index:251694080;visibility:visible;mso-wrap-style:square;mso-width-percent:0;mso-height-percent:0;mso-wrap-distance-left:9pt;mso-wrap-distance-top:0;mso-wrap-distance-right:9pt;mso-wrap-distance-bottom:0;mso-position-horizontal:absolute;mso-position-horizontal-relative:text;mso-position-vertical:absolute;mso-position-vertical-relative:text;mso-width-percent:0;mso-height-percent:0;mso-width-relative:margin;mso-height-relative:margin;v-text-anchor:middle" o:gfxdata="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" fillcolor="black [3200]" strokecolor="black [480]" strokeweight="1pt">
+                    <v:rect w14:anchorId="305440D6" id="Rectangle 12" o:spid="_x0000_s1142" style="position:absolute;left:0;text-align:left;margin-left:-96.5pt;margin-top:8.65pt;width:316.2pt;height:16.3pt;z-index:251807744;visibility:visible;mso-wrap-style:square;mso-width-percent:0;mso-height-percent:0;mso-wrap-distance-left:9pt;mso-wrap-distance-top:0;mso-wrap-distance-right:9pt;mso-wrap-distance-bottom:0;mso-position-horizontal:absolute;mso-position-horizontal-relative:text;mso-position-vertical:absolute;mso-position-vertical-relative:text;mso-width-percent:0;mso-height-percent:0;mso-width-relative:margin;mso-height-relative:margin;v-text-anchor:middle" o:gfxdata="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" fillcolor="black [3200]" strokecolor="black [480]" strokeweight="1pt">
                       <v:textbox>
                         <w:txbxContent>
                           <w:tbl>
@@ -24449,53 +24548,38 @@
                 <w:szCs w:val="24"/>
               </w:rPr>
             </w:pPr>
-            <w:r>
+          </w:p>
+        </w:tc>
+        <w:tc>
+          <w:tcPr>
+            <w:tcW w:w="780" w:type="dxa"/>
+          </w:tcPr>
+          <w:p>
+            <w:pPr>
+              <w:spacing w:after="0" w:line="480" w:lineRule="auto"/>
+              <w:ind w:left="0"/>
+              <w:jc w:val="center"/>
               <w:rPr>
                 <w:noProof/>
                 <w:lang w:val="en-PH" w:eastAsia="en-PH"/>
               </w:rPr>
-              <w:drawing>
-                <wp:anchor distT="0" distB="0" distL="114300" distR="114300" simplePos="0" relativeHeight="251703296" behindDoc="0" locked="0" layoutInCell="1" allowOverlap="1" wp14:anchorId="09E24EA2" wp14:editId="062CB201">
-                  <wp:simplePos x="0" y="0"/>
-                  <wp:positionH relativeFrom="column">
-                    <wp:posOffset>107950</wp:posOffset>
-                  </wp:positionH>
-                  <wp:positionV relativeFrom="paragraph">
-                    <wp:posOffset>52070</wp:posOffset>
-                  </wp:positionV>
-                  <wp:extent cx="114935" cy="330835"/>
-                  <wp:effectExtent l="0" t="0" r="0" b="0"/>
-                  <wp:wrapNone/>
-                  <wp:docPr id="1834866978" name="Picture 2837"/>
-                  <wp:cNvGraphicFramePr/>
-                  <a:graphic xmlns:a="http://schemas.openxmlformats.org/drawingml/2006/main">
-                    <a:graphicData uri="http://schemas.openxmlformats.org/drawingml/2006/picture">
-                      <pic:pic xmlns:pic="http://schemas.openxmlformats.org/drawingml/2006/picture">
-                        <pic:nvPicPr>
-                          <pic:cNvPr id="1834866978" name="Picture 2837"/>
-                          <pic:cNvPicPr/>
-                        </pic:nvPicPr>
-                        <pic:blipFill>
-                          <a:blip r:embed="rId18"/>
-                          <a:stretch>
-                            <a:fillRect/>
-                          </a:stretch>
-                        </pic:blipFill>
-                        <pic:spPr>
-                          <a:xfrm>
-                            <a:off x="0" y="0"/>
-                            <a:ext cx="114935" cy="330835"/>
-                          </a:xfrm>
-                          <a:prstGeom prst="rect">
-                            <a:avLst/>
-                          </a:prstGeom>
-                        </pic:spPr>
-                      </pic:pic>
-                    </a:graphicData>
-                  </a:graphic>
-                </wp:anchor>
-              </w:drawing>
-            </w:r>
+            </w:pPr>
+          </w:p>
+        </w:tc>
+        <w:tc>
+          <w:tcPr>
+            <w:tcW w:w="780" w:type="dxa"/>
+          </w:tcPr>
+          <w:p>
+            <w:pPr>
+              <w:spacing w:after="0" w:line="480" w:lineRule="auto"/>
+              <w:ind w:left="0"/>
+              <w:jc w:val="center"/>
+              <w:rPr>
+                <w:noProof/>
+                <w:lang w:val="en-PH" w:eastAsia="en-PH"/>
+              </w:rPr>
+            </w:pPr>
           </w:p>
         </w:tc>
       </w:tr>
@@ -24505,7 +24589,7 @@
         </w:trPr>
         <w:tc>
           <w:tcPr>
-            <w:tcW w:w="2552" w:type="dxa"/>
+            <w:tcW w:w="1564" w:type="dxa"/>
             <w:vAlign w:val="center"/>
           </w:tcPr>
           <w:p>
@@ -24593,7 +24677,7 @@
                 <w:lang w:val="en-PH" w:eastAsia="en-PH"/>
               </w:rPr>
               <w:drawing>
-                <wp:anchor distT="0" distB="0" distL="114300" distR="114300" simplePos="0" relativeHeight="251699200" behindDoc="0" locked="0" layoutInCell="1" allowOverlap="1" wp14:anchorId="7DC9AE19" wp14:editId="7F52E0BE">
+                <wp:anchor distT="0" distB="0" distL="114300" distR="114300" simplePos="0" relativeHeight="251812864" behindDoc="0" locked="0" layoutInCell="1" allowOverlap="1" wp14:anchorId="7DC9AE19" wp14:editId="7F52E0BE">
                   <wp:simplePos x="0" y="0"/>
                   <wp:positionH relativeFrom="column">
                     <wp:posOffset>-37465</wp:posOffset>
@@ -24614,7 +24698,7 @@
                           <pic:cNvPicPr/>
                         </pic:nvPicPr>
                         <pic:blipFill>
-                          <a:blip r:embed="rId17"/>
+                          <a:blip r:embed="rId19"/>
                           <a:stretch>
                             <a:fillRect/>
                           </a:stretch>
@@ -24655,7 +24739,7 @@
                 <w:lang w:val="en-PH" w:eastAsia="en-PH"/>
               </w:rPr>
               <w:drawing>
-                <wp:anchor distT="0" distB="0" distL="114300" distR="114300" simplePos="0" relativeHeight="251704320" behindDoc="0" locked="0" layoutInCell="1" allowOverlap="1" wp14:anchorId="6517DD21" wp14:editId="7BB5924C">
+                <wp:anchor distT="0" distB="0" distL="114300" distR="114300" simplePos="0" relativeHeight="251817984" behindDoc="0" locked="0" layoutInCell="1" allowOverlap="1" wp14:anchorId="6517DD21" wp14:editId="7BB5924C">
                   <wp:simplePos x="0" y="0"/>
                   <wp:positionH relativeFrom="column">
                     <wp:posOffset>191135</wp:posOffset>
@@ -24676,7 +24760,7 @@
                           <pic:cNvPicPr/>
                         </pic:nvPicPr>
                         <pic:blipFill>
-                          <a:blip r:embed="rId18"/>
+                          <a:blip r:embed="rId20"/>
                           <a:stretch>
                             <a:fillRect/>
                           </a:stretch>
@@ -24705,7 +24789,7 @@
               <mc:AlternateContent>
                 <mc:Choice Requires="wps">
                   <w:drawing>
-                    <wp:anchor distT="0" distB="0" distL="114300" distR="114300" simplePos="0" relativeHeight="251695104" behindDoc="0" locked="0" layoutInCell="1" allowOverlap="1" wp14:anchorId="796DCF5C" wp14:editId="156CE435">
+                    <wp:anchor distT="0" distB="0" distL="114300" distR="114300" simplePos="0" relativeHeight="251808768" behindDoc="0" locked="0" layoutInCell="1" allowOverlap="1" wp14:anchorId="796DCF5C" wp14:editId="156CE435">
                       <wp:simplePos x="0" y="0"/>
                       <wp:positionH relativeFrom="column">
                         <wp:posOffset>-355600</wp:posOffset>
@@ -24758,7 +24842,7 @@
                 </mc:Choice>
                 <mc:Fallback>
                   <w:pict>
-                    <v:rect w14:anchorId="5E54BA14" id="Rectangle 12" o:spid="_x0000_s1026" style="position:absolute;margin-left:-28pt;margin-top:9.35pt;width:43.2pt;height:11.35pt;z-index:251695104;visibility:visible;mso-wrap-style:square;mso-wrap-distance-left:9pt;mso-wrap-distance-top:0;mso-wrap-distance-right:9pt;mso-wrap-distance-bottom:0;mso-position-horizontal:absolute;mso-position-horizontal-relative:text;mso-position-vertical:absolute;mso-position-vertical-relative:text;v-text-anchor:middle" o:gfxdata="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" fillcolor="black [3200]" strokecolor="black [480]" strokeweight="1pt"/>
+                    <v:rect w14:anchorId="26D28DD6" id="Rectangle 12" o:spid="_x0000_s1026" style="position:absolute;margin-left:-28pt;margin-top:9.35pt;width:43.2pt;height:11.35pt;z-index:251808768;visibility:visible;mso-wrap-style:square;mso-wrap-distance-left:9pt;mso-wrap-distance-top:0;mso-wrap-distance-right:9pt;mso-wrap-distance-bottom:0;mso-position-horizontal:absolute;mso-position-horizontal-relative:text;mso-position-vertical:absolute;mso-position-vertical-relative:text;v-text-anchor:middle" o:gfxdata="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" fillcolor="black [3200]" strokecolor="black [480]" strokeweight="1pt"/>
                   </w:pict>
                 </mc:Fallback>
               </mc:AlternateContent>
@@ -24808,6 +24892,83 @@
                 <w:szCs w:val="24"/>
               </w:rPr>
             </w:pPr>
+          </w:p>
+        </w:tc>
+        <w:tc>
+          <w:tcPr>
+            <w:tcW w:w="780" w:type="dxa"/>
+          </w:tcPr>
+          <w:p>
+            <w:pPr>
+              <w:spacing w:after="0" w:line="480" w:lineRule="auto"/>
+              <w:ind w:left="0"/>
+              <w:jc w:val="center"/>
+              <w:rPr>
+                <w:szCs w:val="24"/>
+              </w:rPr>
+            </w:pPr>
+          </w:p>
+        </w:tc>
+        <w:tc>
+          <w:tcPr>
+            <w:tcW w:w="780" w:type="dxa"/>
+          </w:tcPr>
+          <w:p>
+            <w:pPr>
+              <w:spacing w:after="0" w:line="480" w:lineRule="auto"/>
+              <w:ind w:left="0"/>
+              <w:jc w:val="center"/>
+              <w:rPr>
+                <w:szCs w:val="24"/>
+              </w:rPr>
+            </w:pPr>
+            <w:r>
+              <w:rPr>
+                <w:noProof/>
+                <w:lang w:val="en-PH" w:eastAsia="en-PH"/>
+              </w:rPr>
+              <w:drawing>
+                <wp:anchor distT="0" distB="0" distL="114300" distR="114300" simplePos="0" relativeHeight="251816960" behindDoc="0" locked="0" layoutInCell="1" allowOverlap="1" wp14:anchorId="09E24EA2" wp14:editId="570D50BE">
+                  <wp:simplePos x="0" y="0"/>
+                  <wp:positionH relativeFrom="column">
+                    <wp:posOffset>135267</wp:posOffset>
+                  </wp:positionH>
+                  <wp:positionV relativeFrom="paragraph">
+                    <wp:posOffset>-577048</wp:posOffset>
+                  </wp:positionV>
+                  <wp:extent cx="114935" cy="330835"/>
+                  <wp:effectExtent l="0" t="0" r="0" b="0"/>
+                  <wp:wrapNone/>
+                  <wp:docPr id="1834866978" name="Picture 2837"/>
+                  <wp:cNvGraphicFramePr/>
+                  <a:graphic xmlns:a="http://schemas.openxmlformats.org/drawingml/2006/main">
+                    <a:graphicData uri="http://schemas.openxmlformats.org/drawingml/2006/picture">
+                      <pic:pic xmlns:pic="http://schemas.openxmlformats.org/drawingml/2006/picture">
+                        <pic:nvPicPr>
+                          <pic:cNvPr id="1834866978" name="Picture 2837"/>
+                          <pic:cNvPicPr/>
+                        </pic:nvPicPr>
+                        <pic:blipFill>
+                          <a:blip r:embed="rId20"/>
+                          <a:stretch>
+                            <a:fillRect/>
+                          </a:stretch>
+                        </pic:blipFill>
+                        <pic:spPr>
+                          <a:xfrm>
+                            <a:off x="0" y="0"/>
+                            <a:ext cx="114935" cy="330835"/>
+                          </a:xfrm>
+                          <a:prstGeom prst="rect">
+                            <a:avLst/>
+                          </a:prstGeom>
+                        </pic:spPr>
+                      </pic:pic>
+                    </a:graphicData>
+                  </a:graphic>
+                </wp:anchor>
+              </w:drawing>
+            </w:r>
           </w:p>
         </w:tc>
       </w:tr>
@@ -24817,7 +24978,7 @@
         </w:trPr>
         <w:tc>
           <w:tcPr>
-            <w:tcW w:w="2552" w:type="dxa"/>
+            <w:tcW w:w="1564" w:type="dxa"/>
             <w:vAlign w:val="center"/>
           </w:tcPr>
           <w:p>
@@ -24920,7 +25081,7 @@
                 <w:lang w:val="en-PH" w:eastAsia="en-PH"/>
               </w:rPr>
               <w:drawing>
-                <wp:anchor distT="0" distB="0" distL="114300" distR="114300" simplePos="0" relativeHeight="251700224" behindDoc="0" locked="0" layoutInCell="1" allowOverlap="1" wp14:anchorId="47C337AB" wp14:editId="2984D8A1">
+                <wp:anchor distT="0" distB="0" distL="114300" distR="114300" simplePos="0" relativeHeight="251813888" behindDoc="0" locked="0" layoutInCell="1" allowOverlap="1" wp14:anchorId="47C337AB" wp14:editId="2984D8A1">
                   <wp:simplePos x="0" y="0"/>
                   <wp:positionH relativeFrom="column">
                     <wp:posOffset>-59690</wp:posOffset>
@@ -24941,7 +25102,7 @@
                           <pic:cNvPicPr/>
                         </pic:nvPicPr>
                         <pic:blipFill>
-                          <a:blip r:embed="rId17"/>
+                          <a:blip r:embed="rId19"/>
                           <a:stretch>
                             <a:fillRect/>
                           </a:stretch>
@@ -24961,6 +25122,51 @@
                 </wp:anchor>
               </w:drawing>
             </w:r>
+          </w:p>
+        </w:tc>
+        <w:tc>
+          <w:tcPr>
+            <w:tcW w:w="709" w:type="dxa"/>
+          </w:tcPr>
+          <w:p>
+            <w:pPr>
+              <w:spacing w:after="0" w:line="480" w:lineRule="auto"/>
+              <w:ind w:left="0"/>
+              <w:jc w:val="center"/>
+              <w:rPr>
+                <w:szCs w:val="24"/>
+              </w:rPr>
+            </w:pPr>
+          </w:p>
+        </w:tc>
+        <w:tc>
+          <w:tcPr>
+            <w:tcW w:w="567" w:type="dxa"/>
+          </w:tcPr>
+          <w:p>
+            <w:pPr>
+              <w:spacing w:after="0" w:line="480" w:lineRule="auto"/>
+              <w:ind w:left="0"/>
+              <w:jc w:val="center"/>
+              <w:rPr>
+                <w:szCs w:val="24"/>
+              </w:rPr>
+            </w:pPr>
+          </w:p>
+        </w:tc>
+        <w:tc>
+          <w:tcPr>
+            <w:tcW w:w="780" w:type="dxa"/>
+          </w:tcPr>
+          <w:p>
+            <w:pPr>
+              <w:spacing w:after="0" w:line="480" w:lineRule="auto"/>
+              <w:ind w:left="0"/>
+              <w:jc w:val="center"/>
+              <w:rPr>
+                <w:szCs w:val="24"/>
+              </w:rPr>
+            </w:pPr>
             <w:r>
               <w:rPr>
                 <w:noProof/>
@@ -24970,16 +25176,16 @@
               <mc:AlternateContent>
                 <mc:Choice Requires="wps">
                   <w:drawing>
-                    <wp:anchor distT="0" distB="0" distL="114300" distR="114300" simplePos="0" relativeHeight="251696128" behindDoc="0" locked="0" layoutInCell="1" allowOverlap="1" wp14:anchorId="2E537AEE" wp14:editId="0D7B90EF">
+                    <wp:anchor distT="0" distB="0" distL="114300" distR="114300" simplePos="0" relativeHeight="251809792" behindDoc="0" locked="0" layoutInCell="1" allowOverlap="1" wp14:anchorId="2E537AEE" wp14:editId="2F746B9A">
                       <wp:simplePos x="0" y="0"/>
                       <wp:positionH relativeFrom="column">
-                        <wp:posOffset>79375</wp:posOffset>
+                        <wp:posOffset>-1164913</wp:posOffset>
                       </wp:positionH>
                       <wp:positionV relativeFrom="paragraph">
-                        <wp:posOffset>152400</wp:posOffset>
+                        <wp:posOffset>147166</wp:posOffset>
                       </wp:positionV>
-                      <wp:extent cx="499110" cy="144145"/>
-                      <wp:effectExtent l="0" t="0" r="15240" b="27305"/>
+                      <wp:extent cx="1730643" cy="144145"/>
+                      <wp:effectExtent l="0" t="0" r="22225" b="27305"/>
                       <wp:wrapNone/>
                       <wp:docPr id="844341392" name="Rectangle 12"/>
                       <wp:cNvGraphicFramePr/>
@@ -24990,7 +25196,382 @@
                             <wps:spPr>
                               <a:xfrm>
                                 <a:off x="0" y="0"/>
-                                <a:ext cx="499353" cy="144145"/>
+                                <a:ext cx="1730643" cy="144145"/>
+                              </a:xfrm>
+                              <a:prstGeom prst="rect">
+                                <a:avLst/>
+                              </a:prstGeom>
+                            </wps:spPr>
+                            <wps:style>
+                              <a:lnRef idx="2">
+                                <a:schemeClr val="dk1">
+                                  <a:shade val="15000"/>
+                                </a:schemeClr>
+                              </a:lnRef>
+                              <a:fillRef idx="1">
+                                <a:schemeClr val="dk1"/>
+                              </a:fillRef>
+                              <a:effectRef idx="0">
+                                <a:schemeClr val="dk1"/>
+                              </a:effectRef>
+                              <a:fontRef idx="minor">
+                                <a:schemeClr val="lt1"/>
+                              </a:fontRef>
+                            </wps:style>
+                            <wps:bodyPr rot="0" spcFirstLastPara="0" vertOverflow="overflow" horzOverflow="overflow" vert="horz" wrap="square" lIns="91440" tIns="45720" rIns="91440" bIns="45720" numCol="1" spcCol="0" rtlCol="0" fromWordArt="0" anchor="ctr" anchorCtr="0" forceAA="0" compatLnSpc="1">
+                              <a:noAutofit/>
+                            </wps:bodyPr>
+                          </wps:wsp>
+                        </a:graphicData>
+                      </a:graphic>
+                      <wp14:sizeRelH relativeFrom="margin">
+                        <wp14:pctWidth>0</wp14:pctWidth>
+                      </wp14:sizeRelH>
+                    </wp:anchor>
+                  </w:drawing>
+                </mc:Choice>
+                <mc:Fallback>
+                  <w:pict>
+                    <v:rect w14:anchorId="1C217754" id="Rectangle 12" o:spid="_x0000_s1026" style="position:absolute;margin-left:-91.75pt;margin-top:11.6pt;width:136.25pt;height:11.35pt;z-index:251809792;visibility:visible;mso-wrap-style:square;mso-width-percent:0;mso-wrap-distance-left:9pt;mso-wrap-distance-top:0;mso-wrap-distance-right:9pt;mso-wrap-distance-bottom:0;mso-position-horizontal:absolute;mso-position-horizontal-relative:text;mso-position-vertical:absolute;mso-position-vertical-relative:text;mso-width-percent:0;mso-width-relative:margin;v-text-anchor:middle" o:gfxdata="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" fillcolor="black [3200]" strokecolor="black [480]" strokeweight="1pt"/>
+                  </w:pict>
+                </mc:Fallback>
+              </mc:AlternateContent>
+            </w:r>
+          </w:p>
+        </w:tc>
+        <w:tc>
+          <w:tcPr>
+            <w:tcW w:w="780" w:type="dxa"/>
+          </w:tcPr>
+          <w:p>
+            <w:pPr>
+              <w:spacing w:after="0" w:line="480" w:lineRule="auto"/>
+              <w:ind w:left="0"/>
+              <w:jc w:val="center"/>
+              <w:rPr>
+                <w:szCs w:val="24"/>
+              </w:rPr>
+            </w:pPr>
+            <w:r>
+              <w:rPr>
+                <w:noProof/>
+                <w:lang w:val="en-PH" w:eastAsia="en-PH"/>
+              </w:rPr>
+              <w:drawing>
+                <wp:anchor distT="0" distB="0" distL="114300" distR="114300" simplePos="0" relativeHeight="251819008" behindDoc="0" locked="0" layoutInCell="1" allowOverlap="1" wp14:anchorId="3349980A" wp14:editId="2A159054">
+                  <wp:simplePos x="0" y="0"/>
+                  <wp:positionH relativeFrom="column">
+                    <wp:posOffset>100559</wp:posOffset>
+                  </wp:positionH>
+                  <wp:positionV relativeFrom="paragraph">
+                    <wp:posOffset>58395</wp:posOffset>
+                  </wp:positionV>
+                  <wp:extent cx="114935" cy="330835"/>
+                  <wp:effectExtent l="0" t="0" r="0" b="0"/>
+                  <wp:wrapNone/>
+                  <wp:docPr id="1141810146" name="Picture 2837"/>
+                  <wp:cNvGraphicFramePr/>
+                  <a:graphic xmlns:a="http://schemas.openxmlformats.org/drawingml/2006/main">
+                    <a:graphicData uri="http://schemas.openxmlformats.org/drawingml/2006/picture">
+                      <pic:pic xmlns:pic="http://schemas.openxmlformats.org/drawingml/2006/picture">
+                        <pic:nvPicPr>
+                          <pic:cNvPr id="1141810146" name="Picture 2837"/>
+                          <pic:cNvPicPr/>
+                        </pic:nvPicPr>
+                        <pic:blipFill>
+                          <a:blip r:embed="rId20"/>
+                          <a:stretch>
+                            <a:fillRect/>
+                          </a:stretch>
+                        </pic:blipFill>
+                        <pic:spPr>
+                          <a:xfrm>
+                            <a:off x="0" y="0"/>
+                            <a:ext cx="114935" cy="330835"/>
+                          </a:xfrm>
+                          <a:prstGeom prst="rect">
+                            <a:avLst/>
+                          </a:prstGeom>
+                        </pic:spPr>
+                      </pic:pic>
+                    </a:graphicData>
+                  </a:graphic>
+                </wp:anchor>
+              </w:drawing>
+            </w:r>
+          </w:p>
+        </w:tc>
+        <w:tc>
+          <w:tcPr>
+            <w:tcW w:w="780" w:type="dxa"/>
+          </w:tcPr>
+          <w:p>
+            <w:pPr>
+              <w:spacing w:after="0" w:line="480" w:lineRule="auto"/>
+              <w:ind w:left="0"/>
+              <w:jc w:val="center"/>
+              <w:rPr>
+                <w:szCs w:val="24"/>
+              </w:rPr>
+            </w:pPr>
+          </w:p>
+        </w:tc>
+      </w:tr>
+      <w:tr>
+        <w:trPr>
+          <w:trHeight w:val="753"/>
+        </w:trPr>
+        <w:tc>
+          <w:tcPr>
+            <w:tcW w:w="1564" w:type="dxa"/>
+            <w:vAlign w:val="center"/>
+          </w:tcPr>
+          <w:p>
+            <w:pPr>
+              <w:spacing w:after="0" w:line="480" w:lineRule="auto"/>
+              <w:ind w:left="0" w:firstLine="0"/>
+              <w:rPr>
+                <w:b/>
+                <w:bCs/>
+                <w:szCs w:val="24"/>
+              </w:rPr>
+            </w:pPr>
+            <w:r>
+              <w:rPr>
+                <w:b/>
+                <w:bCs/>
+                <w:szCs w:val="24"/>
+              </w:rPr>
+              <w:t>Test</w:t>
+            </w:r>
+          </w:p>
+        </w:tc>
+        <w:tc>
+          <w:tcPr>
+            <w:tcW w:w="709" w:type="dxa"/>
+          </w:tcPr>
+          <w:p>
+            <w:pPr>
+              <w:spacing w:after="0" w:line="480" w:lineRule="auto"/>
+              <w:ind w:left="0"/>
+              <w:jc w:val="center"/>
+              <w:rPr>
+                <w:szCs w:val="24"/>
+              </w:rPr>
+            </w:pPr>
+          </w:p>
+        </w:tc>
+        <w:tc>
+          <w:tcPr>
+            <w:tcW w:w="709" w:type="dxa"/>
+          </w:tcPr>
+          <w:p>
+            <w:pPr>
+              <w:spacing w:after="0" w:line="480" w:lineRule="auto"/>
+              <w:ind w:left="0"/>
+              <w:jc w:val="center"/>
+              <w:rPr>
+                <w:szCs w:val="24"/>
+              </w:rPr>
+            </w:pPr>
+          </w:p>
+        </w:tc>
+        <w:tc>
+          <w:tcPr>
+            <w:tcW w:w="708" w:type="dxa"/>
+          </w:tcPr>
+          <w:p>
+            <w:pPr>
+              <w:spacing w:after="0" w:line="480" w:lineRule="auto"/>
+              <w:ind w:left="0"/>
+              <w:jc w:val="center"/>
+              <w:rPr>
+                <w:szCs w:val="24"/>
+              </w:rPr>
+            </w:pPr>
+          </w:p>
+        </w:tc>
+        <w:tc>
+          <w:tcPr>
+            <w:tcW w:w="709" w:type="dxa"/>
+          </w:tcPr>
+          <w:p>
+            <w:pPr>
+              <w:spacing w:after="0" w:line="480" w:lineRule="auto"/>
+              <w:ind w:left="0"/>
+              <w:jc w:val="center"/>
+              <w:rPr>
+                <w:szCs w:val="24"/>
+              </w:rPr>
+            </w:pPr>
+          </w:p>
+        </w:tc>
+        <w:tc>
+          <w:tcPr>
+            <w:tcW w:w="709" w:type="dxa"/>
+          </w:tcPr>
+          <w:p>
+            <w:pPr>
+              <w:spacing w:after="0" w:line="480" w:lineRule="auto"/>
+              <w:ind w:left="0"/>
+              <w:jc w:val="center"/>
+              <w:rPr>
+                <w:szCs w:val="24"/>
+              </w:rPr>
+            </w:pPr>
+          </w:p>
+        </w:tc>
+        <w:tc>
+          <w:tcPr>
+            <w:tcW w:w="709" w:type="dxa"/>
+          </w:tcPr>
+          <w:p>
+            <w:pPr>
+              <w:spacing w:after="0" w:line="480" w:lineRule="auto"/>
+              <w:ind w:left="0"/>
+              <w:jc w:val="center"/>
+              <w:rPr>
+                <w:szCs w:val="24"/>
+              </w:rPr>
+            </w:pPr>
+          </w:p>
+        </w:tc>
+        <w:tc>
+          <w:tcPr>
+            <w:tcW w:w="567" w:type="dxa"/>
+          </w:tcPr>
+          <w:p>
+            <w:pPr>
+              <w:spacing w:after="0" w:line="480" w:lineRule="auto"/>
+              <w:ind w:left="0"/>
+              <w:jc w:val="center"/>
+              <w:rPr>
+                <w:szCs w:val="24"/>
+              </w:rPr>
+            </w:pPr>
+          </w:p>
+        </w:tc>
+        <w:tc>
+          <w:tcPr>
+            <w:tcW w:w="780" w:type="dxa"/>
+          </w:tcPr>
+          <w:p>
+            <w:pPr>
+              <w:spacing w:after="0" w:line="480" w:lineRule="auto"/>
+              <w:ind w:left="0"/>
+              <w:jc w:val="center"/>
+              <w:rPr>
+                <w:szCs w:val="24"/>
+              </w:rPr>
+            </w:pPr>
+          </w:p>
+        </w:tc>
+        <w:tc>
+          <w:tcPr>
+            <w:tcW w:w="780" w:type="dxa"/>
+          </w:tcPr>
+          <w:p>
+            <w:pPr>
+              <w:spacing w:after="0" w:line="480" w:lineRule="auto"/>
+              <w:ind w:left="0"/>
+              <w:jc w:val="center"/>
+              <w:rPr>
+                <w:szCs w:val="24"/>
+              </w:rPr>
+            </w:pPr>
+            <w:r>
+              <w:rPr>
+                <w:b/>
+                <w:noProof/>
+                <w:lang w:val="en-PH" w:eastAsia="en-PH"/>
+              </w:rPr>
+              <w:drawing>
+                <wp:anchor distT="0" distB="0" distL="114300" distR="114300" simplePos="0" relativeHeight="251814912" behindDoc="0" locked="0" layoutInCell="1" allowOverlap="1" wp14:anchorId="0E21F375" wp14:editId="6917D43D">
+                  <wp:simplePos x="0" y="0"/>
+                  <wp:positionH relativeFrom="column">
+                    <wp:posOffset>-30556</wp:posOffset>
+                  </wp:positionH>
+                  <wp:positionV relativeFrom="paragraph">
+                    <wp:posOffset>58674</wp:posOffset>
+                  </wp:positionV>
+                  <wp:extent cx="115570" cy="330200"/>
+                  <wp:effectExtent l="0" t="0" r="0" b="0"/>
+                  <wp:wrapNone/>
+                  <wp:docPr id="1323294800" name="Picture 1016041909"/>
+                  <wp:cNvGraphicFramePr/>
+                  <a:graphic xmlns:a="http://schemas.openxmlformats.org/drawingml/2006/main">
+                    <a:graphicData uri="http://schemas.openxmlformats.org/drawingml/2006/picture">
+                      <pic:pic xmlns:pic="http://schemas.openxmlformats.org/drawingml/2006/picture">
+                        <pic:nvPicPr>
+                          <pic:cNvPr id="1323294800" name="Picture 1016041909"/>
+                          <pic:cNvPicPr/>
+                        </pic:nvPicPr>
+                        <pic:blipFill>
+                          <a:blip r:embed="rId19"/>
+                          <a:stretch>
+                            <a:fillRect/>
+                          </a:stretch>
+                        </pic:blipFill>
+                        <pic:spPr>
+                          <a:xfrm>
+                            <a:off x="0" y="0"/>
+                            <a:ext cx="115570" cy="330200"/>
+                          </a:xfrm>
+                          <a:prstGeom prst="rect">
+                            <a:avLst/>
+                          </a:prstGeom>
+                        </pic:spPr>
+                      </pic:pic>
+                    </a:graphicData>
+                  </a:graphic>
+                </wp:anchor>
+              </w:drawing>
+            </w:r>
+          </w:p>
+        </w:tc>
+        <w:tc>
+          <w:tcPr>
+            <w:tcW w:w="780" w:type="dxa"/>
+          </w:tcPr>
+          <w:p>
+            <w:pPr>
+              <w:spacing w:after="0" w:line="480" w:lineRule="auto"/>
+              <w:ind w:left="0"/>
+              <w:jc w:val="center"/>
+              <w:rPr>
+                <w:szCs w:val="24"/>
+              </w:rPr>
+            </w:pPr>
+            <w:r>
+              <w:rPr>
+                <w:noProof/>
+                <w:szCs w:val="24"/>
+                <w:lang w:val="en-PH" w:eastAsia="en-PH"/>
+              </w:rPr>
+              <mc:AlternateContent>
+                <mc:Choice Requires="wps">
+                  <w:drawing>
+                    <wp:anchor distT="0" distB="0" distL="114300" distR="114300" simplePos="0" relativeHeight="251810816" behindDoc="0" locked="0" layoutInCell="1" allowOverlap="1" wp14:anchorId="1D4AC7CC" wp14:editId="0C596454">
+                      <wp:simplePos x="0" y="0"/>
+                      <wp:positionH relativeFrom="column">
+                        <wp:posOffset>-392938</wp:posOffset>
+                      </wp:positionH>
+                      <wp:positionV relativeFrom="paragraph">
+                        <wp:posOffset>147955</wp:posOffset>
+                      </wp:positionV>
+                      <wp:extent cx="492125" cy="144145"/>
+                      <wp:effectExtent l="0" t="0" r="22225" b="27305"/>
+                      <wp:wrapNone/>
+                      <wp:docPr id="701020955" name="Rectangle 12"/>
+                      <wp:cNvGraphicFramePr/>
+                      <a:graphic xmlns:a="http://schemas.openxmlformats.org/drawingml/2006/main">
+                        <a:graphicData uri="http://schemas.microsoft.com/office/word/2010/wordprocessingShape">
+                          <wps:wsp>
+                            <wps:cNvSpPr/>
+                            <wps:spPr>
+                              <a:xfrm>
+                                <a:off x="0" y="0"/>
+                                <a:ext cx="492125" cy="144145"/>
                               </a:xfrm>
                               <a:prstGeom prst="rect">
                                 <a:avLst/>
@@ -25023,54 +25604,39 @@
                 </mc:Choice>
                 <mc:Fallback>
                   <w:pict>
-                    <v:rect w14:anchorId="6FD756E9" id="Rectangle 12" o:spid="_x0000_s1026" style="position:absolute;margin-left:6.25pt;margin-top:12pt;width:39.3pt;height:11.35pt;z-index:251696128;visibility:visible;mso-wrap-style:square;mso-wrap-distance-left:9pt;mso-wrap-distance-top:0;mso-wrap-distance-right:9pt;mso-wrap-distance-bottom:0;mso-position-horizontal:absolute;mso-position-horizontal-relative:text;mso-position-vertical:absolute;mso-position-vertical-relative:text;v-text-anchor:middle" o:gfxdata="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" fillcolor="black [3200]" strokecolor="black [480]" strokeweight="1pt"/>
+                    <v:rect w14:anchorId="5E4EB839" id="Rectangle 12" o:spid="_x0000_s1026" style="position:absolute;margin-left:-30.95pt;margin-top:11.65pt;width:38.75pt;height:11.35pt;z-index:251810816;visibility:visible;mso-wrap-style:square;mso-wrap-distance-left:9pt;mso-wrap-distance-top:0;mso-wrap-distance-right:9pt;mso-wrap-distance-bottom:0;mso-position-horizontal:absolute;mso-position-horizontal-relative:text;mso-position-vertical:absolute;mso-position-vertical-relative:text;v-text-anchor:middle" o:gfxdata="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" fillcolor="black [3200]" strokecolor="black [480]" strokeweight="1pt"/>
                   </w:pict>
                 </mc:Fallback>
               </mc:AlternateContent>
             </w:r>
-          </w:p>
-        </w:tc>
-        <w:tc>
-          <w:tcPr>
-            <w:tcW w:w="709" w:type="dxa"/>
-          </w:tcPr>
-          <w:p>
-            <w:pPr>
-              <w:spacing w:after="0" w:line="480" w:lineRule="auto"/>
-              <w:ind w:left="0"/>
-              <w:jc w:val="center"/>
-              <w:rPr>
-                <w:szCs w:val="24"/>
-              </w:rPr>
-            </w:pPr>
             <w:r>
               <w:rPr>
                 <w:noProof/>
                 <w:lang w:val="en-PH" w:eastAsia="en-PH"/>
               </w:rPr>
               <w:drawing>
-                <wp:anchor distT="0" distB="0" distL="114300" distR="114300" simplePos="0" relativeHeight="251705344" behindDoc="0" locked="0" layoutInCell="1" allowOverlap="1" wp14:anchorId="3349980A" wp14:editId="7FBA67D0">
+                <wp:anchor distT="0" distB="0" distL="114300" distR="114300" simplePos="0" relativeHeight="251820032" behindDoc="0" locked="0" layoutInCell="1" allowOverlap="1" wp14:anchorId="692C7B46" wp14:editId="1147B53D">
                   <wp:simplePos x="0" y="0"/>
                   <wp:positionH relativeFrom="column">
-                    <wp:posOffset>177165</wp:posOffset>
+                    <wp:posOffset>112776</wp:posOffset>
                   </wp:positionH>
                   <wp:positionV relativeFrom="paragraph">
-                    <wp:posOffset>73025</wp:posOffset>
+                    <wp:posOffset>58090</wp:posOffset>
                   </wp:positionV>
                   <wp:extent cx="114935" cy="330835"/>
                   <wp:effectExtent l="0" t="0" r="0" b="0"/>
                   <wp:wrapNone/>
-                  <wp:docPr id="1141810146" name="Picture 2837"/>
+                  <wp:docPr id="1506990476" name="Picture 2837"/>
                   <wp:cNvGraphicFramePr/>
                   <a:graphic xmlns:a="http://schemas.openxmlformats.org/drawingml/2006/main">
                     <a:graphicData uri="http://schemas.openxmlformats.org/drawingml/2006/picture">
                       <pic:pic xmlns:pic="http://schemas.openxmlformats.org/drawingml/2006/picture">
                         <pic:nvPicPr>
-                          <pic:cNvPr id="1141810146" name="Picture 2837"/>
+                          <pic:cNvPr id="1506990476" name="Picture 2837"/>
                           <pic:cNvPicPr/>
                         </pic:nvPicPr>
                         <pic:blipFill>
-                          <a:blip r:embed="rId18"/>
+                          <a:blip r:embed="rId20"/>
                           <a:stretch>
                             <a:fillRect/>
                           </a:stretch>
@@ -25092,9 +25658,39 @@
             </w:r>
           </w:p>
         </w:tc>
-        <w:tc>
-          <w:tcPr>
-            <w:tcW w:w="567" w:type="dxa"/>
+      </w:tr>
+      <w:tr>
+        <w:trPr>
+          <w:trHeight w:val="774"/>
+        </w:trPr>
+        <w:tc>
+          <w:tcPr>
+            <w:tcW w:w="1564" w:type="dxa"/>
+            <w:vAlign w:val="center"/>
+          </w:tcPr>
+          <w:p>
+            <w:pPr>
+              <w:spacing w:after="0" w:line="480" w:lineRule="auto"/>
+              <w:ind w:left="0" w:firstLine="0"/>
+              <w:rPr>
+                <w:b/>
+                <w:bCs/>
+                <w:szCs w:val="24"/>
+              </w:rPr>
+            </w:pPr>
+            <w:r>
+              <w:rPr>
+                <w:b/>
+                <w:bCs/>
+                <w:szCs w:val="24"/>
+              </w:rPr>
+              <w:t>Finalizing</w:t>
+            </w:r>
+          </w:p>
+        </w:tc>
+        <w:tc>
+          <w:tcPr>
+            <w:tcW w:w="709" w:type="dxa"/>
           </w:tcPr>
           <w:p>
             <w:pPr>
@@ -25109,7 +25705,7 @@
         </w:tc>
         <w:tc>
           <w:tcPr>
-            <w:tcW w:w="780" w:type="dxa"/>
+            <w:tcW w:w="709" w:type="dxa"/>
           </w:tcPr>
           <w:p>
             <w:pPr>
@@ -25122,39 +25718,9 @@
             </w:pPr>
           </w:p>
         </w:tc>
-      </w:tr>
-      <w:tr>
-        <w:trPr>
-          <w:trHeight w:val="753"/>
-        </w:trPr>
-        <w:tc>
-          <w:tcPr>
-            <w:tcW w:w="2552" w:type="dxa"/>
-            <w:vAlign w:val="center"/>
-          </w:tcPr>
-          <w:p>
-            <w:pPr>
-              <w:spacing w:after="0" w:line="480" w:lineRule="auto"/>
-              <w:ind w:left="0" w:firstLine="0"/>
-              <w:rPr>
-                <w:b/>
-                <w:bCs/>
-                <w:szCs w:val="24"/>
-              </w:rPr>
-            </w:pPr>
-            <w:r>
-              <w:rPr>
-                <w:b/>
-                <w:bCs/>
-                <w:szCs w:val="24"/>
-              </w:rPr>
-              <w:t>Test</w:t>
-            </w:r>
-          </w:p>
-        </w:tc>
-        <w:tc>
-          <w:tcPr>
-            <w:tcW w:w="709" w:type="dxa"/>
+        <w:tc>
+          <w:tcPr>
+            <w:tcW w:w="708" w:type="dxa"/>
           </w:tcPr>
           <w:p>
             <w:pPr>
@@ -25184,7 +25750,7 @@
         </w:tc>
         <w:tc>
           <w:tcPr>
-            <w:tcW w:w="708" w:type="dxa"/>
+            <w:tcW w:w="709" w:type="dxa"/>
           </w:tcPr>
           <w:p>
             <w:pPr>
@@ -25214,7 +25780,7 @@
         </w:tc>
         <w:tc>
           <w:tcPr>
-            <w:tcW w:w="709" w:type="dxa"/>
+            <w:tcW w:w="567" w:type="dxa"/>
           </w:tcPr>
           <w:p>
             <w:pPr>
@@ -25229,7 +25795,7 @@
         </w:tc>
         <w:tc>
           <w:tcPr>
-            <w:tcW w:w="709" w:type="dxa"/>
+            <w:tcW w:w="780" w:type="dxa"/>
           </w:tcPr>
           <w:p>
             <w:pPr>
@@ -25240,6 +25806,23 @@
                 <w:szCs w:val="24"/>
               </w:rPr>
             </w:pPr>
+          </w:p>
+        </w:tc>
+        <w:tc>
+          <w:tcPr>
+            <w:tcW w:w="780" w:type="dxa"/>
+          </w:tcPr>
+          <w:p>
+            <w:pPr>
+              <w:spacing w:after="0" w:line="480" w:lineRule="auto"/>
+              <w:ind w:left="0"/>
+              <w:jc w:val="center"/>
+              <w:rPr>
+                <w:noProof/>
+                <w:szCs w:val="24"/>
+                <w:lang w:val="en-PH" w:eastAsia="en-PH"/>
+              </w:rPr>
+            </w:pPr>
             <w:r>
               <w:rPr>
                 <w:b/>
@@ -25247,28 +25830,28 @@
                 <w:lang w:val="en-PH" w:eastAsia="en-PH"/>
               </w:rPr>
               <w:drawing>
-                <wp:anchor distT="0" distB="0" distL="114300" distR="114300" simplePos="0" relativeHeight="251701248" behindDoc="0" locked="0" layoutInCell="1" allowOverlap="1" wp14:anchorId="0E21F375" wp14:editId="687758D9">
+                <wp:anchor distT="0" distB="0" distL="114300" distR="114300" simplePos="0" relativeHeight="251815936" behindDoc="0" locked="0" layoutInCell="1" allowOverlap="1" wp14:anchorId="13B1FC8E" wp14:editId="7CDD783D">
                   <wp:simplePos x="0" y="0"/>
                   <wp:positionH relativeFrom="column">
-                    <wp:posOffset>-48260</wp:posOffset>
+                    <wp:posOffset>91796</wp:posOffset>
                   </wp:positionH>
                   <wp:positionV relativeFrom="paragraph">
-                    <wp:posOffset>81280</wp:posOffset>
+                    <wp:posOffset>27229</wp:posOffset>
                   </wp:positionV>
                   <wp:extent cx="115570" cy="330200"/>
                   <wp:effectExtent l="0" t="0" r="0" b="0"/>
                   <wp:wrapNone/>
-                  <wp:docPr id="1323294800" name="Picture 1016041909"/>
+                  <wp:docPr id="1924875300" name="Picture 1016041909"/>
                   <wp:cNvGraphicFramePr/>
                   <a:graphic xmlns:a="http://schemas.openxmlformats.org/drawingml/2006/main">
                     <a:graphicData uri="http://schemas.openxmlformats.org/drawingml/2006/picture">
                       <pic:pic xmlns:pic="http://schemas.openxmlformats.org/drawingml/2006/picture">
                         <pic:nvPicPr>
-                          <pic:cNvPr id="1323294800" name="Picture 1016041909"/>
+                          <pic:cNvPr id="1924875300" name="Picture 1016041909"/>
                           <pic:cNvPicPr/>
                         </pic:nvPicPr>
                         <pic:blipFill>
-                          <a:blip r:embed="rId17"/>
+                          <a:blip r:embed="rId19"/>
                           <a:stretch>
                             <a:fillRect/>
                           </a:stretch>
@@ -25288,68 +25871,6 @@
                 </wp:anchor>
               </w:drawing>
             </w:r>
-          </w:p>
-        </w:tc>
-        <w:tc>
-          <w:tcPr>
-            <w:tcW w:w="567" w:type="dxa"/>
-          </w:tcPr>
-          <w:p>
-            <w:pPr>
-              <w:spacing w:after="0" w:line="480" w:lineRule="auto"/>
-              <w:ind w:left="0"/>
-              <w:jc w:val="center"/>
-              <w:rPr>
-                <w:szCs w:val="24"/>
-              </w:rPr>
-            </w:pPr>
-            <w:r>
-              <w:rPr>
-                <w:noProof/>
-                <w:lang w:val="en-PH" w:eastAsia="en-PH"/>
-              </w:rPr>
-              <w:drawing>
-                <wp:anchor distT="0" distB="0" distL="114300" distR="114300" simplePos="0" relativeHeight="251706368" behindDoc="0" locked="0" layoutInCell="1" allowOverlap="1" wp14:anchorId="692C7B46" wp14:editId="2D2DA0A8">
-                  <wp:simplePos x="0" y="0"/>
-                  <wp:positionH relativeFrom="column">
-                    <wp:posOffset>184150</wp:posOffset>
-                  </wp:positionH>
-                  <wp:positionV relativeFrom="paragraph">
-                    <wp:posOffset>58420</wp:posOffset>
-                  </wp:positionV>
-                  <wp:extent cx="114935" cy="330835"/>
-                  <wp:effectExtent l="0" t="0" r="0" b="0"/>
-                  <wp:wrapNone/>
-                  <wp:docPr id="1506990476" name="Picture 2837"/>
-                  <wp:cNvGraphicFramePr/>
-                  <a:graphic xmlns:a="http://schemas.openxmlformats.org/drawingml/2006/main">
-                    <a:graphicData uri="http://schemas.openxmlformats.org/drawingml/2006/picture">
-                      <pic:pic xmlns:pic="http://schemas.openxmlformats.org/drawingml/2006/picture">
-                        <pic:nvPicPr>
-                          <pic:cNvPr id="1506990476" name="Picture 2837"/>
-                          <pic:cNvPicPr/>
-                        </pic:nvPicPr>
-                        <pic:blipFill>
-                          <a:blip r:embed="rId18"/>
-                          <a:stretch>
-                            <a:fillRect/>
-                          </a:stretch>
-                        </pic:blipFill>
-                        <pic:spPr>
-                          <a:xfrm>
-                            <a:off x="0" y="0"/>
-                            <a:ext cx="114935" cy="330835"/>
-                          </a:xfrm>
-                          <a:prstGeom prst="rect">
-                            <a:avLst/>
-                          </a:prstGeom>
-                        </pic:spPr>
-                      </pic:pic>
-                    </a:graphicData>
-                  </a:graphic>
-                </wp:anchor>
-              </w:drawing>
-            </w:r>
             <w:r>
               <w:rPr>
                 <w:noProof/>
@@ -25359,293 +25880,13 @@
               <mc:AlternateContent>
                 <mc:Choice Requires="wps">
                   <w:drawing>
-                    <wp:anchor distT="0" distB="0" distL="114300" distR="114300" simplePos="0" relativeHeight="251697152" behindDoc="0" locked="0" layoutInCell="1" allowOverlap="1" wp14:anchorId="1D4AC7CC" wp14:editId="5873E5D5">
+                    <wp:anchor distT="0" distB="0" distL="114300" distR="114300" simplePos="0" relativeHeight="251811840" behindDoc="0" locked="0" layoutInCell="1" allowOverlap="1" wp14:anchorId="55442F27" wp14:editId="0A0EBEFF">
                       <wp:simplePos x="0" y="0"/>
                       <wp:positionH relativeFrom="column">
-                        <wp:posOffset>-305435</wp:posOffset>
+                        <wp:posOffset>206452</wp:posOffset>
                       </wp:positionH>
                       <wp:positionV relativeFrom="paragraph">
-                        <wp:posOffset>147955</wp:posOffset>
-                      </wp:positionV>
-                      <wp:extent cx="492125" cy="144145"/>
-                      <wp:effectExtent l="0" t="0" r="22225" b="27305"/>
-                      <wp:wrapNone/>
-                      <wp:docPr id="701020955" name="Rectangle 12"/>
-                      <wp:cNvGraphicFramePr/>
-                      <a:graphic xmlns:a="http://schemas.openxmlformats.org/drawingml/2006/main">
-                        <a:graphicData uri="http://schemas.microsoft.com/office/word/2010/wordprocessingShape">
-                          <wps:wsp>
-                            <wps:cNvSpPr/>
-                            <wps:spPr>
-                              <a:xfrm>
-                                <a:off x="0" y="0"/>
-                                <a:ext cx="492287" cy="144145"/>
-                              </a:xfrm>
-                              <a:prstGeom prst="rect">
-                                <a:avLst/>
-                              </a:prstGeom>
-                            </wps:spPr>
-                            <wps:style>
-                              <a:lnRef idx="2">
-                                <a:schemeClr val="dk1">
-                                  <a:shade val="15000"/>
-                                </a:schemeClr>
-                              </a:lnRef>
-                              <a:fillRef idx="1">
-                                <a:schemeClr val="dk1"/>
-                              </a:fillRef>
-                              <a:effectRef idx="0">
-                                <a:schemeClr val="dk1"/>
-                              </a:effectRef>
-                              <a:fontRef idx="minor">
-                                <a:schemeClr val="lt1"/>
-                              </a:fontRef>
-                            </wps:style>
-                            <wps:bodyPr rot="0" spcFirstLastPara="0" vertOverflow="overflow" horzOverflow="overflow" vert="horz" wrap="square" lIns="91440" tIns="45720" rIns="91440" bIns="45720" numCol="1" spcCol="0" rtlCol="0" fromWordArt="0" anchor="ctr" anchorCtr="0" forceAA="0" compatLnSpc="1">
-                              <a:noAutofit/>
-                            </wps:bodyPr>
-                          </wps:wsp>
-                        </a:graphicData>
-                      </a:graphic>
-                    </wp:anchor>
-                  </w:drawing>
-                </mc:Choice>
-                <mc:Fallback>
-                  <w:pict>
-                    <v:rect w14:anchorId="552C2670" id="Rectangle 12" o:spid="_x0000_s1026" style="position:absolute;margin-left:-24.05pt;margin-top:11.65pt;width:38.75pt;height:11.35pt;z-index:251697152;visibility:visible;mso-wrap-style:square;mso-wrap-distance-left:9pt;mso-wrap-distance-top:0;mso-wrap-distance-right:9pt;mso-wrap-distance-bottom:0;mso-position-horizontal:absolute;mso-position-horizontal-relative:text;mso-position-vertical:absolute;mso-position-vertical-relative:text;v-text-anchor:middle" o:gfxdata="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" fillcolor="black [3200]" strokecolor="black [480]" strokeweight="1pt"/>
-                  </w:pict>
-                </mc:Fallback>
-              </mc:AlternateContent>
-            </w:r>
-          </w:p>
-        </w:tc>
-        <w:tc>
-          <w:tcPr>
-            <w:tcW w:w="780" w:type="dxa"/>
-          </w:tcPr>
-          <w:p>
-            <w:pPr>
-              <w:spacing w:after="0" w:line="480" w:lineRule="auto"/>
-              <w:ind w:left="0"/>
-              <w:jc w:val="center"/>
-              <w:rPr>
-                <w:szCs w:val="24"/>
-              </w:rPr>
-            </w:pPr>
-          </w:p>
-        </w:tc>
-      </w:tr>
-      <w:tr>
-        <w:trPr>
-          <w:trHeight w:val="774"/>
-        </w:trPr>
-        <w:tc>
-          <w:tcPr>
-            <w:tcW w:w="2552" w:type="dxa"/>
-            <w:vAlign w:val="center"/>
-          </w:tcPr>
-          <w:p>
-            <w:pPr>
-              <w:spacing w:after="0" w:line="480" w:lineRule="auto"/>
-              <w:ind w:left="0" w:firstLine="0"/>
-              <w:rPr>
-                <w:b/>
-                <w:bCs/>
-                <w:szCs w:val="24"/>
-              </w:rPr>
-            </w:pPr>
-            <w:r>
-              <w:rPr>
-                <w:b/>
-                <w:bCs/>
-                <w:szCs w:val="24"/>
-              </w:rPr>
-              <w:t>Finalizing</w:t>
-            </w:r>
-          </w:p>
-        </w:tc>
-        <w:tc>
-          <w:tcPr>
-            <w:tcW w:w="709" w:type="dxa"/>
-          </w:tcPr>
-          <w:p>
-            <w:pPr>
-              <w:spacing w:after="0" w:line="480" w:lineRule="auto"/>
-              <w:ind w:left="0"/>
-              <w:jc w:val="center"/>
-              <w:rPr>
-                <w:szCs w:val="24"/>
-              </w:rPr>
-            </w:pPr>
-          </w:p>
-        </w:tc>
-        <w:tc>
-          <w:tcPr>
-            <w:tcW w:w="709" w:type="dxa"/>
-          </w:tcPr>
-          <w:p>
-            <w:pPr>
-              <w:spacing w:after="0" w:line="480" w:lineRule="auto"/>
-              <w:ind w:left="0"/>
-              <w:jc w:val="center"/>
-              <w:rPr>
-                <w:szCs w:val="24"/>
-              </w:rPr>
-            </w:pPr>
-          </w:p>
-        </w:tc>
-        <w:tc>
-          <w:tcPr>
-            <w:tcW w:w="708" w:type="dxa"/>
-          </w:tcPr>
-          <w:p>
-            <w:pPr>
-              <w:spacing w:after="0" w:line="480" w:lineRule="auto"/>
-              <w:ind w:left="0"/>
-              <w:jc w:val="center"/>
-              <w:rPr>
-                <w:szCs w:val="24"/>
-              </w:rPr>
-            </w:pPr>
-          </w:p>
-        </w:tc>
-        <w:tc>
-          <w:tcPr>
-            <w:tcW w:w="709" w:type="dxa"/>
-          </w:tcPr>
-          <w:p>
-            <w:pPr>
-              <w:spacing w:after="0" w:line="480" w:lineRule="auto"/>
-              <w:ind w:left="0"/>
-              <w:jc w:val="center"/>
-              <w:rPr>
-                <w:szCs w:val="24"/>
-              </w:rPr>
-            </w:pPr>
-          </w:p>
-        </w:tc>
-        <w:tc>
-          <w:tcPr>
-            <w:tcW w:w="709" w:type="dxa"/>
-          </w:tcPr>
-          <w:p>
-            <w:pPr>
-              <w:spacing w:after="0" w:line="480" w:lineRule="auto"/>
-              <w:ind w:left="0"/>
-              <w:jc w:val="center"/>
-              <w:rPr>
-                <w:szCs w:val="24"/>
-              </w:rPr>
-            </w:pPr>
-          </w:p>
-        </w:tc>
-        <w:tc>
-          <w:tcPr>
-            <w:tcW w:w="709" w:type="dxa"/>
-          </w:tcPr>
-          <w:p>
-            <w:pPr>
-              <w:spacing w:after="0" w:line="480" w:lineRule="auto"/>
-              <w:ind w:left="0"/>
-              <w:jc w:val="center"/>
-              <w:rPr>
-                <w:szCs w:val="24"/>
-              </w:rPr>
-            </w:pPr>
-          </w:p>
-        </w:tc>
-        <w:tc>
-          <w:tcPr>
-            <w:tcW w:w="567" w:type="dxa"/>
-          </w:tcPr>
-          <w:p>
-            <w:pPr>
-              <w:spacing w:after="0" w:line="480" w:lineRule="auto"/>
-              <w:ind w:left="0"/>
-              <w:jc w:val="center"/>
-              <w:rPr>
-                <w:szCs w:val="24"/>
-              </w:rPr>
-            </w:pPr>
-            <w:r>
-              <w:rPr>
-                <w:b/>
-                <w:noProof/>
-                <w:lang w:val="en-PH" w:eastAsia="en-PH"/>
-              </w:rPr>
-              <w:drawing>
-                <wp:anchor distT="0" distB="0" distL="114300" distR="114300" simplePos="0" relativeHeight="251702272" behindDoc="0" locked="0" layoutInCell="1" allowOverlap="1" wp14:anchorId="13B1FC8E" wp14:editId="45987E29">
-                  <wp:simplePos x="0" y="0"/>
-                  <wp:positionH relativeFrom="column">
-                    <wp:posOffset>-34290</wp:posOffset>
-                  </wp:positionH>
-                  <wp:positionV relativeFrom="paragraph">
-                    <wp:posOffset>115570</wp:posOffset>
-                  </wp:positionV>
-                  <wp:extent cx="115570" cy="330200"/>
-                  <wp:effectExtent l="0" t="0" r="0" b="0"/>
-                  <wp:wrapNone/>
-                  <wp:docPr id="1924875300" name="Picture 1016041909"/>
-                  <wp:cNvGraphicFramePr/>
-                  <a:graphic xmlns:a="http://schemas.openxmlformats.org/drawingml/2006/main">
-                    <a:graphicData uri="http://schemas.openxmlformats.org/drawingml/2006/picture">
-                      <pic:pic xmlns:pic="http://schemas.openxmlformats.org/drawingml/2006/picture">
-                        <pic:nvPicPr>
-                          <pic:cNvPr id="1924875300" name="Picture 1016041909"/>
-                          <pic:cNvPicPr/>
-                        </pic:nvPicPr>
-                        <pic:blipFill>
-                          <a:blip r:embed="rId17"/>
-                          <a:stretch>
-                            <a:fillRect/>
-                          </a:stretch>
-                        </pic:blipFill>
-                        <pic:spPr>
-                          <a:xfrm>
-                            <a:off x="0" y="0"/>
-                            <a:ext cx="115570" cy="330200"/>
-                          </a:xfrm>
-                          <a:prstGeom prst="rect">
-                            <a:avLst/>
-                          </a:prstGeom>
-                        </pic:spPr>
-                      </pic:pic>
-                    </a:graphicData>
-                  </a:graphic>
-                </wp:anchor>
-              </w:drawing>
-            </w:r>
-          </w:p>
-        </w:tc>
-        <w:tc>
-          <w:tcPr>
-            <w:tcW w:w="780" w:type="dxa"/>
-          </w:tcPr>
-          <w:p>
-            <w:pPr>
-              <w:spacing w:after="0" w:line="480" w:lineRule="auto"/>
-              <w:ind w:left="0"/>
-              <w:jc w:val="center"/>
-              <w:rPr>
-                <w:szCs w:val="24"/>
-              </w:rPr>
-            </w:pPr>
-            <w:r>
-              <w:rPr>
-                <w:noProof/>
-                <w:szCs w:val="24"/>
-                <w:lang w:val="en-PH" w:eastAsia="en-PH"/>
-              </w:rPr>
-              <mc:AlternateContent>
-                <mc:Choice Requires="wps">
-                  <w:drawing>
-                    <wp:anchor distT="0" distB="0" distL="114300" distR="114300" simplePos="0" relativeHeight="251698176" behindDoc="0" locked="0" layoutInCell="1" allowOverlap="1" wp14:anchorId="55442F27" wp14:editId="71450161">
-                      <wp:simplePos x="0" y="0"/>
-                      <wp:positionH relativeFrom="column">
-                        <wp:posOffset>-256698</wp:posOffset>
-                      </wp:positionH>
-                      <wp:positionV relativeFrom="paragraph">
-                        <wp:posOffset>181709</wp:posOffset>
+                        <wp:posOffset>130404</wp:posOffset>
                       </wp:positionV>
                       <wp:extent cx="432147" cy="144145"/>
                       <wp:effectExtent l="0" t="0" r="25400" b="27305"/>
@@ -25695,24 +25936,41 @@
                 </mc:Choice>
                 <mc:Fallback>
                   <w:pict>
-                    <v:rect w14:anchorId="787DE10A" id="Rectangle 12" o:spid="_x0000_s1026" style="position:absolute;margin-left:-20.2pt;margin-top:14.3pt;width:34.05pt;height:11.35pt;z-index:251698176;visibility:visible;mso-wrap-style:square;mso-width-percent:0;mso-wrap-distance-left:9pt;mso-wrap-distance-top:0;mso-wrap-distance-right:9pt;mso-wrap-distance-bottom:0;mso-position-horizontal:absolute;mso-position-horizontal-relative:text;mso-position-vertical:absolute;mso-position-vertical-relative:text;mso-width-percent:0;mso-width-relative:margin;v-text-anchor:middle" o:gfxdata="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" fillcolor="black [3200]" strokecolor="black [480]" strokeweight="1pt"/>
+                    <v:rect w14:anchorId="280E63C5" id="Rectangle 12" o:spid="_x0000_s1026" style="position:absolute;margin-left:16.25pt;margin-top:10.25pt;width:34.05pt;height:11.35pt;z-index:251811840;visibility:visible;mso-wrap-style:square;mso-width-percent:0;mso-wrap-distance-left:9pt;mso-wrap-distance-top:0;mso-wrap-distance-right:9pt;mso-wrap-distance-bottom:0;mso-position-horizontal:absolute;mso-position-horizontal-relative:text;mso-position-vertical:absolute;mso-position-vertical-relative:text;mso-width-percent:0;mso-width-relative:margin;v-text-anchor:middle" o:gfxdata="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" fillcolor="black [3200]" strokecolor="black [480]" strokeweight="1pt"/>
                   </w:pict>
                 </mc:Fallback>
               </mc:AlternateContent>
             </w:r>
+          </w:p>
+        </w:tc>
+        <w:tc>
+          <w:tcPr>
+            <w:tcW w:w="780" w:type="dxa"/>
+          </w:tcPr>
+          <w:p>
+            <w:pPr>
+              <w:spacing w:after="0" w:line="480" w:lineRule="auto"/>
+              <w:ind w:left="0"/>
+              <w:jc w:val="center"/>
+              <w:rPr>
+                <w:noProof/>
+                <w:szCs w:val="24"/>
+                <w:lang w:val="en-PH" w:eastAsia="en-PH"/>
+              </w:rPr>
+            </w:pPr>
             <w:r>
               <w:rPr>
                 <w:noProof/>
                 <w:lang w:val="en-PH" w:eastAsia="en-PH"/>
               </w:rPr>
               <w:drawing>
-                <wp:anchor distT="0" distB="0" distL="114300" distR="114300" simplePos="0" relativeHeight="251707392" behindDoc="0" locked="0" layoutInCell="1" allowOverlap="1" wp14:anchorId="653D4DEB" wp14:editId="4A791DE1">
+                <wp:anchor distT="0" distB="0" distL="114300" distR="114300" simplePos="0" relativeHeight="251821056" behindDoc="0" locked="0" layoutInCell="1" allowOverlap="1" wp14:anchorId="653D4DEB" wp14:editId="386B40C5">
                   <wp:simplePos x="0" y="0"/>
                   <wp:positionH relativeFrom="column">
-                    <wp:posOffset>176530</wp:posOffset>
+                    <wp:posOffset>136906</wp:posOffset>
                   </wp:positionH>
                   <wp:positionV relativeFrom="paragraph">
-                    <wp:posOffset>115570</wp:posOffset>
+                    <wp:posOffset>71679</wp:posOffset>
                   </wp:positionV>
                   <wp:extent cx="114935" cy="330835"/>
                   <wp:effectExtent l="0" t="0" r="0" b="0"/>
@@ -25727,7 +25985,7 @@
                           <pic:cNvPicPr/>
                         </pic:nvPicPr>
                         <pic:blipFill>
-                          <a:blip r:embed="rId18"/>
+                          <a:blip r:embed="rId20"/>
                           <a:stretch>
                             <a:fillRect/>
                           </a:stretch>
@@ -25807,7 +26065,7 @@
                     <pic:cNvPicPr/>
                   </pic:nvPicPr>
                   <pic:blipFill>
-                    <a:blip r:embed="rId17"/>
+                    <a:blip r:embed="rId19"/>
                     <a:stretch>
                       <a:fillRect/>
                     </a:stretch>
@@ -25946,7 +26204,7 @@
                     <pic:cNvPicPr/>
                   </pic:nvPicPr>
                   <pic:blipFill>
-                    <a:blip r:embed="rId19"/>
+                    <a:blip r:embed="rId21"/>
                     <a:stretch>
                       <a:fillRect/>
                     </a:stretch>
@@ -26028,7 +26286,7 @@
           </mc:Choice>
           <mc:Fallback>
             <w:pict>
-              <v:rect w14:anchorId="3DB08D0D" id="Rectangle 2827" o:spid="_x0000_s1146" style="position:absolute;left:0;text-align:left;margin-left:85.65pt;margin-top:36.05pt;width:4pt;height:14.5pt;z-index:251710464;visibility:visible;mso-wrap-style:square;mso-wrap-distance-left:9pt;mso-wrap-distance-top:0;mso-wrap-distance-right:9pt;mso-wrap-distance-bottom:0;mso-position-horizontal:absolute;mso-position-horizontal-relative:text;mso-position-vertical:absolute;mso-position-vertical-relative:text;v-text-anchor:top" o:gfxdata="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" filled="f" stroked="f">
+              <v:rect w14:anchorId="3DB08D0D" id="Rectangle 2827" o:spid="_x0000_s1143" style="position:absolute;left:0;text-align:left;margin-left:85.65pt;margin-top:36.05pt;width:4pt;height:14.5pt;z-index:251710464;visibility:visible;mso-wrap-style:square;mso-wrap-distance-left:9pt;mso-wrap-distance-top:0;mso-wrap-distance-right:9pt;mso-wrap-distance-bottom:0;mso-position-horizontal:absolute;mso-position-horizontal-relative:text;mso-position-vertical:absolute;mso-position-vertical-relative:text;v-text-anchor:top" o:gfxdata="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" filled="f" stroked="f">
                 <v:textbox inset="0,0,0,0">
                   <w:txbxContent>
                     <w:p>
@@ -26076,7 +26334,7 @@
                     <pic:cNvPicPr/>
                   </pic:nvPicPr>
                   <pic:blipFill>
-                    <a:blip r:embed="rId20"/>
+                    <a:blip r:embed="rId22"/>
                     <a:stretch>
                       <a:fillRect/>
                     </a:stretch>
@@ -26158,7 +26416,7 @@
           </mc:Choice>
           <mc:Fallback>
             <w:pict>
-              <v:rect w14:anchorId="0431BBCE" id="Rectangle 2830" o:spid="_x0000_s1147" style="position:absolute;left:0;text-align:left;margin-left:94.6pt;margin-top:37.6pt;width:4pt;height:14.5pt;z-index:251712512;visibility:visible;mso-wrap-style:square;mso-wrap-distance-left:9pt;mso-wrap-distance-top:0;mso-wrap-distance-right:9pt;mso-wrap-distance-bottom:0;mso-position-horizontal:absolute;mso-position-horizontal-relative:text;mso-position-vertical:absolute;mso-position-vertical-relative:text;v-text-anchor:top" o:gfxdata="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" filled="f" stroked="f">
+              <v:rect w14:anchorId="0431BBCE" id="Rectangle 2830" o:spid="_x0000_s1144" style="position:absolute;left:0;text-align:left;margin-left:94.6pt;margin-top:37.6pt;width:4pt;height:14.5pt;z-index:251712512;visibility:visible;mso-wrap-style:square;mso-wrap-distance-left:9pt;mso-wrap-distance-top:0;mso-wrap-distance-right:9pt;mso-wrap-distance-bottom:0;mso-position-horizontal:absolute;mso-position-horizontal-relative:text;mso-position-vertical:absolute;mso-position-vertical-relative:text;v-text-anchor:top" o:gfxdata="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" filled="f" stroked="f">
                 <v:textbox inset="0,0,0,0">
                   <w:txbxContent>
                     <w:p>
@@ -26241,7 +26499,7 @@
           </mc:Choice>
           <mc:Fallback>
             <w:pict>
-              <v:rect w14:anchorId="768604D2" id="Rectangle 2831" o:spid="_x0000_s1148" style="position:absolute;left:0;text-align:left;margin-left:97.6pt;margin-top:35.2pt;width:4pt;height:17.65pt;z-index:251713536;visibility:visible;mso-wrap-style:square;mso-wrap-distance-left:9pt;mso-wrap-distance-top:0;mso-wrap-distance-right:9pt;mso-wrap-distance-bottom:0;mso-position-horizontal:absolute;mso-position-horizontal-relative:text;mso-position-vertical:absolute;mso-position-vertical-relative:text;v-text-anchor:top" o:gfxdata="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" filled="f" stroked="f">
+              <v:rect w14:anchorId="768604D2" id="Rectangle 2831" o:spid="_x0000_s1145" style="position:absolute;left:0;text-align:left;margin-left:97.6pt;margin-top:35.2pt;width:4pt;height:17.65pt;z-index:251713536;visibility:visible;mso-wrap-style:square;mso-wrap-distance-left:9pt;mso-wrap-distance-top:0;mso-wrap-distance-right:9pt;mso-wrap-distance-bottom:0;mso-position-horizontal:absolute;mso-position-horizontal-relative:text;mso-position-vertical:absolute;mso-position-vertical-relative:text;v-text-anchor:top" o:gfxdata="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" filled="f" stroked="f">
                 <v:textbox inset="0,0,0,0">
                   <w:txbxContent>
                     <w:p>
@@ -26298,7 +26556,7 @@
                     <pic:cNvPicPr/>
                   </pic:nvPicPr>
                   <pic:blipFill>
-                    <a:blip r:embed="rId18"/>
+                    <a:blip r:embed="rId20"/>
                     <a:stretch>
                       <a:fillRect/>
                     </a:stretch>
@@ -26345,7 +26603,7 @@
                     <pic:cNvPicPr/>
                   </pic:nvPicPr>
                   <pic:blipFill>
-                    <a:blip r:embed="rId20"/>
+                    <a:blip r:embed="rId22"/>
                     <a:stretch>
                       <a:fillRect/>
                     </a:stretch>
@@ -26427,7 +26685,7 @@
           </mc:Choice>
           <mc:Fallback>
             <w:pict>
-              <v:rect w14:anchorId="2BB9B42B" id="Rectangle 2834" o:spid="_x0000_s1149" style="position:absolute;left:0;text-align:left;margin-left:94.75pt;margin-top:30.55pt;width:4pt;height:14.5pt;z-index:251715584;visibility:visible;mso-wrap-style:square;mso-wrap-distance-left:9pt;mso-wrap-distance-top:0;mso-wrap-distance-right:9pt;mso-wrap-distance-bottom:0;mso-position-horizontal:absolute;mso-position-horizontal-relative:text;mso-position-vertical:absolute;mso-position-vertical-relative:text;v-text-anchor:top" o:gfxdata="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" filled="f" stroked="f">
+              <v:rect w14:anchorId="2BB9B42B" id="Rectangle 2834" o:spid="_x0000_s1146" style="position:absolute;left:0;text-align:left;margin-left:94.75pt;margin-top:30.55pt;width:4pt;height:14.5pt;z-index:251715584;visibility:visible;mso-wrap-style:square;mso-wrap-distance-left:9pt;mso-wrap-distance-top:0;mso-wrap-distance-right:9pt;mso-wrap-distance-bottom:0;mso-position-horizontal:absolute;mso-position-horizontal-relative:text;mso-position-vertical:absolute;mso-position-vertical-relative:text;v-text-anchor:top" o:gfxdata="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" filled="f" stroked="f">
                 <v:textbox inset="0,0,0,0">
                   <w:txbxContent>
                     <w:p>
@@ -26510,7 +26768,7 @@
           </mc:Choice>
           <mc:Fallback>
             <w:pict>
-              <v:rect w14:anchorId="08EC73EE" id="Rectangle 2835" o:spid="_x0000_s1150" style="position:absolute;left:0;text-align:left;margin-left:97.75pt;margin-top:28.15pt;width:4pt;height:17.65pt;z-index:251716608;visibility:visible;mso-wrap-style:square;mso-wrap-distance-left:9pt;mso-wrap-distance-top:0;mso-wrap-distance-right:9pt;mso-wrap-distance-bottom:0;mso-position-horizontal:absolute;mso-position-horizontal-relative:text;mso-position-vertical:absolute;mso-position-vertical-relative:text;v-text-anchor:top" o:gfxdata="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" filled="f" stroked="f">
+              <v:rect w14:anchorId="08EC73EE" id="Rectangle 2835" o:spid="_x0000_s1147" style="position:absolute;left:0;text-align:left;margin-left:97.75pt;margin-top:28.15pt;width:4pt;height:17.65pt;z-index:251716608;visibility:visible;mso-wrap-style:square;mso-wrap-distance-left:9pt;mso-wrap-distance-top:0;mso-wrap-distance-right:9pt;mso-wrap-distance-bottom:0;mso-position-horizontal:absolute;mso-position-horizontal-relative:text;mso-position-vertical:absolute;mso-position-vertical-relative:text;v-text-anchor:top" o:gfxdata="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" filled="f" stroked="f">
                 <v:textbox inset="0,0,0,0">
                   <w:txbxContent>
                     <w:p>
@@ -26550,8 +26808,11 @@
         <w:ind w:left="0" w:firstLine="720"/>
       </w:pPr>
       <w:r>
+        <w:t xml:space="preserve">The planning phase started in January and continued until March, followed by the development phase, which spanned from early April through May. Each task was marked </w:t>
+      </w:r>
+      <w:r>
         <w:lastRenderedPageBreak/>
-        <w:t>The planning phase started in January and continued until March, followed by the development phase, which spanned from early April through May. Each task was marked by solid bars, with arrows indicating the start and end points. This structured timeline helps visualize the project`s progress, highlight dependencies, and ensure that each phase transitions smoothly into the next, ultimately aiding in effective project management</w:t>
+        <w:t>by solid bars, with arrows indicating the start and end points. This structured timeline helps visualize the project`s progress, highlight dependencies, and ensure that each phase transitions smoothly into the next, ultimately aiding in effective project management</w:t>
       </w:r>
     </w:p>
     <w:p>
@@ -26636,7 +26897,7 @@
       </w:tblPr>
       <w:tblGrid>
         <w:gridCol w:w="6030"/>
-        <w:gridCol w:w="1010"/>
+        <w:gridCol w:w="1023"/>
       </w:tblGrid>
       <w:tr>
         <w:trPr>
@@ -26716,7 +26977,7 @@
               <w:rPr>
                 <w:b/>
               </w:rPr>
-              <w:t xml:space="preserve">Node</w:t>
+              <w:t>Node</w:t>
             </w:r>
           </w:p>
         </w:tc>
@@ -26735,7 +26996,7 @@
               <w:ind w:left="0" w:firstLine="0"/>
             </w:pPr>
             <w:r>
-              <w:t xml:space="preserve">Adafruit RFM95 LoRa</w:t>
+              <w:t>Adafruit RFM95 LoRa</w:t>
             </w:r>
           </w:p>
         </w:tc>
@@ -26750,7 +27011,7 @@
               <w:jc w:val="right"/>
             </w:pPr>
             <w:r>
-              <w:t xml:space="preserve">₱ 2,500</w:t>
+              <w:t>₱ 2,500</w:t>
             </w:r>
           </w:p>
         </w:tc>
@@ -26769,7 +27030,7 @@
               <w:ind w:left="0" w:firstLine="0"/>
             </w:pPr>
             <w:r>
-              <w:t xml:space="preserve">Mini magnets</w:t>
+              <w:t>Mini magnets</w:t>
             </w:r>
           </w:p>
         </w:tc>
@@ -26784,7 +27045,7 @@
               <w:jc w:val="right"/>
             </w:pPr>
             <w:r>
-              <w:t xml:space="preserve">₱ 100</w:t>
+              <w:t>₱ 100</w:t>
             </w:r>
           </w:p>
         </w:tc>
@@ -26803,7 +27064,7 @@
               <w:ind w:left="0" w:firstLine="0"/>
             </w:pPr>
             <w:r>
-              <w:t xml:space="preserve">Meshtastic 915 MHz LoRa antenna</w:t>
+              <w:t>Meshtastic 915 MHz LoRa antenna</w:t>
             </w:r>
           </w:p>
         </w:tc>
@@ -26818,7 +27079,7 @@
               <w:jc w:val="right"/>
             </w:pPr>
             <w:r>
-              <w:t xml:space="preserve">₱ 300</w:t>
+              <w:t>₱ 300</w:t>
             </w:r>
           </w:p>
         </w:tc>
@@ -26837,7 +27098,7 @@
               <w:ind w:left="0" w:firstLine="0"/>
             </w:pPr>
             <w:r>
-              <w:t xml:space="preserve">Reed switch</w:t>
+              <w:t>Reed switch</w:t>
             </w:r>
           </w:p>
         </w:tc>
@@ -26852,7 +27113,7 @@
               <w:jc w:val="right"/>
             </w:pPr>
             <w:r>
-              <w:t xml:space="preserve">₱ 200</w:t>
+              <w:t>₱ 200</w:t>
             </w:r>
           </w:p>
         </w:tc>
@@ -26871,7 +27132,7 @@
               <w:ind w:left="0" w:firstLine="0"/>
             </w:pPr>
             <w:r>
-              <w:t xml:space="preserve">MCP73871 power boost</w:t>
+              <w:t>MCP73871 power boost</w:t>
             </w:r>
           </w:p>
         </w:tc>
@@ -26886,7 +27147,7 @@
               <w:jc w:val="right"/>
             </w:pPr>
             <w:r>
-              <w:t xml:space="preserve">₱ 300</w:t>
+              <w:t>₱ 300</w:t>
             </w:r>
           </w:p>
         </w:tc>
@@ -26905,7 +27166,7 @@
               <w:ind w:left="0" w:firstLine="0"/>
             </w:pPr>
             <w:r>
-              <w:t xml:space="preserve">UART 7.5 m waterproof ultrasonic sensor</w:t>
+              <w:t>UART 7.5 m waterproof ultrasonic sensor</w:t>
             </w:r>
           </w:p>
         </w:tc>
@@ -26920,7 +27181,7 @@
               <w:jc w:val="right"/>
             </w:pPr>
             <w:r>
-              <w:t xml:space="preserve">₱ 1,500</w:t>
+              <w:t>₱ 1,500</w:t>
             </w:r>
           </w:p>
         </w:tc>
@@ -26939,7 +27200,7 @@
               <w:ind w:left="0" w:firstLine="0"/>
             </w:pPr>
             <w:r>
-              <w:t xml:space="preserve">3.5 W solar panel</w:t>
+              <w:t>3.5 W solar panel</w:t>
             </w:r>
           </w:p>
         </w:tc>
@@ -26954,7 +27215,7 @@
               <w:jc w:val="right"/>
             </w:pPr>
             <w:r>
-              <w:t xml:space="preserve">₱ 200</w:t>
+              <w:t>₱ 200</w:t>
             </w:r>
           </w:p>
         </w:tc>
@@ -26973,7 +27234,7 @@
               <w:ind w:left="0" w:firstLine="0"/>
             </w:pPr>
             <w:r>
-              <w:t xml:space="preserve">3.7 V 10 Ah battery</w:t>
+              <w:t>3.7 V 10 Ah battery</w:t>
             </w:r>
           </w:p>
         </w:tc>
@@ -26988,7 +27249,7 @@
               <w:jc w:val="right"/>
             </w:pPr>
             <w:r>
-              <w:t xml:space="preserve">₱ 220</w:t>
+              <w:t>₱ 220</w:t>
             </w:r>
           </w:p>
         </w:tc>
@@ -27007,7 +27268,7 @@
               <w:ind w:left="0" w:firstLine="0"/>
             </w:pPr>
             <w:r>
-              <w:t xml:space="preserve">Enclosure box</w:t>
+              <w:t>Enclosure box</w:t>
             </w:r>
           </w:p>
         </w:tc>
@@ -27022,7 +27283,7 @@
               <w:jc w:val="right"/>
             </w:pPr>
             <w:r>
-              <w:t xml:space="preserve">₱ 250</w:t>
+              <w:t>₱ 250</w:t>
             </w:r>
           </w:p>
         </w:tc>
@@ -27041,7 +27302,7 @@
               <w:ind w:left="0" w:firstLine="0"/>
             </w:pPr>
             <w:r>
-              <w:t xml:space="preserve">PVC pipe</w:t>
+              <w:t>PVC pipe</w:t>
             </w:r>
           </w:p>
         </w:tc>
@@ -27056,7 +27317,7 @@
               <w:jc w:val="right"/>
             </w:pPr>
             <w:r>
-              <w:t xml:space="preserve">₱ 1,000</w:t>
+              <w:t>₱ 1,000</w:t>
             </w:r>
           </w:p>
         </w:tc>
@@ -27075,7 +27336,7 @@
               <w:ind w:left="0" w:firstLine="0"/>
             </w:pPr>
             <w:r>
-              <w:t xml:space="preserve">Housing materials</w:t>
+              <w:t>Housing materials</w:t>
             </w:r>
           </w:p>
         </w:tc>
@@ -27090,7 +27351,7 @@
               <w:jc w:val="right"/>
             </w:pPr>
             <w:r>
-              <w:t xml:space="preserve">₱ 500</w:t>
+              <w:t>₱ 500</w:t>
             </w:r>
           </w:p>
         </w:tc>
@@ -27119,7 +27380,8 @@
               <w:rPr>
                 <w:b/>
               </w:rPr>
-              <w:t xml:space="preserve">Subtotal - Node</w:t>
+              <w:lastRenderedPageBreak/>
+              <w:t>Subtotal - Node</w:t>
             </w:r>
           </w:p>
         </w:tc>
@@ -27144,7 +27406,7 @@
               <w:rPr>
                 <w:b/>
               </w:rPr>
-              <w:t xml:space="preserve">₱7,070</w:t>
+              <w:t>₱7,070</w:t>
             </w:r>
           </w:p>
         </w:tc>
@@ -27174,7 +27436,7 @@
               <w:rPr>
                 <w:b/>
               </w:rPr>
-              <w:t xml:space="preserve">Edge</w:t>
+              <w:t>Edge</w:t>
             </w:r>
           </w:p>
         </w:tc>
@@ -27193,7 +27455,7 @@
               <w:ind w:left="0" w:firstLine="0"/>
             </w:pPr>
             <w:r>
-              <w:t xml:space="preserve">Meshtastic 915 MHz LoRa antenna</w:t>
+              <w:t>Meshtastic 915 MHz LoRa antenna</w:t>
             </w:r>
           </w:p>
         </w:tc>
@@ -27208,7 +27470,7 @@
               <w:jc w:val="right"/>
             </w:pPr>
             <w:r>
-              <w:t xml:space="preserve">₱ 300</w:t>
+              <w:t>₱ 300</w:t>
             </w:r>
           </w:p>
         </w:tc>
@@ -27227,7 +27489,7 @@
               <w:ind w:left="0" w:firstLine="0"/>
             </w:pPr>
             <w:r>
-              <w:t xml:space="preserve">52Pi RPi5 power expansion board</w:t>
+              <w:t>52Pi RPi5 power expansion board</w:t>
             </w:r>
           </w:p>
         </w:tc>
@@ -27242,7 +27504,7 @@
               <w:jc w:val="right"/>
             </w:pPr>
             <w:r>
-              <w:t xml:space="preserve">₱ 1,600</w:t>
+              <w:t>₱ 1,600</w:t>
             </w:r>
           </w:p>
         </w:tc>
@@ -27261,7 +27523,7 @@
               <w:ind w:left="0" w:firstLine="0"/>
             </w:pPr>
             <w:r>
-              <w:t xml:space="preserve">Micro SD card</w:t>
+              <w:t>Micro SD card</w:t>
             </w:r>
           </w:p>
         </w:tc>
@@ -27276,7 +27538,7 @@
               <w:jc w:val="right"/>
             </w:pPr>
             <w:r>
-              <w:t xml:space="preserve">₱ 750</w:t>
+              <w:t>₱ 750</w:t>
             </w:r>
           </w:p>
         </w:tc>
@@ -27295,7 +27557,7 @@
               <w:ind w:left="0" w:firstLine="0"/>
             </w:pPr>
             <w:r>
-              <w:t xml:space="preserve">RPi5 active cooler</w:t>
+              <w:t>RPi5 active cooler</w:t>
             </w:r>
           </w:p>
         </w:tc>
@@ -27310,7 +27572,7 @@
               <w:jc w:val="right"/>
             </w:pPr>
             <w:r>
-              <w:t xml:space="preserve">₱ 250</w:t>
+              <w:t>₱ 250</w:t>
             </w:r>
           </w:p>
         </w:tc>
@@ -27329,7 +27591,7 @@
               <w:ind w:left="0" w:firstLine="0"/>
             </w:pPr>
             <w:r>
-              <w:t xml:space="preserve">Raspberry Pi 5 2 GB board</w:t>
+              <w:t>Raspberry Pi 5 2 GB board</w:t>
             </w:r>
           </w:p>
         </w:tc>
@@ -27344,7 +27606,7 @@
               <w:jc w:val="right"/>
             </w:pPr>
             <w:r>
-              <w:t xml:space="preserve">₱ 6,500</w:t>
+              <w:t>₱ 6,500</w:t>
             </w:r>
           </w:p>
         </w:tc>
@@ -27363,7 +27625,7 @@
               <w:ind w:left="0" w:firstLine="0"/>
             </w:pPr>
             <w:r>
-              <w:t xml:space="preserve">12 V 12 Ah LiFePO4 battery pack</w:t>
+              <w:t>12 V 12 Ah LiFePO4 battery pack</w:t>
             </w:r>
           </w:p>
         </w:tc>
@@ -27378,7 +27640,7 @@
               <w:jc w:val="right"/>
             </w:pPr>
             <w:r>
-              <w:t xml:space="preserve">₱ 2,220</w:t>
+              <w:t>₱ 2,220</w:t>
             </w:r>
           </w:p>
         </w:tc>
@@ -27397,7 +27659,7 @@
               <w:ind w:left="0" w:firstLine="0"/>
             </w:pPr>
             <w:r>
-              <w:t xml:space="preserve">LoRa RFM95W transceiver board</w:t>
+              <w:t>LoRa RFM95W transceiver board</w:t>
             </w:r>
           </w:p>
         </w:tc>
@@ -27412,7 +27674,7 @@
               <w:jc w:val="right"/>
             </w:pPr>
             <w:r>
-              <w:t xml:space="preserve">₱ 2,000</w:t>
+              <w:t>₱ 2,000</w:t>
             </w:r>
           </w:p>
         </w:tc>
@@ -27431,7 +27693,7 @@
               <w:ind w:left="0" w:firstLine="0"/>
             </w:pPr>
             <w:r>
-              <w:t xml:space="preserve">60 W solar panel with controller</w:t>
+              <w:t>60 W solar panel with controller</w:t>
             </w:r>
           </w:p>
         </w:tc>
@@ -27446,7 +27708,7 @@
               <w:jc w:val="right"/>
             </w:pPr>
             <w:r>
-              <w:t xml:space="preserve">₱ 1,900</w:t>
+              <w:t>₱ 1,900</w:t>
             </w:r>
           </w:p>
         </w:tc>
@@ -27465,7 +27727,7 @@
               <w:ind w:left="0" w:firstLine="0"/>
             </w:pPr>
             <w:r>
-              <w:t xml:space="preserve">SIMCOM A7608e-H</w:t>
+              <w:t>SIMCOM A7608e-H</w:t>
             </w:r>
           </w:p>
         </w:tc>
@@ -27480,7 +27742,7 @@
               <w:jc w:val="right"/>
             </w:pPr>
             <w:r>
-              <w:t xml:space="preserve">₱ 1,530</w:t>
+              <w:t>₱ 1,530</w:t>
             </w:r>
           </w:p>
         </w:tc>
@@ -27499,7 +27761,7 @@
               <w:ind w:left="0" w:firstLine="0"/>
             </w:pPr>
             <w:r>
-              <w:t xml:space="preserve">SMS load (yearly)</w:t>
+              <w:t>SMS load (yearly)</w:t>
             </w:r>
           </w:p>
         </w:tc>
@@ -27514,7 +27776,7 @@
               <w:jc w:val="right"/>
             </w:pPr>
             <w:r>
-              <w:t xml:space="preserve">₱ 2,000</w:t>
+              <w:t>₱ 2,000</w:t>
             </w:r>
           </w:p>
         </w:tc>
@@ -27543,7 +27805,7 @@
               <w:rPr>
                 <w:b/>
               </w:rPr>
-              <w:t xml:space="preserve">Subtotal - Edge</w:t>
+              <w:t>Subtotal - Edge</w:t>
             </w:r>
           </w:p>
         </w:tc>
@@ -27568,7 +27830,7 @@
               <w:rPr>
                 <w:b/>
               </w:rPr>
-              <w:t xml:space="preserve">₱19,050</w:t>
+              <w:t>₱19,050</w:t>
             </w:r>
           </w:p>
         </w:tc>
@@ -27598,7 +27860,7 @@
               <w:rPr>
                 <w:b/>
               </w:rPr>
-              <w:t xml:space="preserve">General</w:t>
+              <w:t>General</w:t>
             </w:r>
           </w:p>
         </w:tc>
@@ -27617,7 +27879,7 @@
               <w:ind w:left="0" w:firstLine="0"/>
             </w:pPr>
             <w:r>
-              <w:t xml:space="preserve">Breadboard (2 × 100)</w:t>
+              <w:t>Breadboard (2 × 100)</w:t>
             </w:r>
           </w:p>
         </w:tc>
@@ -27632,7 +27894,7 @@
               <w:jc w:val="right"/>
             </w:pPr>
             <w:r>
-              <w:t xml:space="preserve">₱ 200</w:t>
+              <w:t>₱ 200</w:t>
             </w:r>
           </w:p>
         </w:tc>
@@ -27651,7 +27913,7 @@
               <w:ind w:left="0" w:firstLine="0"/>
             </w:pPr>
             <w:r>
-              <w:t xml:space="preserve">Wires</w:t>
+              <w:t>Wires</w:t>
             </w:r>
           </w:p>
         </w:tc>
@@ -27666,7 +27928,7 @@
               <w:jc w:val="right"/>
             </w:pPr>
             <w:r>
-              <w:t xml:space="preserve">₱ 200</w:t>
+              <w:t>₱ 200</w:t>
             </w:r>
           </w:p>
         </w:tc>
@@ -27685,7 +27947,7 @@
               <w:ind w:left="0" w:firstLine="0"/>
             </w:pPr>
             <w:r>
-              <w:t xml:space="preserve">Marine plywood</w:t>
+              <w:t>Marine plywood</w:t>
             </w:r>
           </w:p>
         </w:tc>
@@ -27700,7 +27962,7 @@
               <w:jc w:val="right"/>
             </w:pPr>
             <w:r>
-              <w:t xml:space="preserve">₱ 400</w:t>
+              <w:t>₱ 400</w:t>
             </w:r>
           </w:p>
         </w:tc>
@@ -27719,7 +27981,7 @@
               <w:ind w:left="0" w:firstLine="0"/>
             </w:pPr>
             <w:r>
-              <w:t xml:space="preserve">Miscellaneous electrical components</w:t>
+              <w:t>Miscellaneous electrical components</w:t>
             </w:r>
           </w:p>
         </w:tc>
@@ -27734,7 +27996,7 @@
               <w:jc w:val="right"/>
             </w:pPr>
             <w:r>
-              <w:t xml:space="preserve">₱ 1,000</w:t>
+              <w:t>₱ 1,000</w:t>
             </w:r>
           </w:p>
         </w:tc>
@@ -27763,7 +28025,7 @@
               <w:rPr>
                 <w:b/>
               </w:rPr>
-              <w:t xml:space="preserve">Subtotal - General</w:t>
+              <w:t>Subtotal - General</w:t>
             </w:r>
           </w:p>
         </w:tc>
@@ -27788,7 +28050,7 @@
               <w:rPr>
                 <w:b/>
               </w:rPr>
-              <w:t xml:space="preserve">₱1,800</w:t>
+              <w:t>₱1,800</w:t>
             </w:r>
           </w:p>
         </w:tc>
@@ -27817,7 +28079,7 @@
               <w:rPr>
                 <w:b/>
               </w:rPr>
-              <w:t xml:space="preserve">Total</w:t>
+              <w:t>Total</w:t>
             </w:r>
           </w:p>
         </w:tc>
@@ -27842,7 +28104,7 @@
               <w:rPr>
                 <w:b/>
               </w:rPr>
-              <w:t xml:space="preserve">₱27,920</w:t>
+              <w:t>₱27,920</w:t>
             </w:r>
           </w:p>
         </w:tc>
@@ -27864,7 +28126,11 @@
       </w:pPr>
       <w:r>
         <w:tab/>
-        <w:t>Table 3.2 details materials for FLAIRE's offline-first deployment. Adafruit 32u4 RFM9x LoRa boards serve as the sensor node transmitting water level and rainfall amount via LoRa to the Raspberry Pi 5 edge device, which hosts the local SQLite database, Machine Learning model, and FastAPI LAN dashboard. Solar panel kits provide renewable charging during typhoon season power outages. Cached weather data and GSM modem (SMS delivery) eliminate cloud dependency. The weather-resistant enclosures protect against Palawan monsoon conditions.</w:t>
+        <w:t xml:space="preserve">Table 3.2 details materials for FLAIRE's offline-first deployment. Adafruit 32u4 RFM9x LoRa boards serve as the sensor node transmitting water level and rainfall amount </w:t>
+      </w:r>
+      <w:r>
+        <w:lastRenderedPageBreak/>
+        <w:t>via LoRa to the Raspberry Pi 5 edge device, which hosts the local SQLite database, Machine Learning model, and FastAPI LAN dashboard. Solar panel kits provide renewable charging during typhoon season power outages. Cached weather data and GSM modem (SMS delivery) eliminate cloud dependency. The weather-resistant enclosures protect against Palawan monsoon conditions.</w:t>
       </w:r>
     </w:p>
     <w:p>
@@ -27945,18 +28211,62 @@
           <w:bCs/>
           <w:lang w:val="en-PH"/>
         </w:rPr>
+        <w:t>At the community level, FLAIRE may improve situational awareness and support earlier preparedness by reducing dependence solely on visual water-level observation and external MDRRMC alerts. Because final alert dissemination remains under BDRRMC authority, the system functions as a decision-support tool rather than an autonomous warning system.</w:t>
+      </w:r>
+    </w:p>
+    <w:p>
+      <w:pPr>
+        <w:pStyle w:val="ThesisSections"/>
+        <w:spacing w:before="0"/>
+      </w:pPr>
+      <w:bookmarkStart w:id="26" w:name="_Toc223690219"/>
+      <w:r>
         <w:lastRenderedPageBreak/>
-        <w:t>At the community level, FLAIRE may improve situational awareness and support earlier preparedness by reducing dependence solely on visual water-level observation and external MDRRMC alerts. Because final alert dissemination remains under BDRRMC authority, the system functions as a decision-support tool rather than an autonomous warning system.</w:t>
+        <w:t xml:space="preserve">System Maintenance </w:t>
+      </w:r>
+      <w:bookmarkEnd w:id="26"/>
+      <w:r>
+        <w:t>Plan</w:t>
+      </w:r>
+    </w:p>
+    <w:p>
+      <w:pPr>
+        <w:spacing w:after="0" w:line="480" w:lineRule="auto"/>
+        <w:ind w:left="0" w:firstLine="0"/>
+      </w:pPr>
+      <w:r>
+        <w:tab/>
+        <w:t>Maintenance procedures are planned to support the reliability and continuous operation of FLAIRE in Brgy. Elvita. Routine monitoring can be conducted through the edge device dashboard to track sensor uptime, database status, and model performance. Periodic on-site inspections should be performed every three months to verify enclosure integrity, clean solar panels, test GSM connectivity, and recalibrate ultrasonic sensors.</w:t>
       </w:r>
     </w:p>
     <w:p>
       <w:pPr>
         <w:spacing w:after="0" w:line="480" w:lineRule="auto"/>
         <w:ind w:left="0" w:firstLine="720"/>
-        <w:rPr>
-          <w:bCs/>
-          <w:lang w:val="en-PH"/>
-        </w:rPr>
+      </w:pPr>
+      <w:r>
+        <w:t xml:space="preserve">Corrective maintenance will address hardware failures, physical damage, and software issues through component replacement, system resets, and database recovery when necessary. Adaptive maintenance will include periodic retraining of the </w:t>
+      </w:r>
+      <w:r>
+        <w:t>Machine Learning</w:t>
+      </w:r>
+      <w:r>
+        <w:t xml:space="preserve"> classification model using newly collected data and updates to system parameters based on observed conditions and stakeholder feedback.</w:t>
+      </w:r>
+    </w:p>
+    <w:p>
+      <w:pPr>
+        <w:spacing w:after="0" w:line="480" w:lineRule="auto"/>
+        <w:ind w:left="0" w:firstLine="720"/>
+      </w:pPr>
+      <w:r>
+        <w:t>Data security and backup measures will include automated local database backups, offsite storage, and role-based access control within the LAN environment. Maintenance responsibilities will be shared between designated barangay personnel and system developers to ensure sustainability of the deployed system.</w:t>
+      </w:r>
+    </w:p>
+    <w:p>
+      <w:pPr>
+        <w:spacing w:after="0" w:line="480" w:lineRule="auto"/>
+        <w:ind w:left="0" w:firstLine="0"/>
       </w:pPr>
     </w:p>
     <w:p>
@@ -27964,63 +28274,8 @@
         <w:pStyle w:val="ThesisSections"/>
         <w:spacing w:before="0"/>
       </w:pPr>
-      <w:bookmarkStart w:id="26" w:name="_Toc223690219"/>
-      <w:r>
-        <w:t xml:space="preserve">System Maintenance </w:t>
-      </w:r>
-      <w:bookmarkEnd w:id="26"/>
-      <w:r>
-        <w:t>Plan</w:t>
-      </w:r>
-    </w:p>
-    <w:p>
-      <w:pPr>
-        <w:spacing w:after="0" w:line="480" w:lineRule="auto"/>
-        <w:ind w:left="0" w:firstLine="0"/>
-      </w:pPr>
-      <w:r>
-        <w:tab/>
-        <w:t>Maintenance procedures are planned to support the reliability and continuous operation of FLAIRE in Brgy. Elvita. Routine monitoring can be conducted through the edge device dashboard to track sensor uptime, database status, and model performance. Periodic on-site inspections should be performed every three months to verify enclosure integrity, clean solar panels, test GSM connectivity, and recalibrate ultrasonic sensors.</w:t>
-      </w:r>
-    </w:p>
-    <w:p>
-      <w:pPr>
-        <w:spacing w:after="0" w:line="480" w:lineRule="auto"/>
-        <w:ind w:left="0" w:firstLine="720"/>
-      </w:pPr>
-      <w:r>
-        <w:t xml:space="preserve">Corrective maintenance will address hardware failures, physical damage, and software issues through component replacement, system resets, and database recovery when necessary. Adaptive maintenance will include periodic retraining of the </w:t>
-      </w:r>
-      <w:r>
-        <w:t>Machine Learning</w:t>
-      </w:r>
-      <w:r>
-        <w:t xml:space="preserve"> classification model using newly collected data and updates to system parameters based on observed conditions and stakeholder feedback.</w:t>
-      </w:r>
-    </w:p>
-    <w:p>
-      <w:pPr>
-        <w:spacing w:after="0" w:line="480" w:lineRule="auto"/>
-        <w:ind w:left="0" w:firstLine="720"/>
-      </w:pPr>
-      <w:r>
-        <w:t>Data security and backup measures will include automated local database backups, offsite storage, and role-based access control within the LAN environment. Maintenance responsibilities will be shared between designated barangay personnel and system developers to ensure sustainability of the deployed system.</w:t>
-      </w:r>
-    </w:p>
-    <w:p>
-      <w:pPr>
-        <w:spacing w:after="0" w:line="480" w:lineRule="auto"/>
-        <w:ind w:left="0" w:firstLine="0"/>
-      </w:pPr>
-    </w:p>
-    <w:p>
-      <w:pPr>
-        <w:pStyle w:val="ThesisSections"/>
-        <w:spacing w:before="0"/>
-      </w:pPr>
       <w:bookmarkStart w:id="27" w:name="_Toc223690220"/>
       <w:r>
-        <w:lastRenderedPageBreak/>
         <w:t>Developer and Client Communication</w:t>
       </w:r>
       <w:bookmarkEnd w:id="27"/>
@@ -28047,6 +28302,7 @@
         </w:sectPr>
       </w:pPr>
       <w:r>
+        <w:lastRenderedPageBreak/>
         <w:t>Issue reporting and resolution will follow a structured process, where concerns are documented, classified by severity, and addressed through appropriate technical actions. Relevant documentation, including user manuals, troubleshooting guides, and system architecture references, will be provided to support system use and sustainability.</w:t>
       </w:r>
     </w:p>
@@ -30159,13 +30415,8 @@
       </w:r>
       <w:r>
         <w:lastRenderedPageBreak/>
-        <w:t xml:space="preserve">value of each membership function, giving 4 x 4 x 4 x 4 x 3 = 768 dominant-term combinations, and also on a </w:t>
-      </w:r>
-      <w:proofErr w:type="gramStart"/>
-      <w:r>
-        <w:t>coarser</w:t>
-      </w:r>
-      <w:proofErr w:type="gramEnd"/>
+        <w:t>value of each membership function, giving 4 x 4 x 4 x 4 x 3 = 768 dominant-term combinations, and also on a coarser</w:t>
+      </w:r>
       <w:r>
         <w:t xml:space="preserve"> </w:t>
       </w:r>
@@ -33652,7 +33903,7 @@
         </w:rPr>
         <w:t xml:space="preserve"> FLAIRE was designed and developed as an offline-first system that integrates cached weather and tide forecast data, a LoRa-based water-level and rainfall sensor node, a Random Forest flood-propensity model, a fuzzy-logic risk classification component, a local SQLite database, a LAN dashboard, and SMS alert functionality.</w:t>
       </w:r>
-      <w:hyperlink r:id="rId21" w:tgtFrame="_blank" w:history="1"/>
+      <w:hyperlink r:id="rId23" w:tgtFrame="_blank" w:history="1"/>
     </w:p>
     <w:p>
       <w:pPr>
@@ -33679,7 +33930,7 @@
         </w:rPr>
         <w:t xml:space="preserve"> The Random Forest model obtained 94.26% accuracy on a held-out test set for classifying rule-derived Low, Medium, and High flood-propensity categories. The model obtained an F1-score of 0.9728 for the Low category, 0.9099 for the Medium category, and 0.9160 for the High category.</w:t>
       </w:r>
-      <w:hyperlink r:id="rId22" w:tgtFrame="_blank" w:history="1"/>
+      <w:hyperlink r:id="rId24" w:tgtFrame="_blank" w:history="1"/>
     </w:p>
     <w:p>
       <w:pPr>
@@ -33752,7 +34003,7 @@
       <w:r>
         <w:t>. Sweeping the fuzzy-logic classifier across its full input ranges (768 dominant-term combinations and 3,150 grid points) returned a defined class for every combination with no errors, all four risk classes were reachable, and the output was monotonic in water level and rate of rise, with single boundary steps in the other three inputs.</w:t>
       </w:r>
-      <w:hyperlink r:id="rId23" w:tgtFrame="_blank" w:history="1"/>
+      <w:hyperlink r:id="rId25" w:tgtFrame="_blank" w:history="1"/>
     </w:p>
     <w:p>
       <w:pPr>
@@ -33793,7 +34044,7 @@
         </w:rPr>
         <w:t xml:space="preserve"> configuration, data export process, or actual powered-operation period.</w:t>
       </w:r>
-      <w:hyperlink r:id="rId24" w:tgtFrame="_blank" w:history="1"/>
+      <w:hyperlink r:id="rId26" w:tgtFrame="_blank" w:history="1"/>
     </w:p>
     <w:p>
       <w:pPr>
@@ -34048,21 +34299,7 @@
           <w:lang w:val="en-PH"/>
         </w:rPr>
         <w:lastRenderedPageBreak/>
-        <w:t xml:space="preserve">monitoring, local data storage, cached forecast information, a LAN dashboard, and SMS alerts. These features respond to the focal </w:t>
-      </w:r>
-      <w:proofErr w:type="gramStart"/>
-      <w:r>
-        <w:rPr>
-          <w:lang w:val="en-PH"/>
-        </w:rPr>
-        <w:t>persons’</w:t>
-      </w:r>
-      <w:proofErr w:type="gramEnd"/>
-      <w:r>
-        <w:rPr>
-          <w:lang w:val="en-PH"/>
-        </w:rPr>
-        <w:t xml:space="preserve"> identified need for automated logs and faster localized alerts. </w:t>
+        <w:t xml:space="preserve">monitoring, local data storage, cached forecast information, a LAN dashboard, and SMS alerts. These features respond to the focal persons’ identified need for automated logs and faster localized alerts. </w:t>
       </w:r>
     </w:p>
     <w:p>
@@ -35549,8 +35786,8 @@
         <w:spacing w:after="0"/>
         <w:ind w:left="0" w:firstLine="0"/>
         <w:sectPr>
-          <w:headerReference w:type="first" r:id="rId25"/>
-          <w:footerReference w:type="first" r:id="rId26"/>
+          <w:headerReference w:type="first" r:id="rId27"/>
+          <w:footerReference w:type="first" r:id="rId28"/>
           <w:pgSz w:w="12240" w:h="15840"/>
           <w:pgMar w:top="1440" w:right="1440" w:bottom="1440" w:left="2160" w:header="720" w:footer="720" w:gutter="0"/>
           <w:cols w:space="720"/>
@@ -35820,7 +36057,7 @@
                           <pic:cNvPicPr/>
                         </pic:nvPicPr>
                         <pic:blipFill>
-                          <a:blip r:embed="rId27" cstate="print">
+                          <a:blip r:embed="rId29" cstate="print">
                             <a:extLst>
                               <a:ext uri="{28A0092B-C50C-407E-A947-70E740481C1C}">
                                 <a14:useLocalDpi xmlns:a14="http://schemas.microsoft.com/office/drawing/2010/main" val="0"/>
@@ -36094,7 +36331,7 @@
                           <pic:cNvPicPr/>
                         </pic:nvPicPr>
                         <pic:blipFill>
-                          <a:blip r:embed="rId28" cstate="print">
+                          <a:blip r:embed="rId30" cstate="print">
                             <a:extLst>
                               <a:ext uri="{28A0092B-C50C-407E-A947-70E740481C1C}">
                                 <a14:useLocalDpi xmlns:a14="http://schemas.microsoft.com/office/drawing/2010/main" val="0"/>
@@ -36346,6 +36583,67 @@
       <w:pPr>
         <w:spacing w:after="0"/>
         <w:ind w:left="0" w:firstLine="0"/>
+        <w:jc w:val="center"/>
+        <w:rPr>
+          <w:lang w:val="en-PH"/>
+        </w:rPr>
+      </w:pPr>
+      <w:r>
+        <w:rPr>
+          <w:b/>
+          <w:bCs/>
+          <w:lang w:val="en-PH"/>
+        </w:rPr>
+        <w:t>River Monitor — User Manual</w:t>
+      </w:r>
+    </w:p>
+    <w:p>
+      <w:pPr>
+        <w:spacing w:after="0"/>
+        <w:ind w:left="0" w:firstLine="0"/>
+        <w:jc w:val="center"/>
+        <w:rPr>
+          <w:lang w:val="en-PH"/>
+        </w:rPr>
+      </w:pPr>
+      <w:r>
+        <w:rPr>
+          <w:b/>
+          <w:bCs/>
+          <w:lang w:val="en-PH"/>
+        </w:rPr>
+        <w:t>A Practical Guide to the River Water Level Monitoring &amp; Flood Risk Prediction Dashboard</w:t>
+      </w:r>
+    </w:p>
+    <w:p>
+      <w:pPr>
+        <w:spacing w:after="0"/>
+        <w:ind w:left="0" w:firstLine="0"/>
+        <w:jc w:val="center"/>
+        <w:rPr>
+          <w:lang w:val="en-PH"/>
+        </w:rPr>
+      </w:pPr>
+      <w:r>
+        <w:rPr>
+          <w:lang w:val="en-PH"/>
+        </w:rPr>
+        <w:t>Version 1.0 · October 2026</w:t>
+      </w:r>
+    </w:p>
+    <w:p>
+      <w:pPr>
+        <w:spacing w:after="0"/>
+        <w:ind w:left="0" w:firstLine="0"/>
+        <w:rPr>
+          <w:lang w:val="en-PH"/>
+        </w:rPr>
+      </w:pPr>
+    </w:p>
+    <w:p>
+      <w:pPr>
+        <w:spacing w:after="0"/>
+        <w:ind w:left="0" w:firstLine="0"/>
       </w:pPr>
     </w:p>
     <w:p>
@@ -36481,7 +36779,6 @@
         <w:rPr>
           <w:b/>
         </w:rPr>
-        <w:lastRenderedPageBreak/>
         <w:t>Appendix B</w:t>
       </w:r>
     </w:p>
@@ -36649,7 +36946,6 @@
           <w:b/>
           <w:color w:val="auto"/>
         </w:rPr>
-        <w:lastRenderedPageBreak/>
         <w:t>Appendix C</w:t>
       </w:r>
     </w:p>
@@ -36894,7 +37190,6 @@
           <w:b/>
           <w:lang w:val="en-PH"/>
         </w:rPr>
-        <w:lastRenderedPageBreak/>
         <w:t>Appendix D</w:t>
       </w:r>
     </w:p>
@@ -37061,7 +37356,6 @@
         <w:rPr>
           <w:b/>
         </w:rPr>
-        <w:lastRenderedPageBreak/>
         <w:t>Appendix E</w:t>
       </w:r>
     </w:p>
@@ -37226,7 +37520,6 @@
         <w:rPr>
           <w:b/>
         </w:rPr>
-        <w:lastRenderedPageBreak/>
         <w:t xml:space="preserve">Appendix </w:t>
       </w:r>
       <w:r>
@@ -37395,7 +37688,6 @@
           <w:b/>
           <w:color w:val="auto"/>
         </w:rPr>
-        <w:lastRenderedPageBreak/>
         <w:t>Appendix G</w:t>
       </w:r>
     </w:p>
@@ -37466,7 +37758,7 @@
                           </pic:cNvPicPr>
                         </pic:nvPicPr>
                         <pic:blipFill>
-                          <a:blip r:embed="rId29" cstate="print">
+                          <a:blip r:embed="rId31" cstate="print">
                             <a:extLst>
                               <a:ext uri="{28A0092B-C50C-407E-A947-70E740481C1C}">
                                 <a14:useLocalDpi xmlns:a14="http://schemas.microsoft.com/office/drawing/2010/main" val="0"/>
@@ -38305,6 +38597,7 @@
               <w:rPr>
                 <w:color w:val="auto"/>
               </w:rPr>
+              <w:lastRenderedPageBreak/>
               <w:t>Junior High:</w:t>
             </w:r>
           </w:p>
@@ -38561,7 +38854,7 @@
           </mc:Choice>
           <mc:Fallback>
             <w:pict>
-              <v:rect w14:anchorId="3B40FD40" id="Rectangle 24" o:spid="_x0000_s1151" style="position:absolute;left:0;text-align:left;margin-left:1.25pt;margin-top:139.05pt;width:31.2pt;height:541.6pt;z-index:251754496;visibility:visible;mso-wrap-style:square;mso-wrap-distance-left:9pt;mso-wrap-distance-top:0;mso-wrap-distance-right:9pt;mso-wrap-distance-bottom:0;mso-position-horizontal:absolute;mso-position-horizontal-relative:text;mso-position-vertical:absolute;mso-position-vertical-relative:page;v-text-anchor:middle" o:gfxdata="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" fillcolor="#1b6722" strokecolor="#10190a [489]" strokeweight="1pt">
+              <v:rect w14:anchorId="3B40FD40" id="Rectangle 24" o:spid="_x0000_s1148" style="position:absolute;left:0;text-align:left;margin-left:1.25pt;margin-top:139.05pt;width:31.2pt;height:541.6pt;z-index:251754496;visibility:visible;mso-wrap-style:square;mso-wrap-distance-left:9pt;mso-wrap-distance-top:0;mso-wrap-distance-right:9pt;mso-wrap-distance-bottom:0;mso-position-horizontal:absolute;mso-position-horizontal-relative:text;mso-position-vertical:absolute;mso-position-vertical-relative:page;v-text-anchor:middle" o:gfxdata="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" fillcolor="#1b6722" strokecolor="#10190a [489]" strokeweight="1pt">
                 <v:textbox style="layout-flow:vertical;mso-layout-flow-alt:bottom-to-top">
                   <w:txbxContent>
                     <w:p>
@@ -44381,7 +44674,7 @@
   <w:style w:type="paragraph" w:default="1" w:styleId="Normal">
     <w:name w:val="Normal"/>
     <w:qFormat/>
-    <w:rsid w:val="00D44ABF"/>
+    <w:rsid w:val="008B0860"/>
     <w:pPr>
       <w:spacing w:after="132" w:line="491" w:lineRule="auto"/>
       <w:ind w:left="1580" w:hanging="10"/>
@@ -44508,7 +44801,6 @@
   <w:style w:type="character" w:default="1" w:styleId="DefaultParagraphFont">
     <w:name w:val="Default Paragraph Font"/>
     <w:uiPriority w:val="1"/>
-    <w:semiHidden/>
     <w:unhideWhenUsed/>
   </w:style>
   <w:style w:type="table" w:default="1" w:styleId="TableNormal">

</xml_diff>